<commit_message>
Sync from private source SHA: 618436522f9b5bbe9e5604af4c99636ae6ea72bd
</commit_message>
<xml_diff>
--- a/Docs/03ANOVA/ANCOVA_Case_Interaction.docx
+++ b/Docs/03ANOVA/ANCOVA_Case_Interaction.docx
@@ -217,6 +217,7 @@
     </w:p>
     <w:tbl>
       <w:tblPr>
+        <w:tblStyle w:val="2"/>
         <w:tblW w:w="4998" w:type="pct"/>
         <w:tblInd w:w="0" w:type="dxa"/>
         <w:tblBorders>
@@ -227,7 +228,7 @@
           <w:insideH w:val="none" w:color="auto" w:sz="0" w:space="0"/>
           <w:insideV w:val="none" w:color="auto" w:sz="0" w:space="0"/>
         </w:tblBorders>
-        <w:shd w:val="clear"/>
+        <w:shd w:val="clear" w:color="auto" w:fill="auto"/>
         <w:tblLayout w:type="autofit"/>
         <w:tblCellMar>
           <w:top w:w="0" w:type="dxa"/>
@@ -322,7 +323,6 @@
                 <w:sz w:val="18"/>
                 <w:szCs w:val="18"/>
                 <w:u w:val="none"/>
-                <w:bdr w:val="none" w:color="auto" w:sz="0" w:space="0"/>
                 <w:lang w:val="en-US" w:eastAsia="zh-CN" w:bidi="ar"/>
               </w:rPr>
               <w:t>SS</w:t>
@@ -372,7 +372,6 @@
                 <w:sz w:val="18"/>
                 <w:szCs w:val="18"/>
                 <w:u w:val="none"/>
-                <w:bdr w:val="none" w:color="auto" w:sz="0" w:space="0"/>
                 <w:lang w:val="en-US" w:eastAsia="zh-CN" w:bidi="ar"/>
               </w:rPr>
               <w:t>df</w:t>
@@ -422,7 +421,6 @@
                 <w:sz w:val="18"/>
                 <w:szCs w:val="18"/>
                 <w:u w:val="none"/>
-                <w:bdr w:val="none" w:color="auto" w:sz="0" w:space="0"/>
                 <w:lang w:val="en-US" w:eastAsia="zh-CN" w:bidi="ar"/>
               </w:rPr>
               <w:t>MS</w:t>
@@ -472,7 +470,6 @@
                 <w:sz w:val="18"/>
                 <w:szCs w:val="18"/>
                 <w:u w:val="none"/>
-                <w:bdr w:val="none" w:color="auto" w:sz="0" w:space="0"/>
                 <w:lang w:val="en-US" w:eastAsia="zh-CN" w:bidi="ar"/>
               </w:rPr>
               <w:t>F</w:t>
@@ -625,7 +622,6 @@
                 <w:sz w:val="18"/>
                 <w:szCs w:val="18"/>
                 <w:u w:val="none"/>
-                <w:bdr w:val="none" w:color="auto" w:sz="0" w:space="0"/>
                 <w:lang w:val="en-US" w:eastAsia="zh-CN" w:bidi="ar"/>
               </w:rPr>
               <w:t>Corrected Model</w:t>
@@ -675,7 +671,6 @@
                 <w:sz w:val="18"/>
                 <w:szCs w:val="18"/>
                 <w:u w:val="none"/>
-                <w:bdr w:val="none" w:color="auto" w:sz="0" w:space="0"/>
                 <w:lang w:val="en-US" w:eastAsia="zh-CN" w:bidi="ar"/>
               </w:rPr>
               <w:t>96.823</w:t>
@@ -725,7 +720,6 @@
                 <w:sz w:val="18"/>
                 <w:szCs w:val="18"/>
                 <w:u w:val="none"/>
-                <w:bdr w:val="none" w:color="auto" w:sz="0" w:space="0"/>
                 <w:lang w:val="en-US" w:eastAsia="zh-CN" w:bidi="ar"/>
               </w:rPr>
               <w:t>3</w:t>
@@ -775,7 +769,6 @@
                 <w:sz w:val="18"/>
                 <w:szCs w:val="18"/>
                 <w:u w:val="none"/>
-                <w:bdr w:val="none" w:color="auto" w:sz="0" w:space="0"/>
                 <w:lang w:val="en-US" w:eastAsia="zh-CN" w:bidi="ar"/>
               </w:rPr>
               <w:t>32.274</w:t>
@@ -825,7 +818,6 @@
                 <w:sz w:val="18"/>
                 <w:szCs w:val="18"/>
                 <w:u w:val="none"/>
-                <w:bdr w:val="none" w:color="auto" w:sz="0" w:space="0"/>
                 <w:lang w:val="en-US" w:eastAsia="zh-CN" w:bidi="ar"/>
               </w:rPr>
               <w:t>6627.059</w:t>
@@ -875,7 +867,6 @@
                 <w:sz w:val="18"/>
                 <w:szCs w:val="18"/>
                 <w:u w:val="none"/>
-                <w:bdr w:val="none" w:color="auto" w:sz="0" w:space="0"/>
                 <w:lang w:val="en-US" w:eastAsia="zh-CN" w:bidi="ar"/>
               </w:rPr>
               <w:t>&lt;.001</w:t>
@@ -913,22 +904,20 @@
                 <w:sz w:val="18"/>
                 <w:szCs w:val="18"/>
                 <w:u w:val="none"/>
-                <w:bdr w:val="none" w:color="auto" w:sz="0" w:space="0"/>
-                <w:lang w:val="en-US" w:eastAsia="zh-CN" w:bidi="ar"/>
-              </w:rPr>
-            </w:pPr>
-            <w:r>
-              <w:rPr>
-                <w:rFonts w:hint="eastAsia" w:ascii="宋体" w:hAnsi="宋体" w:eastAsia="宋体" w:cs="宋体"/>
-                <w:b w:val="0"/>
-                <w:i w:val="0"/>
-                <w:iCs w:val="0"/>
-                <w:color w:val="000000"/>
-                <w:kern w:val="0"/>
-                <w:sz w:val="18"/>
-                <w:szCs w:val="18"/>
-                <w:u w:val="none"/>
-                <w:bdr w:val="none" w:color="auto" w:sz="0" w:space="0"/>
+                <w:lang w:val="en-US" w:eastAsia="zh-CN" w:bidi="ar"/>
+              </w:rPr>
+            </w:pPr>
+            <w:r>
+              <w:rPr>
+                <w:rFonts w:hint="eastAsia" w:ascii="宋体" w:hAnsi="宋体" w:eastAsia="宋体" w:cs="宋体"/>
+                <w:b w:val="0"/>
+                <w:i w:val="0"/>
+                <w:iCs w:val="0"/>
+                <w:color w:val="000000"/>
+                <w:kern w:val="0"/>
+                <w:sz w:val="18"/>
+                <w:szCs w:val="18"/>
+                <w:u w:val="none"/>
                 <w:lang w:val="en-US" w:eastAsia="zh-CN" w:bidi="ar"/>
               </w:rPr>
               <w:t>0.997</w:t>
@@ -983,7 +972,6 @@
                 <w:sz w:val="18"/>
                 <w:szCs w:val="18"/>
                 <w:u w:val="none"/>
-                <w:bdr w:val="none" w:color="auto" w:sz="0" w:space="0"/>
                 <w:lang w:val="en-US" w:eastAsia="zh-CN" w:bidi="ar"/>
               </w:rPr>
               <w:t>Group * Pre</w:t>
@@ -1033,7 +1021,6 @@
                 <w:sz w:val="18"/>
                 <w:szCs w:val="18"/>
                 <w:u w:val="none"/>
-                <w:bdr w:val="none" w:color="auto" w:sz="0" w:space="0"/>
                 <w:lang w:val="en-US" w:eastAsia="zh-CN" w:bidi="ar"/>
               </w:rPr>
               <w:t>16.897</w:t>
@@ -1083,7 +1070,6 @@
                 <w:sz w:val="18"/>
                 <w:szCs w:val="18"/>
                 <w:u w:val="none"/>
-                <w:bdr w:val="none" w:color="auto" w:sz="0" w:space="0"/>
                 <w:lang w:val="en-US" w:eastAsia="zh-CN" w:bidi="ar"/>
               </w:rPr>
               <w:t>1</w:t>
@@ -1133,7 +1119,6 @@
                 <w:sz w:val="18"/>
                 <w:szCs w:val="18"/>
                 <w:u w:val="none"/>
-                <w:bdr w:val="none" w:color="auto" w:sz="0" w:space="0"/>
                 <w:lang w:val="en-US" w:eastAsia="zh-CN" w:bidi="ar"/>
               </w:rPr>
               <w:t>16.897</w:t>
@@ -1183,7 +1168,6 @@
                 <w:sz w:val="18"/>
                 <w:szCs w:val="18"/>
                 <w:u w:val="none"/>
-                <w:bdr w:val="none" w:color="auto" w:sz="0" w:space="0"/>
                 <w:lang w:val="en-US" w:eastAsia="zh-CN" w:bidi="ar"/>
               </w:rPr>
               <w:t>3469.539</w:t>
@@ -1233,7 +1217,6 @@
                 <w:sz w:val="18"/>
                 <w:szCs w:val="18"/>
                 <w:u w:val="none"/>
-                <w:bdr w:val="none" w:color="auto" w:sz="0" w:space="0"/>
                 <w:lang w:val="en-US" w:eastAsia="zh-CN" w:bidi="ar"/>
               </w:rPr>
               <w:t>&lt;.001</w:t>
@@ -1271,22 +1254,20 @@
                 <w:sz w:val="18"/>
                 <w:szCs w:val="18"/>
                 <w:u w:val="none"/>
-                <w:bdr w:val="none" w:color="auto" w:sz="0" w:space="0"/>
-                <w:lang w:val="en-US" w:eastAsia="zh-CN" w:bidi="ar"/>
-              </w:rPr>
-            </w:pPr>
-            <w:r>
-              <w:rPr>
-                <w:rFonts w:hint="eastAsia" w:ascii="宋体" w:hAnsi="宋体" w:eastAsia="宋体" w:cs="宋体"/>
-                <w:b w:val="0"/>
-                <w:i w:val="0"/>
-                <w:iCs w:val="0"/>
-                <w:color w:val="000000"/>
-                <w:kern w:val="0"/>
-                <w:sz w:val="18"/>
-                <w:szCs w:val="18"/>
-                <w:u w:val="none"/>
-                <w:bdr w:val="none" w:color="auto" w:sz="0" w:space="0"/>
+                <w:lang w:val="en-US" w:eastAsia="zh-CN" w:bidi="ar"/>
+              </w:rPr>
+            </w:pPr>
+            <w:r>
+              <w:rPr>
+                <w:rFonts w:hint="eastAsia" w:ascii="宋体" w:hAnsi="宋体" w:eastAsia="宋体" w:cs="宋体"/>
+                <w:b w:val="0"/>
+                <w:i w:val="0"/>
+                <w:iCs w:val="0"/>
+                <w:color w:val="000000"/>
+                <w:kern w:val="0"/>
+                <w:sz w:val="18"/>
+                <w:szCs w:val="18"/>
+                <w:u w:val="none"/>
                 <w:lang w:val="en-US" w:eastAsia="zh-CN" w:bidi="ar"/>
               </w:rPr>
               <w:t>0.984</w:t>
@@ -1341,7 +1322,6 @@
                 <w:sz w:val="18"/>
                 <w:szCs w:val="18"/>
                 <w:u w:val="none"/>
-                <w:bdr w:val="none" w:color="auto" w:sz="0" w:space="0"/>
                 <w:lang w:val="en-US" w:eastAsia="zh-CN" w:bidi="ar"/>
               </w:rPr>
               <w:t>Error</w:t>
@@ -1391,7 +1371,6 @@
                 <w:sz w:val="18"/>
                 <w:szCs w:val="18"/>
                 <w:u w:val="none"/>
-                <w:bdr w:val="none" w:color="auto" w:sz="0" w:space="0"/>
                 <w:lang w:val="en-US" w:eastAsia="zh-CN" w:bidi="ar"/>
               </w:rPr>
               <w:t>0.273</w:t>
@@ -1441,7 +1420,6 @@
                 <w:sz w:val="18"/>
                 <w:szCs w:val="18"/>
                 <w:u w:val="none"/>
-                <w:bdr w:val="none" w:color="auto" w:sz="0" w:space="0"/>
                 <w:lang w:val="en-US" w:eastAsia="zh-CN" w:bidi="ar"/>
               </w:rPr>
               <w:t>56</w:t>
@@ -1491,7 +1469,6 @@
                 <w:sz w:val="18"/>
                 <w:szCs w:val="18"/>
                 <w:u w:val="none"/>
-                <w:bdr w:val="none" w:color="auto" w:sz="0" w:space="0"/>
                 <w:lang w:val="en-US" w:eastAsia="zh-CN" w:bidi="ar"/>
               </w:rPr>
               <w:t>0.005</w:t>
@@ -1633,7 +1610,6 @@
                 <w:sz w:val="18"/>
                 <w:szCs w:val="18"/>
                 <w:u w:val="none"/>
-                <w:bdr w:val="none" w:color="auto" w:sz="0" w:space="0"/>
                 <w:lang w:val="en-US" w:eastAsia="zh-CN" w:bidi="ar"/>
               </w:rPr>
               <w:t>Total</w:t>
@@ -1683,7 +1659,6 @@
                 <w:sz w:val="18"/>
                 <w:szCs w:val="18"/>
                 <w:u w:val="none"/>
-                <w:bdr w:val="none" w:color="auto" w:sz="0" w:space="0"/>
                 <w:lang w:val="en-US" w:eastAsia="zh-CN" w:bidi="ar"/>
               </w:rPr>
               <w:t>3364.96</w:t>
@@ -1733,7 +1708,6 @@
                 <w:sz w:val="18"/>
                 <w:szCs w:val="18"/>
                 <w:u w:val="none"/>
-                <w:bdr w:val="none" w:color="auto" w:sz="0" w:space="0"/>
                 <w:lang w:val="en-US" w:eastAsia="zh-CN" w:bidi="ar"/>
               </w:rPr>
               <w:t>60</w:t>
@@ -2188,6 +2162,7 @@
     </w:p>
     <w:tbl>
       <w:tblPr>
+        <w:tblStyle w:val="2"/>
         <w:tblW w:w="4996" w:type="pct"/>
         <w:tblInd w:w="0" w:type="dxa"/>
         <w:tblBorders>
@@ -2198,7 +2173,7 @@
           <w:insideH w:val="none" w:color="auto" w:sz="0" w:space="0"/>
           <w:insideV w:val="none" w:color="auto" w:sz="0" w:space="0"/>
         </w:tblBorders>
-        <w:shd w:val="clear"/>
+        <w:shd w:val="clear" w:color="auto" w:fill="auto"/>
         <w:tblLayout w:type="autofit"/>
         <w:tblCellMar>
           <w:top w:w="0" w:type="dxa"/>
@@ -2296,7 +2271,6 @@
                 <w:sz w:val="18"/>
                 <w:szCs w:val="18"/>
                 <w:u w:val="none"/>
-                <w:bdr w:val="none" w:color="auto" w:sz="0" w:space="0"/>
                 <w:lang w:val="en-US" w:eastAsia="zh-CN" w:bidi="ar"/>
               </w:rPr>
               <w:t>R-Sq</w:t>
@@ -2346,7 +2320,6 @@
                 <w:sz w:val="18"/>
                 <w:szCs w:val="18"/>
                 <w:u w:val="none"/>
-                <w:bdr w:val="none" w:color="auto" w:sz="0" w:space="0"/>
                 <w:lang w:val="en-US" w:eastAsia="zh-CN" w:bidi="ar"/>
               </w:rPr>
               <w:t>F(df1,df2)</w:t>
@@ -2396,7 +2369,6 @@
                 <w:sz w:val="18"/>
                 <w:szCs w:val="18"/>
                 <w:u w:val="none"/>
-                <w:bdr w:val="none" w:color="auto" w:sz="0" w:space="0"/>
                 <w:lang w:val="en-US" w:eastAsia="zh-CN" w:bidi="ar"/>
               </w:rPr>
               <w:t>p</w:t>
@@ -2446,7 +2418,6 @@
                 <w:sz w:val="18"/>
                 <w:szCs w:val="18"/>
                 <w:u w:val="none"/>
-                <w:bdr w:val="none" w:color="auto" w:sz="0" w:space="0"/>
                 <w:lang w:val="en-US" w:eastAsia="zh-CN" w:bidi="ar"/>
               </w:rPr>
               <w:t>coeff</w:t>
@@ -2496,7 +2467,6 @@
                 <w:sz w:val="18"/>
                 <w:szCs w:val="18"/>
                 <w:u w:val="none"/>
-                <w:bdr w:val="none" w:color="auto" w:sz="0" w:space="0"/>
                 <w:lang w:val="en-US" w:eastAsia="zh-CN" w:bidi="ar"/>
               </w:rPr>
               <w:t>se</w:t>
@@ -2546,7 +2516,6 @@
                 <w:sz w:val="18"/>
                 <w:szCs w:val="18"/>
                 <w:u w:val="none"/>
-                <w:bdr w:val="none" w:color="auto" w:sz="0" w:space="0"/>
                 <w:lang w:val="en-US" w:eastAsia="zh-CN" w:bidi="ar"/>
               </w:rPr>
               <w:t>t</w:t>
@@ -2596,7 +2565,6 @@
                 <w:sz w:val="18"/>
                 <w:szCs w:val="18"/>
                 <w:u w:val="none"/>
-                <w:bdr w:val="none" w:color="auto" w:sz="0" w:space="0"/>
                 <w:lang w:val="en-US" w:eastAsia="zh-CN" w:bidi="ar"/>
               </w:rPr>
               <w:t>p</w:t>
@@ -2646,7 +2614,6 @@
                 <w:sz w:val="18"/>
                 <w:szCs w:val="18"/>
                 <w:u w:val="none"/>
-                <w:bdr w:val="none" w:color="auto" w:sz="0" w:space="0"/>
                 <w:lang w:val="en-US" w:eastAsia="zh-CN" w:bidi="ar"/>
               </w:rPr>
               <w:t>LLCI</w:t>
@@ -2696,7 +2663,6 @@
                 <w:sz w:val="18"/>
                 <w:szCs w:val="18"/>
                 <w:u w:val="none"/>
-                <w:bdr w:val="none" w:color="auto" w:sz="0" w:space="0"/>
                 <w:lang w:val="en-US" w:eastAsia="zh-CN" w:bidi="ar"/>
               </w:rPr>
               <w:t>ULCI</w:t>
@@ -2751,7 +2717,6 @@
                 <w:sz w:val="18"/>
                 <w:szCs w:val="18"/>
                 <w:u w:val="none"/>
-                <w:bdr w:val="none" w:color="auto" w:sz="0" w:space="0"/>
                 <w:lang w:val="en-US" w:eastAsia="zh-CN" w:bidi="ar"/>
               </w:rPr>
               <w:t>constant</w:t>
@@ -2802,7 +2767,6 @@
                 <w:sz w:val="18"/>
                 <w:szCs w:val="18"/>
                 <w:u w:val="none"/>
-                <w:bdr w:val="none" w:color="auto" w:sz="0" w:space="0"/>
                 <w:lang w:val="en-US" w:eastAsia="zh-CN" w:bidi="ar"/>
               </w:rPr>
               <w:t>0.997</w:t>
@@ -2852,7 +2816,6 @@
                 <w:sz w:val="18"/>
                 <w:szCs w:val="18"/>
                 <w:u w:val="none"/>
-                <w:bdr w:val="none" w:color="auto" w:sz="0" w:space="0"/>
                 <w:lang w:val="en-US" w:eastAsia="zh-CN" w:bidi="ar"/>
               </w:rPr>
               <w:t>6627.059</w:t>
@@ -2868,7 +2831,6 @@
                 <w:sz w:val="18"/>
                 <w:szCs w:val="18"/>
                 <w:u w:val="none"/>
-                <w:bdr w:val="none" w:color="auto" w:sz="0" w:space="0"/>
                 <w:lang w:val="en-US" w:eastAsia="zh-CN" w:bidi="ar"/>
               </w:rPr>
               <w:br w:type="textWrapping"/>
@@ -2884,7 +2846,6 @@
                 <w:sz w:val="18"/>
                 <w:szCs w:val="18"/>
                 <w:u w:val="none"/>
-                <w:bdr w:val="none" w:color="auto" w:sz="0" w:space="0"/>
                 <w:lang w:val="en-US" w:eastAsia="zh-CN" w:bidi="ar"/>
               </w:rPr>
               <w:t>(3,56)</w:t>
@@ -2935,7 +2896,6 @@
                 <w:sz w:val="18"/>
                 <w:szCs w:val="18"/>
                 <w:u w:val="none"/>
-                <w:bdr w:val="none" w:color="auto" w:sz="0" w:space="0"/>
                 <w:lang w:val="en-US" w:eastAsia="zh-CN" w:bidi="ar"/>
               </w:rPr>
               <w:t>&lt; .001</w:t>
@@ -2985,7 +2945,6 @@
                 <w:sz w:val="18"/>
                 <w:szCs w:val="18"/>
                 <w:u w:val="none"/>
-                <w:bdr w:val="none" w:color="auto" w:sz="0" w:space="0"/>
                 <w:lang w:val="en-US" w:eastAsia="zh-CN" w:bidi="ar"/>
               </w:rPr>
               <w:t>6.789</w:t>
@@ -3035,7 +2994,6 @@
                 <w:sz w:val="18"/>
                 <w:szCs w:val="18"/>
                 <w:u w:val="none"/>
-                <w:bdr w:val="none" w:color="auto" w:sz="0" w:space="0"/>
                 <w:lang w:val="en-US" w:eastAsia="zh-CN" w:bidi="ar"/>
               </w:rPr>
               <w:t>0.013</w:t>
@@ -3085,7 +3043,6 @@
                 <w:sz w:val="18"/>
                 <w:szCs w:val="18"/>
                 <w:u w:val="none"/>
-                <w:bdr w:val="none" w:color="auto" w:sz="0" w:space="0"/>
                 <w:lang w:val="en-US" w:eastAsia="zh-CN" w:bidi="ar"/>
               </w:rPr>
               <w:t>532.192</w:t>
@@ -3183,7 +3140,6 @@
                 <w:sz w:val="18"/>
                 <w:szCs w:val="18"/>
                 <w:u w:val="none"/>
-                <w:bdr w:val="none" w:color="auto" w:sz="0" w:space="0"/>
                 <w:lang w:val="en-US" w:eastAsia="zh-CN" w:bidi="ar"/>
               </w:rPr>
               <w:t>6.763</w:t>
@@ -3233,7 +3189,6 @@
                 <w:sz w:val="18"/>
                 <w:szCs w:val="18"/>
                 <w:u w:val="none"/>
-                <w:bdr w:val="none" w:color="auto" w:sz="0" w:space="0"/>
                 <w:lang w:val="en-US" w:eastAsia="zh-CN" w:bidi="ar"/>
               </w:rPr>
               <w:t>6.815</w:t>
@@ -3288,7 +3243,6 @@
                 <w:sz w:val="18"/>
                 <w:szCs w:val="18"/>
                 <w:u w:val="none"/>
-                <w:bdr w:val="none" w:color="auto" w:sz="0" w:space="0"/>
                 <w:lang w:val="en-US" w:eastAsia="zh-CN" w:bidi="ar"/>
               </w:rPr>
               <w:t>Group</w:t>
@@ -3427,7 +3381,6 @@
                 <w:sz w:val="18"/>
                 <w:szCs w:val="18"/>
                 <w:u w:val="none"/>
-                <w:bdr w:val="none" w:color="auto" w:sz="0" w:space="0"/>
                 <w:lang w:val="en-US" w:eastAsia="zh-CN" w:bidi="ar"/>
               </w:rPr>
               <w:t>1.233</w:t>
@@ -3477,7 +3430,6 @@
                 <w:sz w:val="18"/>
                 <w:szCs w:val="18"/>
                 <w:u w:val="none"/>
-                <w:bdr w:val="none" w:color="auto" w:sz="0" w:space="0"/>
                 <w:lang w:val="en-US" w:eastAsia="zh-CN" w:bidi="ar"/>
               </w:rPr>
               <w:t>0.018</w:t>
@@ -3527,7 +3479,6 @@
                 <w:sz w:val="18"/>
                 <w:szCs w:val="18"/>
                 <w:u w:val="none"/>
-                <w:bdr w:val="none" w:color="auto" w:sz="0" w:space="0"/>
                 <w:lang w:val="en-US" w:eastAsia="zh-CN" w:bidi="ar"/>
               </w:rPr>
               <w:t>68.374</w:t>
@@ -3625,7 +3576,6 @@
                 <w:sz w:val="18"/>
                 <w:szCs w:val="18"/>
                 <w:u w:val="none"/>
-                <w:bdr w:val="none" w:color="auto" w:sz="0" w:space="0"/>
                 <w:lang w:val="en-US" w:eastAsia="zh-CN" w:bidi="ar"/>
               </w:rPr>
               <w:t>1.197</w:t>
@@ -3676,7 +3626,6 @@
                 <w:sz w:val="18"/>
                 <w:szCs w:val="18"/>
                 <w:u w:val="none"/>
-                <w:bdr w:val="none" w:color="auto" w:sz="0" w:space="0"/>
                 <w:lang w:val="en-US" w:eastAsia="zh-CN" w:bidi="ar"/>
               </w:rPr>
               <w:t>1.27</w:t>
@@ -3692,7 +3641,6 @@
                 <w:sz w:val="18"/>
                 <w:szCs w:val="18"/>
                 <w:u w:val="none"/>
-                <w:bdr w:val="none" w:color="auto" w:sz="0" w:space="0"/>
                 <w:lang w:val="en-US" w:eastAsia="zh-CN" w:bidi="ar"/>
               </w:rPr>
               <w:t>0</w:t>
@@ -3747,7 +3695,6 @@
                 <w:sz w:val="18"/>
                 <w:szCs w:val="18"/>
                 <w:u w:val="none"/>
-                <w:bdr w:val="none" w:color="auto" w:sz="0" w:space="0"/>
                 <w:lang w:val="en-US" w:eastAsia="zh-CN" w:bidi="ar"/>
               </w:rPr>
               <w:t>Pre_MC</w:t>
@@ -3886,7 +3833,6 @@
                 <w:sz w:val="18"/>
                 <w:szCs w:val="18"/>
                 <w:u w:val="none"/>
-                <w:bdr w:val="none" w:color="auto" w:sz="0" w:space="0"/>
                 <w:lang w:val="en-US" w:eastAsia="zh-CN" w:bidi="ar"/>
               </w:rPr>
               <w:t>0.868</w:t>
@@ -3936,7 +3882,6 @@
                 <w:sz w:val="18"/>
                 <w:szCs w:val="18"/>
                 <w:u w:val="none"/>
-                <w:bdr w:val="none" w:color="auto" w:sz="0" w:space="0"/>
                 <w:lang w:val="en-US" w:eastAsia="zh-CN" w:bidi="ar"/>
               </w:rPr>
               <w:t>0.008</w:t>
@@ -3986,7 +3931,6 @@
                 <w:sz w:val="18"/>
                 <w:szCs w:val="18"/>
                 <w:u w:val="none"/>
-                <w:bdr w:val="none" w:color="auto" w:sz="0" w:space="0"/>
                 <w:lang w:val="en-US" w:eastAsia="zh-CN" w:bidi="ar"/>
               </w:rPr>
               <w:t>115.181</w:t>
@@ -4084,7 +4028,6 @@
                 <w:sz w:val="18"/>
                 <w:szCs w:val="18"/>
                 <w:u w:val="none"/>
-                <w:bdr w:val="none" w:color="auto" w:sz="0" w:space="0"/>
                 <w:lang w:val="en-US" w:eastAsia="zh-CN" w:bidi="ar"/>
               </w:rPr>
               <w:t>0.852</w:t>
@@ -4134,7 +4077,6 @@
                 <w:sz w:val="18"/>
                 <w:szCs w:val="18"/>
                 <w:u w:val="none"/>
-                <w:bdr w:val="none" w:color="auto" w:sz="0" w:space="0"/>
                 <w:lang w:val="en-US" w:eastAsia="zh-CN" w:bidi="ar"/>
               </w:rPr>
               <w:t>0.883</w:t>
@@ -4189,7 +4131,6 @@
                 <w:sz w:val="18"/>
                 <w:szCs w:val="18"/>
                 <w:u w:val="none"/>
-                <w:bdr w:val="none" w:color="auto" w:sz="0" w:space="0"/>
                 <w:lang w:val="en-US" w:eastAsia="zh-CN" w:bidi="ar"/>
               </w:rPr>
               <w:t>Group*Pre_MC</w:t>
@@ -4328,7 +4269,6 @@
                 <w:sz w:val="18"/>
                 <w:szCs w:val="18"/>
                 <w:u w:val="none"/>
-                <w:bdr w:val="none" w:color="auto" w:sz="0" w:space="0"/>
                 <w:lang w:val="en-US" w:eastAsia="zh-CN" w:bidi="ar"/>
               </w:rPr>
               <w:t>-0.616</w:t>
@@ -4379,7 +4319,6 @@
                 <w:sz w:val="18"/>
                 <w:szCs w:val="18"/>
                 <w:u w:val="none"/>
-                <w:bdr w:val="none" w:color="auto" w:sz="0" w:space="0"/>
                 <w:lang w:val="en-US" w:eastAsia="zh-CN" w:bidi="ar"/>
               </w:rPr>
               <w:t>0.01</w:t>
@@ -4395,7 +4334,6 @@
                 <w:sz w:val="18"/>
                 <w:szCs w:val="18"/>
                 <w:u w:val="none"/>
-                <w:bdr w:val="none" w:color="auto" w:sz="0" w:space="0"/>
                 <w:lang w:val="en-US" w:eastAsia="zh-CN" w:bidi="ar"/>
               </w:rPr>
               <w:t>0</w:t>
@@ -4445,7 +4383,6 @@
                 <w:sz w:val="18"/>
                 <w:szCs w:val="18"/>
                 <w:u w:val="none"/>
-                <w:bdr w:val="none" w:color="auto" w:sz="0" w:space="0"/>
                 <w:lang w:val="en-US" w:eastAsia="zh-CN" w:bidi="ar"/>
               </w:rPr>
               <w:t>-58.903</w:t>
@@ -4543,7 +4480,6 @@
                 <w:sz w:val="18"/>
                 <w:szCs w:val="18"/>
                 <w:u w:val="none"/>
-                <w:bdr w:val="none" w:color="auto" w:sz="0" w:space="0"/>
                 <w:lang w:val="en-US" w:eastAsia="zh-CN" w:bidi="ar"/>
               </w:rPr>
               <w:t>-0.637</w:t>
@@ -4593,7 +4529,6 @@
                 <w:sz w:val="18"/>
                 <w:szCs w:val="18"/>
                 <w:u w:val="none"/>
-                <w:bdr w:val="none" w:color="auto" w:sz="0" w:space="0"/>
                 <w:lang w:val="en-US" w:eastAsia="zh-CN" w:bidi="ar"/>
               </w:rPr>
               <w:t>-0.595</w:t>
@@ -4932,6 +4867,7 @@
     </w:p>
     <w:tbl>
       <w:tblPr>
+        <w:tblStyle w:val="2"/>
         <w:tblW w:w="4998" w:type="pct"/>
         <w:tblInd w:w="0" w:type="dxa"/>
         <w:tblBorders>
@@ -4942,7 +4878,7 @@
           <w:insideH w:val="none" w:color="auto" w:sz="0" w:space="0"/>
           <w:insideV w:val="none" w:color="auto" w:sz="0" w:space="0"/>
         </w:tblBorders>
-        <w:shd w:val="clear"/>
+        <w:shd w:val="clear" w:color="auto" w:fill="auto"/>
         <w:tblLayout w:type="autofit"/>
         <w:tblCellMar>
           <w:top w:w="0" w:type="dxa"/>
@@ -5008,7 +4944,6 @@
                 <w:sz w:val="18"/>
                 <w:szCs w:val="18"/>
                 <w:u w:val="none"/>
-                <w:bdr w:val="none" w:color="auto" w:sz="0" w:space="0"/>
                 <w:lang w:val="en-US" w:eastAsia="zh-CN" w:bidi="ar"/>
               </w:rPr>
               <w:t>Pre_MC</w:t>
@@ -5058,7 +4993,6 @@
                 <w:sz w:val="18"/>
                 <w:szCs w:val="18"/>
                 <w:u w:val="none"/>
-                <w:bdr w:val="none" w:color="auto" w:sz="0" w:space="0"/>
                 <w:lang w:val="en-US" w:eastAsia="zh-CN" w:bidi="ar"/>
               </w:rPr>
               <w:t>Effect</w:t>
@@ -5108,7 +5042,6 @@
                 <w:sz w:val="18"/>
                 <w:szCs w:val="18"/>
                 <w:u w:val="none"/>
-                <w:bdr w:val="none" w:color="auto" w:sz="0" w:space="0"/>
                 <w:lang w:val="en-US" w:eastAsia="zh-CN" w:bidi="ar"/>
               </w:rPr>
               <w:t>se</w:t>
@@ -5158,7 +5091,6 @@
                 <w:sz w:val="18"/>
                 <w:szCs w:val="18"/>
                 <w:u w:val="none"/>
-                <w:bdr w:val="none" w:color="auto" w:sz="0" w:space="0"/>
                 <w:lang w:val="en-US" w:eastAsia="zh-CN" w:bidi="ar"/>
               </w:rPr>
               <w:t>t</w:t>
@@ -5208,7 +5140,6 @@
                 <w:sz w:val="18"/>
                 <w:szCs w:val="18"/>
                 <w:u w:val="none"/>
-                <w:bdr w:val="none" w:color="auto" w:sz="0" w:space="0"/>
                 <w:lang w:val="en-US" w:eastAsia="zh-CN" w:bidi="ar"/>
               </w:rPr>
               <w:t>p</w:t>
@@ -5258,7 +5189,6 @@
                 <w:sz w:val="18"/>
                 <w:szCs w:val="18"/>
                 <w:u w:val="none"/>
-                <w:bdr w:val="none" w:color="auto" w:sz="0" w:space="0"/>
                 <w:lang w:val="en-US" w:eastAsia="zh-CN" w:bidi="ar"/>
               </w:rPr>
               <w:t>LLCI</w:t>
@@ -5308,7 +5238,6 @@
                 <w:sz w:val="18"/>
                 <w:szCs w:val="18"/>
                 <w:u w:val="none"/>
-                <w:bdr w:val="none" w:color="auto" w:sz="0" w:space="0"/>
                 <w:lang w:val="en-US" w:eastAsia="zh-CN" w:bidi="ar"/>
               </w:rPr>
               <w:t>ULCI</w:t>
@@ -5363,7 +5292,6 @@
                 <w:sz w:val="18"/>
                 <w:szCs w:val="18"/>
                 <w:u w:val="none"/>
-                <w:bdr w:val="none" w:color="auto" w:sz="0" w:space="0"/>
                 <w:lang w:val="en-US" w:eastAsia="zh-CN" w:bidi="ar"/>
               </w:rPr>
               <w:t>-1.739</w:t>
@@ -5413,7 +5341,6 @@
                 <w:sz w:val="18"/>
                 <w:szCs w:val="18"/>
                 <w:u w:val="none"/>
-                <w:bdr w:val="none" w:color="auto" w:sz="0" w:space="0"/>
                 <w:lang w:val="en-US" w:eastAsia="zh-CN" w:bidi="ar"/>
               </w:rPr>
               <w:t>2.306</w:t>
@@ -5463,7 +5390,6 @@
                 <w:sz w:val="18"/>
                 <w:szCs w:val="18"/>
                 <w:u w:val="none"/>
-                <w:bdr w:val="none" w:color="auto" w:sz="0" w:space="0"/>
                 <w:lang w:val="en-US" w:eastAsia="zh-CN" w:bidi="ar"/>
               </w:rPr>
               <w:t>0.026</w:t>
@@ -5513,7 +5439,6 @@
                 <w:sz w:val="18"/>
                 <w:szCs w:val="18"/>
                 <w:u w:val="none"/>
-                <w:bdr w:val="none" w:color="auto" w:sz="0" w:space="0"/>
                 <w:lang w:val="en-US" w:eastAsia="zh-CN" w:bidi="ar"/>
               </w:rPr>
               <w:t>90.045</w:t>
@@ -5611,7 +5536,6 @@
                 <w:sz w:val="18"/>
                 <w:szCs w:val="18"/>
                 <w:u w:val="none"/>
-                <w:bdr w:val="none" w:color="auto" w:sz="0" w:space="0"/>
                 <w:lang w:val="en-US" w:eastAsia="zh-CN" w:bidi="ar"/>
               </w:rPr>
               <w:t>2.254</w:t>
@@ -5661,7 +5585,6 @@
                 <w:sz w:val="18"/>
                 <w:szCs w:val="18"/>
                 <w:u w:val="none"/>
-                <w:bdr w:val="none" w:color="auto" w:sz="0" w:space="0"/>
                 <w:lang w:val="en-US" w:eastAsia="zh-CN" w:bidi="ar"/>
               </w:rPr>
               <w:t>2.357</w:t>
@@ -5717,7 +5640,6 @@
                 <w:sz w:val="18"/>
                 <w:szCs w:val="18"/>
                 <w:u w:val="none"/>
-                <w:bdr w:val="none" w:color="auto" w:sz="0" w:space="0"/>
                 <w:lang w:val="en-US" w:eastAsia="zh-CN" w:bidi="ar"/>
               </w:rPr>
               <w:t>0</w:t>
@@ -5733,7 +5655,6 @@
                 <w:sz w:val="18"/>
                 <w:szCs w:val="18"/>
                 <w:u w:val="none"/>
-                <w:bdr w:val="none" w:color="auto" w:sz="0" w:space="0"/>
                 <w:lang w:val="en-US" w:eastAsia="zh-CN" w:bidi="ar"/>
               </w:rPr>
               <w:t>.000</w:t>
@@ -5783,7 +5704,6 @@
                 <w:sz w:val="18"/>
                 <w:szCs w:val="18"/>
                 <w:u w:val="none"/>
-                <w:bdr w:val="none" w:color="auto" w:sz="0" w:space="0"/>
                 <w:lang w:val="en-US" w:eastAsia="zh-CN" w:bidi="ar"/>
               </w:rPr>
               <w:t>1.233</w:t>
@@ -5833,7 +5753,6 @@
                 <w:sz w:val="18"/>
                 <w:szCs w:val="18"/>
                 <w:u w:val="none"/>
-                <w:bdr w:val="none" w:color="auto" w:sz="0" w:space="0"/>
                 <w:lang w:val="en-US" w:eastAsia="zh-CN" w:bidi="ar"/>
               </w:rPr>
               <w:t>0.018</w:t>
@@ -5883,7 +5802,6 @@
                 <w:sz w:val="18"/>
                 <w:szCs w:val="18"/>
                 <w:u w:val="none"/>
-                <w:bdr w:val="none" w:color="auto" w:sz="0" w:space="0"/>
                 <w:lang w:val="en-US" w:eastAsia="zh-CN" w:bidi="ar"/>
               </w:rPr>
               <w:t>68.374</w:t>
@@ -5981,7 +5899,6 @@
                 <w:sz w:val="18"/>
                 <w:szCs w:val="18"/>
                 <w:u w:val="none"/>
-                <w:bdr w:val="none" w:color="auto" w:sz="0" w:space="0"/>
                 <w:lang w:val="en-US" w:eastAsia="zh-CN" w:bidi="ar"/>
               </w:rPr>
               <w:t>1.197</w:t>
@@ -6032,7 +5949,6 @@
                 <w:sz w:val="18"/>
                 <w:szCs w:val="18"/>
                 <w:u w:val="none"/>
-                <w:bdr w:val="none" w:color="auto" w:sz="0" w:space="0"/>
                 <w:lang w:val="en-US" w:eastAsia="zh-CN" w:bidi="ar"/>
               </w:rPr>
               <w:t>1.27</w:t>
@@ -6048,7 +5964,6 @@
                 <w:sz w:val="18"/>
                 <w:szCs w:val="18"/>
                 <w:u w:val="none"/>
-                <w:bdr w:val="none" w:color="auto" w:sz="0" w:space="0"/>
                 <w:lang w:val="en-US" w:eastAsia="zh-CN" w:bidi="ar"/>
               </w:rPr>
               <w:t>0</w:t>
@@ -6103,7 +6018,6 @@
                 <w:sz w:val="18"/>
                 <w:szCs w:val="18"/>
                 <w:u w:val="none"/>
-                <w:bdr w:val="none" w:color="auto" w:sz="0" w:space="0"/>
                 <w:lang w:val="en-US" w:eastAsia="zh-CN" w:bidi="ar"/>
               </w:rPr>
               <w:t>1.739</w:t>
@@ -6153,7 +6067,6 @@
                 <w:sz w:val="18"/>
                 <w:szCs w:val="18"/>
                 <w:u w:val="none"/>
-                <w:bdr w:val="none" w:color="auto" w:sz="0" w:space="0"/>
                 <w:lang w:val="en-US" w:eastAsia="zh-CN" w:bidi="ar"/>
               </w:rPr>
               <w:t>0.161</w:t>
@@ -6203,7 +6116,6 @@
                 <w:sz w:val="18"/>
                 <w:szCs w:val="18"/>
                 <w:u w:val="none"/>
-                <w:bdr w:val="none" w:color="auto" w:sz="0" w:space="0"/>
                 <w:lang w:val="en-US" w:eastAsia="zh-CN" w:bidi="ar"/>
               </w:rPr>
               <w:t>0.026</w:t>
@@ -6253,7 +6165,6 @@
                 <w:sz w:val="18"/>
                 <w:szCs w:val="18"/>
                 <w:u w:val="none"/>
-                <w:bdr w:val="none" w:color="auto" w:sz="0" w:space="0"/>
                 <w:lang w:val="en-US" w:eastAsia="zh-CN" w:bidi="ar"/>
               </w:rPr>
               <w:t>6.285</w:t>
@@ -6352,7 +6263,6 @@
                 <w:sz w:val="18"/>
                 <w:szCs w:val="18"/>
                 <w:u w:val="none"/>
-                <w:bdr w:val="none" w:color="auto" w:sz="0" w:space="0"/>
                 <w:lang w:val="en-US" w:eastAsia="zh-CN" w:bidi="ar"/>
               </w:rPr>
               <w:t>0.11</w:t>
@@ -6368,7 +6278,6 @@
                 <w:sz w:val="18"/>
                 <w:szCs w:val="18"/>
                 <w:u w:val="none"/>
-                <w:bdr w:val="none" w:color="auto" w:sz="0" w:space="0"/>
                 <w:lang w:val="en-US" w:eastAsia="zh-CN" w:bidi="ar"/>
               </w:rPr>
               <w:t>0</w:t>
@@ -6418,7 +6327,6 @@
                 <w:sz w:val="18"/>
                 <w:szCs w:val="18"/>
                 <w:u w:val="none"/>
-                <w:bdr w:val="none" w:color="auto" w:sz="0" w:space="0"/>
                 <w:lang w:val="en-US" w:eastAsia="zh-CN" w:bidi="ar"/>
               </w:rPr>
               <w:t>0.213</w:t>
@@ -6793,7 +6701,20 @@
           <w:szCs w:val="18"/>
           <w:lang w:val="en-US" w:eastAsia="zh-CN"/>
         </w:rPr>
-        <w:t>Johnson-Neyman Plot</w:t>
+        <w:t>Simple Slope Plot of Grou</w:t>
+      </w:r>
+      <w:bookmarkStart w:id="0" w:name="_GoBack"/>
+      <w:bookmarkEnd w:id="0"/>
+      <w:r>
+        <w:rPr>
+          <w:rFonts w:hint="eastAsia" w:ascii="宋体" w:hAnsi="宋体" w:eastAsia="宋体" w:cs="宋体"/>
+          <w:i/>
+          <w:iCs/>
+          <w:sz w:val="18"/>
+          <w:szCs w:val="18"/>
+          <w:lang w:val="en-US" w:eastAsia="zh-CN"/>
+        </w:rPr>
+        <w:t>p Assignment on Post, Moderated by Pre</w:t>
       </w:r>
     </w:p>
     <w:p>
@@ -6919,8 +6840,6 @@
           <w:lang w:val="en-US" w:eastAsia="zh-CN"/>
         </w:rPr>
       </w:pPr>
-      <w:bookmarkStart w:id="0" w:name="_GoBack"/>
-      <w:bookmarkEnd w:id="0"/>
     </w:p>
     <w:sectPr>
       <w:pgSz w:w="11906" w:h="16838"/>

</xml_diff>

<commit_message>
Sync from private source SHA: 10fa65f3caa0a2511a08c6359ba225abb8e2a4a6
</commit_message>
<xml_diff>
--- a/Docs/03ANOVA/ANCOVA_Case_Interaction.docx
+++ b/Docs/03ANOVA/ANCOVA_Case_Interaction.docx
@@ -4588,61 +4588,7 @@
           <w:szCs w:val="21"/>
           <w:lang w:val="en-US" w:eastAsia="zh-CN"/>
         </w:rPr>
-        <w:t>构建的多元回归模型拟合结果（表2）表明，回归模型拟合良好（</w:t>
-      </w:r>
-      <w:r>
-        <w:rPr>
-          <w:rFonts w:hint="default" w:ascii="方正仿宋_GB2312" w:hAnsi="方正仿宋_GB2312" w:eastAsia="方正仿宋_GB2312" w:cs="方正仿宋_GB2312"/>
-          <w:sz w:val="21"/>
-          <w:szCs w:val="21"/>
-          <w:lang w:val="en-US" w:eastAsia="zh-CN"/>
-        </w:rPr>
-        <w:t>R-Sq = 0.997 , F(3,56)=6627.059 , p &lt; .001</w:t>
-      </w:r>
-      <w:r>
-        <w:rPr>
-          <w:rFonts w:hint="eastAsia" w:ascii="方正仿宋_GB2312" w:hAnsi="方正仿宋_GB2312" w:eastAsia="方正仿宋_GB2312" w:cs="方正仿宋_GB2312"/>
-          <w:sz w:val="21"/>
-          <w:szCs w:val="21"/>
-          <w:lang w:val="en-US" w:eastAsia="zh-CN"/>
-        </w:rPr>
-        <w:t>,</w:t>
-      </w:r>
-      <w:r>
-        <w:rPr>
-          <w:rFonts w:hint="default" w:ascii="方正仿宋_GB2312" w:hAnsi="方正仿宋_GB2312" w:eastAsia="方正仿宋_GB2312" w:cs="方正仿宋_GB2312"/>
-          <w:sz w:val="21"/>
-          <w:szCs w:val="21"/>
-          <w:lang w:val="en-US" w:eastAsia="zh-CN"/>
-        </w:rPr>
-        <w:t xml:space="preserve"> R-Sq</w:t>
-      </w:r>
-      <w:r>
-        <w:rPr>
-          <w:rFonts w:hint="eastAsia" w:ascii="方正仿宋_GB2312" w:hAnsi="方正仿宋_GB2312" w:eastAsia="方正仿宋_GB2312" w:cs="方正仿宋_GB2312"/>
-          <w:sz w:val="21"/>
-          <w:szCs w:val="21"/>
-          <w:lang w:val="en-US" w:eastAsia="zh-CN"/>
-        </w:rPr>
-        <w:t>显著：</w:t>
-      </w:r>
-      <w:r>
-        <w:rPr>
-          <w:rFonts w:hint="default" w:ascii="宋体" w:hAnsi="宋体" w:eastAsia="宋体" w:cs="宋体"/>
-          <w:sz w:val="18"/>
-          <w:szCs w:val="18"/>
-          <w:lang w:val="en-US" w:eastAsia="zh-CN"/>
-        </w:rPr>
-        <w:t>F(1 , 56) = 3469.539 , p &lt; .001.</w:t>
-      </w:r>
-      <w:r>
-        <w:rPr>
-          <w:rFonts w:hint="eastAsia" w:ascii="方正仿宋_GB2312" w:hAnsi="方正仿宋_GB2312" w:eastAsia="方正仿宋_GB2312" w:cs="方正仿宋_GB2312"/>
-          <w:sz w:val="21"/>
-          <w:szCs w:val="21"/>
-          <w:lang w:val="en-US" w:eastAsia="zh-CN"/>
-        </w:rPr>
-        <w:t>）。</w:t>
+        <w:t>构建的多元回归模型拟合结果（表2）表明，回归模型拟合良好（R-Sq = 0.997 , F(3,56)=6627.059 , p &lt; .001, R-Sq显著：F(1 , 56) = 3469.539 , p &lt; .001.）。</w:t>
       </w:r>
     </w:p>
     <w:p>
@@ -6514,6 +6460,25 @@
     </w:p>
     <w:p>
       <w:pPr>
+        <w:rPr>
+          <w:rFonts w:hint="default" w:ascii="方正仿宋_GB2312" w:hAnsi="方正仿宋_GB2312" w:eastAsia="方正仿宋_GB2312" w:cs="方正仿宋_GB2312"/>
+          <w:sz w:val="21"/>
+          <w:szCs w:val="21"/>
+          <w:lang w:val="en-US" w:eastAsia="zh-CN"/>
+        </w:rPr>
+      </w:pPr>
+      <w:r>
+        <w:rPr>
+          <w:rFonts w:hint="default" w:ascii="方正仿宋_GB2312" w:hAnsi="方正仿宋_GB2312" w:eastAsia="方正仿宋_GB2312" w:cs="方正仿宋_GB2312"/>
+          <w:sz w:val="21"/>
+          <w:szCs w:val="21"/>
+          <w:lang w:val="en-US" w:eastAsia="zh-CN"/>
+        </w:rPr>
+        <w:br w:type="page"/>
+      </w:r>
+    </w:p>
+    <w:p>
+      <w:pPr>
         <w:keepNext w:val="0"/>
         <w:keepLines w:val="0"/>
         <w:pageBreakBefore w:val="0"/>
@@ -6612,6 +6577,31 @@
         <w:jc w:val="both"/>
         <w:textAlignment w:val="auto"/>
         <w:rPr>
+          <w:rFonts w:hint="eastAsia" w:ascii="宋体" w:hAnsi="宋体" w:eastAsia="宋体" w:cs="宋体"/>
+          <w:b/>
+          <w:bCs/>
+          <w:i w:val="0"/>
+          <w:iCs w:val="0"/>
+          <w:sz w:val="18"/>
+          <w:szCs w:val="18"/>
+          <w:lang w:val="en-US" w:eastAsia="zh-CN"/>
+        </w:rPr>
+      </w:pPr>
+      <w:r>
+        <w:rPr>
+          <w:rFonts w:hint="eastAsia" w:ascii="宋体" w:hAnsi="宋体" w:eastAsia="宋体" w:cs="宋体"/>
+          <w:b/>
+          <w:bCs/>
+          <w:i w:val="0"/>
+          <w:iCs w:val="0"/>
+          <w:sz w:val="18"/>
+          <w:szCs w:val="18"/>
+          <w:lang w:val="en-US" w:eastAsia="zh-CN"/>
+        </w:rPr>
+        <w:t>Table</w:t>
+      </w:r>
+      <w:r>
+        <w:rPr>
           <w:rFonts w:hint="default" w:ascii="宋体" w:hAnsi="宋体" w:eastAsia="宋体" w:cs="宋体"/>
           <w:b/>
           <w:bCs/>
@@ -6621,7 +6611,21 @@
           <w:szCs w:val="18"/>
           <w:lang w:val="en-US" w:eastAsia="zh-CN"/>
         </w:rPr>
-      </w:pPr>
+        <w:t xml:space="preserve"> 4</w:t>
+      </w:r>
+      <w:r>
+        <w:rPr>
+          <w:rFonts w:hint="eastAsia" w:ascii="宋体" w:hAnsi="宋体" w:eastAsia="宋体" w:cs="宋体"/>
+          <w:b/>
+          <w:bCs/>
+          <w:i w:val="0"/>
+          <w:iCs w:val="0"/>
+          <w:sz w:val="18"/>
+          <w:szCs w:val="18"/>
+          <w:lang w:val="en-US" w:eastAsia="zh-CN"/>
+        </w:rPr>
+        <w:t xml:space="preserve"> </w:t>
+      </w:r>
     </w:p>
     <w:p>
       <w:pPr>
@@ -6656,6 +6660,2452 @@
       <w:r>
         <w:rPr>
           <w:rFonts w:hint="default" w:ascii="宋体" w:hAnsi="宋体" w:eastAsia="宋体" w:cs="宋体"/>
+          <w:i/>
+          <w:iCs/>
+          <w:sz w:val="18"/>
+          <w:szCs w:val="18"/>
+          <w:lang w:val="en-US" w:eastAsia="zh-CN"/>
+        </w:rPr>
+        <w:t>Johnson-Neyman Significance Region Thresholds for the Conditional Effect of Group Assignment on Post (α = .05)</w:t>
+      </w:r>
+    </w:p>
+    <w:tbl>
+      <w:tblPr>
+        <w:tblW w:w="4997" w:type="pct"/>
+        <w:tblInd w:w="0" w:type="dxa"/>
+        <w:tblBorders>
+          <w:top w:val="none" w:color="auto" w:sz="0" w:space="0"/>
+          <w:left w:val="none" w:color="auto" w:sz="0" w:space="0"/>
+          <w:bottom w:val="none" w:color="auto" w:sz="0" w:space="0"/>
+          <w:right w:val="none" w:color="auto" w:sz="0" w:space="0"/>
+          <w:insideH w:val="none" w:color="auto" w:sz="0" w:space="0"/>
+          <w:insideV w:val="none" w:color="auto" w:sz="0" w:space="0"/>
+        </w:tblBorders>
+        <w:shd w:val="clear"/>
+        <w:tblLayout w:type="autofit"/>
+        <w:tblCellMar>
+          <w:top w:w="0" w:type="dxa"/>
+          <w:left w:w="108" w:type="dxa"/>
+          <w:bottom w:w="0" w:type="dxa"/>
+          <w:right w:w="108" w:type="dxa"/>
+        </w:tblCellMar>
+      </w:tblPr>
+      <w:tblGrid>
+        <w:gridCol w:w="880"/>
+        <w:gridCol w:w="880"/>
+        <w:gridCol w:w="880"/>
+        <w:gridCol w:w="880"/>
+        <w:gridCol w:w="881"/>
+        <w:gridCol w:w="881"/>
+        <w:gridCol w:w="1368"/>
+        <w:gridCol w:w="949"/>
+        <w:gridCol w:w="918"/>
+      </w:tblGrid>
+      <w:tr>
+        <w:trPr>
+          <w:trHeight w:val="352" w:hRule="atLeast"/>
+        </w:trPr>
+        <w:tc>
+          <w:tcPr>
+            <w:tcW w:w="527" w:type="pct"/>
+            <w:tcBorders>
+              <w:top w:val="single" w:color="000000" w:sz="12" w:space="0"/>
+              <w:left w:val="nil"/>
+              <w:bottom w:val="single" w:color="000000" w:sz="4" w:space="0"/>
+              <w:right w:val="nil"/>
+              <w:tl2br w:val="nil"/>
+            </w:tcBorders>
+            <w:shd w:val="clear" w:color="auto" w:fill="FFFFFF"/>
+            <w:noWrap/>
+            <w:vAlign w:val="center"/>
+          </w:tcPr>
+          <w:p>
+            <w:pPr>
+              <w:keepNext w:val="0"/>
+              <w:keepLines w:val="0"/>
+              <w:widowControl/>
+              <w:suppressLineNumbers w:val="0"/>
+              <w:jc w:val="center"/>
+              <w:textAlignment w:val="center"/>
+              <w:rPr>
+                <w:rFonts w:hint="eastAsia" w:ascii="宋体" w:hAnsi="宋体" w:eastAsia="宋体" w:cs="宋体"/>
+                <w:b w:val="0"/>
+                <w:i w:val="0"/>
+                <w:iCs w:val="0"/>
+                <w:color w:val="000000"/>
+                <w:sz w:val="18"/>
+                <w:szCs w:val="18"/>
+                <w:u w:val="none"/>
+              </w:rPr>
+            </w:pPr>
+            <w:r>
+              <w:rPr>
+                <w:rFonts w:hint="eastAsia" w:ascii="宋体" w:hAnsi="宋体" w:eastAsia="宋体" w:cs="宋体"/>
+                <w:b w:val="0"/>
+                <w:i w:val="0"/>
+                <w:iCs w:val="0"/>
+                <w:color w:val="000000"/>
+                <w:kern w:val="0"/>
+                <w:sz w:val="18"/>
+                <w:szCs w:val="18"/>
+                <w:u w:val="none"/>
+                <w:bdr w:val="none" w:color="auto" w:sz="0" w:space="0"/>
+                <w:lang w:val="en-US" w:eastAsia="zh-CN" w:bidi="ar"/>
+              </w:rPr>
+              <w:t>Pre_MC</w:t>
+            </w:r>
+          </w:p>
+        </w:tc>
+        <w:tc>
+          <w:tcPr>
+            <w:tcW w:w="527" w:type="pct"/>
+            <w:tcBorders>
+              <w:top w:val="single" w:color="000000" w:sz="12" w:space="0"/>
+              <w:left w:val="nil"/>
+              <w:bottom w:val="single" w:color="000000" w:sz="4" w:space="0"/>
+              <w:right w:val="nil"/>
+            </w:tcBorders>
+            <w:shd w:val="clear" w:color="auto" w:fill="FFFFFF"/>
+            <w:noWrap/>
+            <w:vAlign w:val="center"/>
+          </w:tcPr>
+          <w:p>
+            <w:pPr>
+              <w:keepNext w:val="0"/>
+              <w:keepLines w:val="0"/>
+              <w:widowControl/>
+              <w:suppressLineNumbers w:val="0"/>
+              <w:jc w:val="center"/>
+              <w:textAlignment w:val="center"/>
+              <w:rPr>
+                <w:rFonts w:hint="eastAsia" w:ascii="宋体" w:hAnsi="宋体" w:eastAsia="宋体" w:cs="宋体"/>
+                <w:b w:val="0"/>
+                <w:i w:val="0"/>
+                <w:iCs w:val="0"/>
+                <w:color w:val="000000"/>
+                <w:sz w:val="18"/>
+                <w:szCs w:val="18"/>
+                <w:u w:val="none"/>
+              </w:rPr>
+            </w:pPr>
+            <w:r>
+              <w:rPr>
+                <w:rFonts w:hint="eastAsia" w:ascii="宋体" w:hAnsi="宋体" w:eastAsia="宋体" w:cs="宋体"/>
+                <w:b w:val="0"/>
+                <w:i w:val="0"/>
+                <w:iCs w:val="0"/>
+                <w:color w:val="000000"/>
+                <w:kern w:val="0"/>
+                <w:sz w:val="18"/>
+                <w:szCs w:val="18"/>
+                <w:u w:val="none"/>
+                <w:bdr w:val="none" w:color="auto" w:sz="0" w:space="0"/>
+                <w:lang w:val="en-US" w:eastAsia="zh-CN" w:bidi="ar"/>
+              </w:rPr>
+              <w:t>Raw</w:t>
+            </w:r>
+          </w:p>
+        </w:tc>
+        <w:tc>
+          <w:tcPr>
+            <w:tcW w:w="527" w:type="pct"/>
+            <w:tcBorders>
+              <w:top w:val="single" w:color="000000" w:sz="12" w:space="0"/>
+              <w:left w:val="nil"/>
+              <w:bottom w:val="single" w:color="000000" w:sz="4" w:space="0"/>
+              <w:right w:val="nil"/>
+            </w:tcBorders>
+            <w:shd w:val="clear" w:color="auto" w:fill="FFFFFF"/>
+            <w:noWrap/>
+            <w:vAlign w:val="center"/>
+          </w:tcPr>
+          <w:p>
+            <w:pPr>
+              <w:keepNext w:val="0"/>
+              <w:keepLines w:val="0"/>
+              <w:widowControl/>
+              <w:suppressLineNumbers w:val="0"/>
+              <w:jc w:val="center"/>
+              <w:textAlignment w:val="center"/>
+              <w:rPr>
+                <w:rFonts w:hint="eastAsia" w:ascii="宋体" w:hAnsi="宋体" w:eastAsia="宋体" w:cs="宋体"/>
+                <w:b w:val="0"/>
+                <w:i w:val="0"/>
+                <w:iCs w:val="0"/>
+                <w:color w:val="000000"/>
+                <w:sz w:val="18"/>
+                <w:szCs w:val="18"/>
+                <w:u w:val="none"/>
+              </w:rPr>
+            </w:pPr>
+            <w:r>
+              <w:rPr>
+                <w:rFonts w:hint="eastAsia" w:ascii="宋体" w:hAnsi="宋体" w:eastAsia="宋体" w:cs="宋体"/>
+                <w:b w:val="0"/>
+                <w:i w:val="0"/>
+                <w:iCs w:val="0"/>
+                <w:color w:val="000000"/>
+                <w:kern w:val="0"/>
+                <w:sz w:val="18"/>
+                <w:szCs w:val="18"/>
+                <w:u w:val="none"/>
+                <w:bdr w:val="none" w:color="auto" w:sz="0" w:space="0"/>
+                <w:lang w:val="en-US" w:eastAsia="zh-CN" w:bidi="ar"/>
+              </w:rPr>
+              <w:t>Effect</w:t>
+            </w:r>
+          </w:p>
+        </w:tc>
+        <w:tc>
+          <w:tcPr>
+            <w:tcW w:w="527" w:type="pct"/>
+            <w:tcBorders>
+              <w:top w:val="single" w:color="000000" w:sz="12" w:space="0"/>
+              <w:left w:val="nil"/>
+              <w:bottom w:val="single" w:color="000000" w:sz="4" w:space="0"/>
+              <w:right w:val="nil"/>
+            </w:tcBorders>
+            <w:shd w:val="clear" w:color="auto" w:fill="FFFFFF"/>
+            <w:noWrap/>
+            <w:vAlign w:val="center"/>
+          </w:tcPr>
+          <w:p>
+            <w:pPr>
+              <w:keepNext w:val="0"/>
+              <w:keepLines w:val="0"/>
+              <w:widowControl/>
+              <w:suppressLineNumbers w:val="0"/>
+              <w:jc w:val="center"/>
+              <w:textAlignment w:val="center"/>
+              <w:rPr>
+                <w:rFonts w:hint="eastAsia" w:ascii="宋体" w:hAnsi="宋体" w:eastAsia="宋体" w:cs="宋体"/>
+                <w:b w:val="0"/>
+                <w:i w:val="0"/>
+                <w:iCs w:val="0"/>
+                <w:color w:val="000000"/>
+                <w:sz w:val="18"/>
+                <w:szCs w:val="18"/>
+                <w:u w:val="none"/>
+              </w:rPr>
+            </w:pPr>
+            <w:r>
+              <w:rPr>
+                <w:rFonts w:hint="eastAsia" w:ascii="宋体" w:hAnsi="宋体" w:eastAsia="宋体" w:cs="宋体"/>
+                <w:b w:val="0"/>
+                <w:i w:val="0"/>
+                <w:iCs w:val="0"/>
+                <w:color w:val="000000"/>
+                <w:kern w:val="0"/>
+                <w:sz w:val="18"/>
+                <w:szCs w:val="18"/>
+                <w:u w:val="none"/>
+                <w:bdr w:val="none" w:color="auto" w:sz="0" w:space="0"/>
+                <w:lang w:val="en-US" w:eastAsia="zh-CN" w:bidi="ar"/>
+              </w:rPr>
+              <w:t>se</w:t>
+            </w:r>
+          </w:p>
+        </w:tc>
+        <w:tc>
+          <w:tcPr>
+            <w:tcW w:w="527" w:type="pct"/>
+            <w:tcBorders>
+              <w:top w:val="single" w:color="000000" w:sz="12" w:space="0"/>
+              <w:left w:val="nil"/>
+              <w:bottom w:val="single" w:color="000000" w:sz="4" w:space="0"/>
+              <w:right w:val="nil"/>
+            </w:tcBorders>
+            <w:shd w:val="clear" w:color="auto" w:fill="FFFFFF"/>
+            <w:noWrap/>
+            <w:vAlign w:val="center"/>
+          </w:tcPr>
+          <w:p>
+            <w:pPr>
+              <w:keepNext w:val="0"/>
+              <w:keepLines w:val="0"/>
+              <w:widowControl/>
+              <w:suppressLineNumbers w:val="0"/>
+              <w:jc w:val="center"/>
+              <w:textAlignment w:val="center"/>
+              <w:rPr>
+                <w:rFonts w:hint="eastAsia" w:ascii="宋体" w:hAnsi="宋体" w:eastAsia="宋体" w:cs="宋体"/>
+                <w:b w:val="0"/>
+                <w:i w:val="0"/>
+                <w:iCs w:val="0"/>
+                <w:color w:val="000000"/>
+                <w:sz w:val="18"/>
+                <w:szCs w:val="18"/>
+                <w:u w:val="none"/>
+              </w:rPr>
+            </w:pPr>
+            <w:r>
+              <w:rPr>
+                <w:rFonts w:hint="eastAsia" w:ascii="宋体" w:hAnsi="宋体" w:eastAsia="宋体" w:cs="宋体"/>
+                <w:b w:val="0"/>
+                <w:i w:val="0"/>
+                <w:iCs w:val="0"/>
+                <w:color w:val="000000"/>
+                <w:kern w:val="0"/>
+                <w:sz w:val="18"/>
+                <w:szCs w:val="18"/>
+                <w:u w:val="none"/>
+                <w:bdr w:val="none" w:color="auto" w:sz="0" w:space="0"/>
+                <w:lang w:val="en-US" w:eastAsia="zh-CN" w:bidi="ar"/>
+              </w:rPr>
+              <w:t>t</w:t>
+            </w:r>
+          </w:p>
+        </w:tc>
+        <w:tc>
+          <w:tcPr>
+            <w:tcW w:w="527" w:type="pct"/>
+            <w:tcBorders>
+              <w:top w:val="single" w:color="000000" w:sz="12" w:space="0"/>
+              <w:left w:val="nil"/>
+              <w:bottom w:val="single" w:color="000000" w:sz="4" w:space="0"/>
+              <w:right w:val="nil"/>
+            </w:tcBorders>
+            <w:shd w:val="clear" w:color="auto" w:fill="FFFFFF"/>
+            <w:noWrap/>
+            <w:vAlign w:val="center"/>
+          </w:tcPr>
+          <w:p>
+            <w:pPr>
+              <w:keepNext w:val="0"/>
+              <w:keepLines w:val="0"/>
+              <w:widowControl/>
+              <w:suppressLineNumbers w:val="0"/>
+              <w:jc w:val="center"/>
+              <w:textAlignment w:val="center"/>
+              <w:rPr>
+                <w:rFonts w:hint="eastAsia" w:ascii="宋体" w:hAnsi="宋体" w:eastAsia="宋体" w:cs="宋体"/>
+                <w:b w:val="0"/>
+                <w:i w:val="0"/>
+                <w:iCs w:val="0"/>
+                <w:color w:val="000000"/>
+                <w:sz w:val="18"/>
+                <w:szCs w:val="18"/>
+                <w:u w:val="none"/>
+              </w:rPr>
+            </w:pPr>
+            <w:r>
+              <w:rPr>
+                <w:rFonts w:hint="eastAsia" w:ascii="宋体" w:hAnsi="宋体" w:eastAsia="宋体" w:cs="宋体"/>
+                <w:b w:val="0"/>
+                <w:i w:val="0"/>
+                <w:iCs w:val="0"/>
+                <w:color w:val="000000"/>
+                <w:kern w:val="0"/>
+                <w:sz w:val="18"/>
+                <w:szCs w:val="18"/>
+                <w:u w:val="none"/>
+                <w:bdr w:val="none" w:color="auto" w:sz="0" w:space="0"/>
+                <w:lang w:val="en-US" w:eastAsia="zh-CN" w:bidi="ar"/>
+              </w:rPr>
+              <w:t>p</w:t>
+            </w:r>
+          </w:p>
+        </w:tc>
+        <w:tc>
+          <w:tcPr>
+            <w:tcW w:w="716" w:type="pct"/>
+            <w:tcBorders>
+              <w:top w:val="single" w:color="000000" w:sz="12" w:space="0"/>
+              <w:left w:val="nil"/>
+              <w:bottom w:val="single" w:color="000000" w:sz="4" w:space="0"/>
+              <w:right w:val="nil"/>
+            </w:tcBorders>
+            <w:shd w:val="clear" w:color="auto" w:fill="FFFFFF"/>
+            <w:noWrap/>
+            <w:vAlign w:val="center"/>
+          </w:tcPr>
+          <w:p>
+            <w:pPr>
+              <w:keepNext w:val="0"/>
+              <w:keepLines w:val="0"/>
+              <w:widowControl/>
+              <w:suppressLineNumbers w:val="0"/>
+              <w:jc w:val="center"/>
+              <w:textAlignment w:val="center"/>
+              <w:rPr>
+                <w:rFonts w:hint="eastAsia" w:ascii="宋体" w:hAnsi="宋体" w:eastAsia="宋体" w:cs="宋体"/>
+                <w:b w:val="0"/>
+                <w:i w:val="0"/>
+                <w:iCs w:val="0"/>
+                <w:color w:val="000000"/>
+                <w:sz w:val="18"/>
+                <w:szCs w:val="18"/>
+                <w:u w:val="none"/>
+              </w:rPr>
+            </w:pPr>
+            <w:r>
+              <w:rPr>
+                <w:rFonts w:hint="eastAsia" w:ascii="宋体" w:hAnsi="宋体" w:eastAsia="宋体" w:cs="宋体"/>
+                <w:b w:val="0"/>
+                <w:i w:val="0"/>
+                <w:iCs w:val="0"/>
+                <w:color w:val="000000"/>
+                <w:kern w:val="0"/>
+                <w:sz w:val="18"/>
+                <w:szCs w:val="18"/>
+                <w:u w:val="none"/>
+                <w:bdr w:val="none" w:color="auto" w:sz="0" w:space="0"/>
+                <w:lang w:val="en-US" w:eastAsia="zh-CN" w:bidi="ar"/>
+              </w:rPr>
+              <w:t>95%CI</w:t>
+            </w:r>
+          </w:p>
+        </w:tc>
+        <w:tc>
+          <w:tcPr>
+            <w:tcW w:w="567" w:type="pct"/>
+            <w:tcBorders>
+              <w:top w:val="single" w:color="000000" w:sz="12" w:space="0"/>
+              <w:left w:val="nil"/>
+              <w:bottom w:val="single" w:color="000000" w:sz="4" w:space="0"/>
+              <w:right w:val="nil"/>
+            </w:tcBorders>
+            <w:shd w:val="clear" w:color="auto" w:fill="FFFFFF"/>
+            <w:noWrap/>
+            <w:vAlign w:val="center"/>
+          </w:tcPr>
+          <w:p>
+            <w:pPr>
+              <w:keepNext w:val="0"/>
+              <w:keepLines w:val="0"/>
+              <w:widowControl/>
+              <w:suppressLineNumbers w:val="0"/>
+              <w:jc w:val="center"/>
+              <w:textAlignment w:val="center"/>
+              <w:rPr>
+                <w:rFonts w:hint="eastAsia" w:ascii="宋体" w:hAnsi="宋体" w:eastAsia="宋体" w:cs="宋体"/>
+                <w:b w:val="0"/>
+                <w:i w:val="0"/>
+                <w:iCs w:val="0"/>
+                <w:color w:val="000000"/>
+                <w:sz w:val="18"/>
+                <w:szCs w:val="18"/>
+                <w:u w:val="none"/>
+              </w:rPr>
+            </w:pPr>
+            <w:r>
+              <w:rPr>
+                <w:rFonts w:hint="eastAsia" w:ascii="宋体" w:hAnsi="宋体" w:eastAsia="宋体" w:cs="宋体"/>
+                <w:b w:val="0"/>
+                <w:i w:val="0"/>
+                <w:iCs w:val="0"/>
+                <w:color w:val="000000"/>
+                <w:kern w:val="0"/>
+                <w:sz w:val="18"/>
+                <w:szCs w:val="18"/>
+                <w:u w:val="none"/>
+                <w:bdr w:val="none" w:color="auto" w:sz="0" w:space="0"/>
+                <w:lang w:val="en-US" w:eastAsia="zh-CN" w:bidi="ar"/>
+              </w:rPr>
+              <w:t>% Below</w:t>
+            </w:r>
+          </w:p>
+        </w:tc>
+        <w:tc>
+          <w:tcPr>
+            <w:tcW w:w="549" w:type="pct"/>
+            <w:tcBorders>
+              <w:top w:val="single" w:color="000000" w:sz="12" w:space="0"/>
+              <w:left w:val="nil"/>
+              <w:bottom w:val="single" w:color="000000" w:sz="4" w:space="0"/>
+              <w:right w:val="nil"/>
+            </w:tcBorders>
+            <w:shd w:val="clear" w:color="auto" w:fill="FFFFFF"/>
+            <w:noWrap/>
+            <w:vAlign w:val="center"/>
+          </w:tcPr>
+          <w:p>
+            <w:pPr>
+              <w:keepNext w:val="0"/>
+              <w:keepLines w:val="0"/>
+              <w:widowControl/>
+              <w:suppressLineNumbers w:val="0"/>
+              <w:jc w:val="center"/>
+              <w:textAlignment w:val="center"/>
+              <w:rPr>
+                <w:rFonts w:hint="eastAsia" w:ascii="宋体" w:hAnsi="宋体" w:eastAsia="宋体" w:cs="宋体"/>
+                <w:b w:val="0"/>
+                <w:i w:val="0"/>
+                <w:iCs w:val="0"/>
+                <w:color w:val="000000"/>
+                <w:sz w:val="18"/>
+                <w:szCs w:val="18"/>
+                <w:u w:val="none"/>
+              </w:rPr>
+            </w:pPr>
+            <w:r>
+              <w:rPr>
+                <w:rFonts w:hint="eastAsia" w:ascii="宋体" w:hAnsi="宋体" w:eastAsia="宋体" w:cs="宋体"/>
+                <w:b w:val="0"/>
+                <w:i w:val="0"/>
+                <w:iCs w:val="0"/>
+                <w:color w:val="000000"/>
+                <w:kern w:val="0"/>
+                <w:sz w:val="18"/>
+                <w:szCs w:val="18"/>
+                <w:u w:val="none"/>
+                <w:bdr w:val="none" w:color="auto" w:sz="0" w:space="0"/>
+                <w:lang w:val="en-US" w:eastAsia="zh-CN" w:bidi="ar"/>
+              </w:rPr>
+              <w:t>% Above</w:t>
+            </w:r>
+          </w:p>
+        </w:tc>
+      </w:tr>
+      <w:tr>
+        <w:trPr>
+          <w:trHeight w:val="352" w:hRule="atLeast"/>
+        </w:trPr>
+        <w:tc>
+          <w:tcPr>
+            <w:tcW w:w="527" w:type="pct"/>
+            <w:tcBorders>
+              <w:top w:val="single" w:color="000000" w:sz="4" w:space="0"/>
+              <w:left w:val="nil"/>
+              <w:bottom w:val="nil"/>
+              <w:right w:val="nil"/>
+            </w:tcBorders>
+            <w:shd w:val="clear" w:color="auto" w:fill="FFFFFF"/>
+            <w:noWrap/>
+            <w:vAlign w:val="center"/>
+          </w:tcPr>
+          <w:p>
+            <w:pPr>
+              <w:keepNext w:val="0"/>
+              <w:keepLines w:val="0"/>
+              <w:widowControl/>
+              <w:suppressLineNumbers w:val="0"/>
+              <w:jc w:val="center"/>
+              <w:textAlignment w:val="center"/>
+              <w:rPr>
+                <w:rFonts w:hint="eastAsia" w:ascii="宋体" w:hAnsi="宋体" w:eastAsia="宋体" w:cs="宋体"/>
+                <w:b w:val="0"/>
+                <w:i w:val="0"/>
+                <w:iCs w:val="0"/>
+                <w:color w:val="000000"/>
+                <w:sz w:val="18"/>
+                <w:szCs w:val="18"/>
+                <w:u w:val="none"/>
+              </w:rPr>
+            </w:pPr>
+            <w:r>
+              <w:rPr>
+                <w:rFonts w:hint="eastAsia" w:ascii="宋体" w:hAnsi="宋体" w:eastAsia="宋体" w:cs="宋体"/>
+                <w:b w:val="0"/>
+                <w:i w:val="0"/>
+                <w:iCs w:val="0"/>
+                <w:color w:val="000000"/>
+                <w:kern w:val="0"/>
+                <w:sz w:val="18"/>
+                <w:szCs w:val="18"/>
+                <w:u w:val="none"/>
+                <w:bdr w:val="none" w:color="auto" w:sz="0" w:space="0"/>
+                <w:lang w:val="en-US" w:eastAsia="zh-CN" w:bidi="ar"/>
+              </w:rPr>
+              <w:t>-3.107</w:t>
+            </w:r>
+          </w:p>
+        </w:tc>
+        <w:tc>
+          <w:tcPr>
+            <w:tcW w:w="527" w:type="pct"/>
+            <w:tcBorders>
+              <w:top w:val="single" w:color="000000" w:sz="4" w:space="0"/>
+              <w:left w:val="nil"/>
+              <w:bottom w:val="nil"/>
+              <w:right w:val="nil"/>
+            </w:tcBorders>
+            <w:shd w:val="clear" w:color="auto" w:fill="FFFFFF"/>
+            <w:noWrap/>
+            <w:vAlign w:val="center"/>
+          </w:tcPr>
+          <w:p>
+            <w:pPr>
+              <w:keepNext w:val="0"/>
+              <w:keepLines w:val="0"/>
+              <w:widowControl/>
+              <w:suppressLineNumbers w:val="0"/>
+              <w:jc w:val="center"/>
+              <w:textAlignment w:val="center"/>
+              <w:rPr>
+                <w:rFonts w:hint="eastAsia" w:ascii="宋体" w:hAnsi="宋体" w:eastAsia="宋体" w:cs="宋体"/>
+                <w:b w:val="0"/>
+                <w:i w:val="0"/>
+                <w:iCs w:val="0"/>
+                <w:color w:val="000000"/>
+                <w:sz w:val="18"/>
+                <w:szCs w:val="18"/>
+                <w:u w:val="none"/>
+              </w:rPr>
+            </w:pPr>
+            <w:r>
+              <w:rPr>
+                <w:rFonts w:hint="eastAsia" w:ascii="宋体" w:hAnsi="宋体" w:eastAsia="宋体" w:cs="宋体"/>
+                <w:b w:val="0"/>
+                <w:i w:val="0"/>
+                <w:iCs w:val="0"/>
+                <w:color w:val="000000"/>
+                <w:kern w:val="0"/>
+                <w:sz w:val="18"/>
+                <w:szCs w:val="18"/>
+                <w:u w:val="none"/>
+                <w:bdr w:val="none" w:color="auto" w:sz="0" w:space="0"/>
+                <w:lang w:val="en-US" w:eastAsia="zh-CN" w:bidi="ar"/>
+              </w:rPr>
+              <w:t>3.203</w:t>
+            </w:r>
+          </w:p>
+        </w:tc>
+        <w:tc>
+          <w:tcPr>
+            <w:tcW w:w="527" w:type="pct"/>
+            <w:tcBorders>
+              <w:top w:val="single" w:color="000000" w:sz="4" w:space="0"/>
+              <w:left w:val="nil"/>
+              <w:bottom w:val="nil"/>
+              <w:right w:val="nil"/>
+            </w:tcBorders>
+            <w:shd w:val="clear" w:color="auto" w:fill="FFFFFF"/>
+            <w:noWrap/>
+            <w:vAlign w:val="center"/>
+          </w:tcPr>
+          <w:p>
+            <w:pPr>
+              <w:keepNext w:val="0"/>
+              <w:keepLines w:val="0"/>
+              <w:widowControl/>
+              <w:suppressLineNumbers w:val="0"/>
+              <w:jc w:val="center"/>
+              <w:textAlignment w:val="center"/>
+              <w:rPr>
+                <w:rFonts w:hint="eastAsia" w:ascii="宋体" w:hAnsi="宋体" w:eastAsia="宋体" w:cs="宋体"/>
+                <w:b w:val="0"/>
+                <w:i w:val="0"/>
+                <w:iCs w:val="0"/>
+                <w:color w:val="000000"/>
+                <w:sz w:val="18"/>
+                <w:szCs w:val="18"/>
+                <w:u w:val="none"/>
+              </w:rPr>
+            </w:pPr>
+            <w:r>
+              <w:rPr>
+                <w:rFonts w:hint="eastAsia" w:ascii="宋体" w:hAnsi="宋体" w:eastAsia="宋体" w:cs="宋体"/>
+                <w:b w:val="0"/>
+                <w:i w:val="0"/>
+                <w:iCs w:val="0"/>
+                <w:color w:val="000000"/>
+                <w:kern w:val="0"/>
+                <w:sz w:val="18"/>
+                <w:szCs w:val="18"/>
+                <w:u w:val="none"/>
+                <w:bdr w:val="none" w:color="auto" w:sz="0" w:space="0"/>
+                <w:lang w:val="en-US" w:eastAsia="zh-CN" w:bidi="ar"/>
+              </w:rPr>
+              <w:t>3.149</w:t>
+            </w:r>
+          </w:p>
+        </w:tc>
+        <w:tc>
+          <w:tcPr>
+            <w:tcW w:w="527" w:type="pct"/>
+            <w:tcBorders>
+              <w:top w:val="single" w:color="000000" w:sz="4" w:space="0"/>
+              <w:left w:val="nil"/>
+              <w:bottom w:val="nil"/>
+              <w:right w:val="nil"/>
+            </w:tcBorders>
+            <w:shd w:val="clear" w:color="auto" w:fill="FFFFFF"/>
+            <w:noWrap/>
+            <w:vAlign w:val="center"/>
+          </w:tcPr>
+          <w:p>
+            <w:pPr>
+              <w:keepNext w:val="0"/>
+              <w:keepLines w:val="0"/>
+              <w:widowControl/>
+              <w:suppressLineNumbers w:val="0"/>
+              <w:jc w:val="center"/>
+              <w:textAlignment w:val="center"/>
+              <w:rPr>
+                <w:rFonts w:hint="eastAsia" w:ascii="宋体" w:hAnsi="宋体" w:eastAsia="宋体" w:cs="宋体"/>
+                <w:b w:val="0"/>
+                <w:i w:val="0"/>
+                <w:iCs w:val="0"/>
+                <w:color w:val="000000"/>
+                <w:sz w:val="18"/>
+                <w:szCs w:val="18"/>
+                <w:u w:val="none"/>
+              </w:rPr>
+            </w:pPr>
+            <w:r>
+              <w:rPr>
+                <w:rFonts w:hint="eastAsia" w:ascii="宋体" w:hAnsi="宋体" w:eastAsia="宋体" w:cs="宋体"/>
+                <w:b w:val="0"/>
+                <w:i w:val="0"/>
+                <w:iCs w:val="0"/>
+                <w:color w:val="000000"/>
+                <w:kern w:val="0"/>
+                <w:sz w:val="18"/>
+                <w:szCs w:val="18"/>
+                <w:u w:val="none"/>
+                <w:bdr w:val="none" w:color="auto" w:sz="0" w:space="0"/>
+                <w:lang w:val="en-US" w:eastAsia="zh-CN" w:bidi="ar"/>
+              </w:rPr>
+              <w:t>0.037</w:t>
+            </w:r>
+          </w:p>
+        </w:tc>
+        <w:tc>
+          <w:tcPr>
+            <w:tcW w:w="527" w:type="pct"/>
+            <w:tcBorders>
+              <w:top w:val="single" w:color="000000" w:sz="4" w:space="0"/>
+              <w:left w:val="nil"/>
+              <w:bottom w:val="nil"/>
+              <w:right w:val="nil"/>
+            </w:tcBorders>
+            <w:shd w:val="clear" w:color="auto" w:fill="FFFFFF"/>
+            <w:noWrap/>
+            <w:vAlign w:val="center"/>
+          </w:tcPr>
+          <w:p>
+            <w:pPr>
+              <w:keepNext w:val="0"/>
+              <w:keepLines w:val="0"/>
+              <w:widowControl/>
+              <w:suppressLineNumbers w:val="0"/>
+              <w:jc w:val="center"/>
+              <w:textAlignment w:val="center"/>
+              <w:rPr>
+                <w:rFonts w:hint="eastAsia" w:ascii="宋体" w:hAnsi="宋体" w:eastAsia="宋体" w:cs="宋体"/>
+                <w:b w:val="0"/>
+                <w:i w:val="0"/>
+                <w:iCs w:val="0"/>
+                <w:color w:val="000000"/>
+                <w:sz w:val="18"/>
+                <w:szCs w:val="18"/>
+                <w:u w:val="none"/>
+              </w:rPr>
+            </w:pPr>
+            <w:r>
+              <w:rPr>
+                <w:rFonts w:hint="eastAsia" w:ascii="宋体" w:hAnsi="宋体" w:eastAsia="宋体" w:cs="宋体"/>
+                <w:b w:val="0"/>
+                <w:i w:val="0"/>
+                <w:iCs w:val="0"/>
+                <w:color w:val="000000"/>
+                <w:kern w:val="0"/>
+                <w:sz w:val="18"/>
+                <w:szCs w:val="18"/>
+                <w:u w:val="none"/>
+                <w:bdr w:val="none" w:color="auto" w:sz="0" w:space="0"/>
+                <w:lang w:val="en-US" w:eastAsia="zh-CN" w:bidi="ar"/>
+              </w:rPr>
+              <w:t>84.741</w:t>
+            </w:r>
+          </w:p>
+        </w:tc>
+        <w:tc>
+          <w:tcPr>
+            <w:tcW w:w="527" w:type="pct"/>
+            <w:tcBorders>
+              <w:top w:val="single" w:color="000000" w:sz="4" w:space="0"/>
+              <w:left w:val="nil"/>
+              <w:bottom w:val="nil"/>
+              <w:right w:val="nil"/>
+            </w:tcBorders>
+            <w:shd w:val="clear" w:color="auto" w:fill="FFFFFF"/>
+            <w:noWrap/>
+            <w:vAlign w:val="center"/>
+          </w:tcPr>
+          <w:p>
+            <w:pPr>
+              <w:keepNext w:val="0"/>
+              <w:keepLines w:val="0"/>
+              <w:widowControl/>
+              <w:suppressLineNumbers w:val="0"/>
+              <w:jc w:val="center"/>
+              <w:textAlignment w:val="center"/>
+              <w:rPr>
+                <w:rFonts w:hint="default" w:ascii="宋体" w:hAnsi="宋体" w:eastAsia="宋体" w:cs="宋体"/>
+                <w:b w:val="0"/>
+                <w:i w:val="0"/>
+                <w:iCs w:val="0"/>
+                <w:color w:val="000000"/>
+                <w:sz w:val="18"/>
+                <w:szCs w:val="18"/>
+                <w:u w:val="none"/>
+                <w:lang w:val="en-US"/>
+              </w:rPr>
+            </w:pPr>
+            <w:r>
+              <w:rPr>
+                <w:rFonts w:hint="default" w:ascii="宋体" w:hAnsi="宋体" w:eastAsia="宋体" w:cs="宋体"/>
+                <w:b w:val="0"/>
+                <w:i w:val="0"/>
+                <w:iCs w:val="0"/>
+                <w:color w:val="000000"/>
+                <w:sz w:val="18"/>
+                <w:szCs w:val="18"/>
+                <w:u w:val="none"/>
+                <w:lang w:val="en-US"/>
+              </w:rPr>
+              <w:t>&lt;0.001</w:t>
+            </w:r>
+          </w:p>
+        </w:tc>
+        <w:tc>
+          <w:tcPr>
+            <w:tcW w:w="716" w:type="pct"/>
+            <w:tcBorders>
+              <w:top w:val="single" w:color="000000" w:sz="4" w:space="0"/>
+              <w:left w:val="nil"/>
+              <w:bottom w:val="nil"/>
+              <w:right w:val="nil"/>
+            </w:tcBorders>
+            <w:shd w:val="clear" w:color="auto" w:fill="FFFFFF"/>
+            <w:noWrap/>
+            <w:vAlign w:val="center"/>
+          </w:tcPr>
+          <w:p>
+            <w:pPr>
+              <w:keepNext w:val="0"/>
+              <w:keepLines w:val="0"/>
+              <w:widowControl/>
+              <w:suppressLineNumbers w:val="0"/>
+              <w:jc w:val="center"/>
+              <w:textAlignment w:val="center"/>
+              <w:rPr>
+                <w:rFonts w:hint="eastAsia" w:ascii="宋体" w:hAnsi="宋体" w:eastAsia="宋体" w:cs="宋体"/>
+                <w:b w:val="0"/>
+                <w:i w:val="0"/>
+                <w:iCs w:val="0"/>
+                <w:color w:val="000000"/>
+                <w:sz w:val="18"/>
+                <w:szCs w:val="18"/>
+                <w:u w:val="none"/>
+              </w:rPr>
+            </w:pPr>
+            <w:r>
+              <w:rPr>
+                <w:rFonts w:hint="eastAsia" w:ascii="宋体" w:hAnsi="宋体" w:eastAsia="宋体" w:cs="宋体"/>
+                <w:b w:val="0"/>
+                <w:i w:val="0"/>
+                <w:iCs w:val="0"/>
+                <w:color w:val="000000"/>
+                <w:kern w:val="0"/>
+                <w:sz w:val="18"/>
+                <w:szCs w:val="18"/>
+                <w:u w:val="none"/>
+                <w:bdr w:val="none" w:color="auto" w:sz="0" w:space="0"/>
+                <w:lang w:val="en-US" w:eastAsia="zh-CN" w:bidi="ar"/>
+              </w:rPr>
+              <w:t>[3.074,3.223]</w:t>
+            </w:r>
+          </w:p>
+        </w:tc>
+        <w:tc>
+          <w:tcPr>
+            <w:tcW w:w="567" w:type="pct"/>
+            <w:tcBorders>
+              <w:top w:val="single" w:color="000000" w:sz="4" w:space="0"/>
+              <w:left w:val="nil"/>
+              <w:bottom w:val="nil"/>
+              <w:right w:val="nil"/>
+            </w:tcBorders>
+            <w:shd w:val="clear" w:color="auto" w:fill="FFFFFF"/>
+            <w:noWrap/>
+            <w:vAlign w:val="center"/>
+          </w:tcPr>
+          <w:p>
+            <w:pPr>
+              <w:keepNext w:val="0"/>
+              <w:keepLines w:val="0"/>
+              <w:widowControl/>
+              <w:suppressLineNumbers w:val="0"/>
+              <w:jc w:val="center"/>
+              <w:textAlignment w:val="center"/>
+              <w:rPr>
+                <w:rFonts w:hint="eastAsia" w:ascii="宋体" w:hAnsi="宋体" w:eastAsia="宋体" w:cs="宋体"/>
+                <w:b w:val="0"/>
+                <w:i w:val="0"/>
+                <w:iCs w:val="0"/>
+                <w:color w:val="000000"/>
+                <w:sz w:val="18"/>
+                <w:szCs w:val="18"/>
+                <w:u w:val="none"/>
+              </w:rPr>
+            </w:pPr>
+            <w:r>
+              <w:rPr>
+                <w:rFonts w:hint="eastAsia" w:ascii="宋体" w:hAnsi="宋体" w:eastAsia="宋体" w:cs="宋体"/>
+                <w:b w:val="0"/>
+                <w:i w:val="0"/>
+                <w:iCs w:val="0"/>
+                <w:color w:val="000000"/>
+                <w:kern w:val="0"/>
+                <w:sz w:val="18"/>
+                <w:szCs w:val="18"/>
+                <w:u w:val="none"/>
+                <w:bdr w:val="none" w:color="auto" w:sz="0" w:space="0"/>
+                <w:lang w:val="en-US" w:eastAsia="zh-CN" w:bidi="ar"/>
+              </w:rPr>
+              <w:t>1.667</w:t>
+            </w:r>
+          </w:p>
+        </w:tc>
+        <w:tc>
+          <w:tcPr>
+            <w:tcW w:w="549" w:type="pct"/>
+            <w:tcBorders>
+              <w:top w:val="single" w:color="000000" w:sz="4" w:space="0"/>
+              <w:left w:val="nil"/>
+              <w:bottom w:val="nil"/>
+              <w:right w:val="nil"/>
+            </w:tcBorders>
+            <w:shd w:val="clear" w:color="auto" w:fill="FFFFFF"/>
+            <w:noWrap/>
+            <w:vAlign w:val="center"/>
+          </w:tcPr>
+          <w:p>
+            <w:pPr>
+              <w:keepNext w:val="0"/>
+              <w:keepLines w:val="0"/>
+              <w:widowControl/>
+              <w:suppressLineNumbers w:val="0"/>
+              <w:jc w:val="center"/>
+              <w:textAlignment w:val="center"/>
+              <w:rPr>
+                <w:rFonts w:hint="eastAsia" w:ascii="宋体" w:hAnsi="宋体" w:eastAsia="宋体" w:cs="宋体"/>
+                <w:b w:val="0"/>
+                <w:i w:val="0"/>
+                <w:iCs w:val="0"/>
+                <w:color w:val="000000"/>
+                <w:sz w:val="18"/>
+                <w:szCs w:val="18"/>
+                <w:u w:val="none"/>
+              </w:rPr>
+            </w:pPr>
+            <w:r>
+              <w:rPr>
+                <w:rFonts w:hint="eastAsia" w:ascii="宋体" w:hAnsi="宋体" w:eastAsia="宋体" w:cs="宋体"/>
+                <w:b w:val="0"/>
+                <w:i w:val="0"/>
+                <w:iCs w:val="0"/>
+                <w:color w:val="000000"/>
+                <w:kern w:val="0"/>
+                <w:sz w:val="18"/>
+                <w:szCs w:val="18"/>
+                <w:u w:val="none"/>
+                <w:bdr w:val="none" w:color="auto" w:sz="0" w:space="0"/>
+                <w:lang w:val="en-US" w:eastAsia="zh-CN" w:bidi="ar"/>
+              </w:rPr>
+              <w:t>98.333</w:t>
+            </w:r>
+          </w:p>
+        </w:tc>
+      </w:tr>
+      <w:tr>
+        <w:trPr>
+          <w:trHeight w:val="352" w:hRule="atLeast"/>
+        </w:trPr>
+        <w:tc>
+          <w:tcPr>
+            <w:tcW w:w="527" w:type="pct"/>
+            <w:tcBorders>
+              <w:top w:val="nil"/>
+              <w:left w:val="nil"/>
+              <w:bottom w:val="nil"/>
+              <w:right w:val="nil"/>
+            </w:tcBorders>
+            <w:shd w:val="clear" w:color="auto" w:fill="FFFFFF"/>
+            <w:noWrap/>
+            <w:vAlign w:val="center"/>
+          </w:tcPr>
+          <w:p>
+            <w:pPr>
+              <w:keepNext w:val="0"/>
+              <w:keepLines w:val="0"/>
+              <w:widowControl/>
+              <w:suppressLineNumbers w:val="0"/>
+              <w:jc w:val="center"/>
+              <w:textAlignment w:val="center"/>
+              <w:rPr>
+                <w:rFonts w:hint="eastAsia" w:ascii="宋体" w:hAnsi="宋体" w:eastAsia="宋体" w:cs="宋体"/>
+                <w:b w:val="0"/>
+                <w:i w:val="0"/>
+                <w:iCs w:val="0"/>
+                <w:color w:val="000000"/>
+                <w:sz w:val="18"/>
+                <w:szCs w:val="18"/>
+                <w:u w:val="none"/>
+              </w:rPr>
+            </w:pPr>
+            <w:r>
+              <w:rPr>
+                <w:rFonts w:hint="eastAsia" w:ascii="宋体" w:hAnsi="宋体" w:eastAsia="宋体" w:cs="宋体"/>
+                <w:b w:val="0"/>
+                <w:i w:val="0"/>
+                <w:iCs w:val="0"/>
+                <w:color w:val="000000"/>
+                <w:kern w:val="0"/>
+                <w:sz w:val="18"/>
+                <w:szCs w:val="18"/>
+                <w:u w:val="none"/>
+                <w:bdr w:val="none" w:color="auto" w:sz="0" w:space="0"/>
+                <w:lang w:val="en-US" w:eastAsia="zh-CN" w:bidi="ar"/>
+              </w:rPr>
+              <w:t>1.913</w:t>
+            </w:r>
+          </w:p>
+        </w:tc>
+        <w:tc>
+          <w:tcPr>
+            <w:tcW w:w="527" w:type="pct"/>
+            <w:tcBorders>
+              <w:top w:val="nil"/>
+              <w:left w:val="nil"/>
+              <w:bottom w:val="nil"/>
+              <w:right w:val="nil"/>
+            </w:tcBorders>
+            <w:shd w:val="clear" w:color="auto" w:fill="FFFFFF"/>
+            <w:noWrap/>
+            <w:vAlign w:val="center"/>
+          </w:tcPr>
+          <w:p>
+            <w:pPr>
+              <w:keepNext w:val="0"/>
+              <w:keepLines w:val="0"/>
+              <w:widowControl/>
+              <w:suppressLineNumbers w:val="0"/>
+              <w:jc w:val="center"/>
+              <w:textAlignment w:val="center"/>
+              <w:rPr>
+                <w:rFonts w:hint="eastAsia" w:ascii="宋体" w:hAnsi="宋体" w:eastAsia="宋体" w:cs="宋体"/>
+                <w:b w:val="0"/>
+                <w:i w:val="0"/>
+                <w:iCs w:val="0"/>
+                <w:color w:val="000000"/>
+                <w:sz w:val="18"/>
+                <w:szCs w:val="18"/>
+                <w:u w:val="none"/>
+              </w:rPr>
+            </w:pPr>
+            <w:r>
+              <w:rPr>
+                <w:rFonts w:hint="eastAsia" w:ascii="宋体" w:hAnsi="宋体" w:eastAsia="宋体" w:cs="宋体"/>
+                <w:b w:val="0"/>
+                <w:i w:val="0"/>
+                <w:iCs w:val="0"/>
+                <w:color w:val="000000"/>
+                <w:kern w:val="0"/>
+                <w:sz w:val="18"/>
+                <w:szCs w:val="18"/>
+                <w:u w:val="none"/>
+                <w:bdr w:val="none" w:color="auto" w:sz="0" w:space="0"/>
+                <w:lang w:val="en-US" w:eastAsia="zh-CN" w:bidi="ar"/>
+              </w:rPr>
+              <w:t>8.223</w:t>
+            </w:r>
+          </w:p>
+        </w:tc>
+        <w:tc>
+          <w:tcPr>
+            <w:tcW w:w="527" w:type="pct"/>
+            <w:tcBorders>
+              <w:top w:val="nil"/>
+              <w:left w:val="nil"/>
+              <w:bottom w:val="nil"/>
+              <w:right w:val="nil"/>
+            </w:tcBorders>
+            <w:shd w:val="clear" w:color="auto" w:fill="FFFFFF"/>
+            <w:noWrap/>
+            <w:vAlign w:val="center"/>
+          </w:tcPr>
+          <w:p>
+            <w:pPr>
+              <w:keepNext w:val="0"/>
+              <w:keepLines w:val="0"/>
+              <w:widowControl/>
+              <w:suppressLineNumbers w:val="0"/>
+              <w:jc w:val="center"/>
+              <w:textAlignment w:val="center"/>
+              <w:rPr>
+                <w:rFonts w:hint="eastAsia" w:ascii="宋体" w:hAnsi="宋体" w:eastAsia="宋体" w:cs="宋体"/>
+                <w:b w:val="0"/>
+                <w:i w:val="0"/>
+                <w:iCs w:val="0"/>
+                <w:color w:val="000000"/>
+                <w:sz w:val="18"/>
+                <w:szCs w:val="18"/>
+                <w:u w:val="none"/>
+              </w:rPr>
+            </w:pPr>
+            <w:r>
+              <w:rPr>
+                <w:rFonts w:hint="eastAsia" w:ascii="宋体" w:hAnsi="宋体" w:eastAsia="宋体" w:cs="宋体"/>
+                <w:b w:val="0"/>
+                <w:i w:val="0"/>
+                <w:iCs w:val="0"/>
+                <w:color w:val="000000"/>
+                <w:kern w:val="0"/>
+                <w:sz w:val="18"/>
+                <w:szCs w:val="18"/>
+                <w:u w:val="none"/>
+                <w:bdr w:val="none" w:color="auto" w:sz="0" w:space="0"/>
+                <w:lang w:val="en-US" w:eastAsia="zh-CN" w:bidi="ar"/>
+              </w:rPr>
+              <w:t>0.054</w:t>
+            </w:r>
+          </w:p>
+        </w:tc>
+        <w:tc>
+          <w:tcPr>
+            <w:tcW w:w="527" w:type="pct"/>
+            <w:tcBorders>
+              <w:top w:val="nil"/>
+              <w:left w:val="nil"/>
+              <w:bottom w:val="nil"/>
+              <w:right w:val="nil"/>
+            </w:tcBorders>
+            <w:shd w:val="clear" w:color="auto" w:fill="FFFFFF"/>
+            <w:noWrap/>
+            <w:vAlign w:val="center"/>
+          </w:tcPr>
+          <w:p>
+            <w:pPr>
+              <w:keepNext w:val="0"/>
+              <w:keepLines w:val="0"/>
+              <w:widowControl/>
+              <w:suppressLineNumbers w:val="0"/>
+              <w:jc w:val="center"/>
+              <w:textAlignment w:val="center"/>
+              <w:rPr>
+                <w:rFonts w:hint="eastAsia" w:ascii="宋体" w:hAnsi="宋体" w:eastAsia="宋体" w:cs="宋体"/>
+                <w:b w:val="0"/>
+                <w:i w:val="0"/>
+                <w:iCs w:val="0"/>
+                <w:color w:val="000000"/>
+                <w:sz w:val="18"/>
+                <w:szCs w:val="18"/>
+                <w:u w:val="none"/>
+              </w:rPr>
+            </w:pPr>
+            <w:r>
+              <w:rPr>
+                <w:rFonts w:hint="eastAsia" w:ascii="宋体" w:hAnsi="宋体" w:eastAsia="宋体" w:cs="宋体"/>
+                <w:b w:val="0"/>
+                <w:i w:val="0"/>
+                <w:iCs w:val="0"/>
+                <w:color w:val="000000"/>
+                <w:kern w:val="0"/>
+                <w:sz w:val="18"/>
+                <w:szCs w:val="18"/>
+                <w:u w:val="none"/>
+                <w:bdr w:val="none" w:color="auto" w:sz="0" w:space="0"/>
+                <w:lang w:val="en-US" w:eastAsia="zh-CN" w:bidi="ar"/>
+              </w:rPr>
+              <w:t>0.027</w:t>
+            </w:r>
+          </w:p>
+        </w:tc>
+        <w:tc>
+          <w:tcPr>
+            <w:tcW w:w="527" w:type="pct"/>
+            <w:tcBorders>
+              <w:top w:val="nil"/>
+              <w:left w:val="nil"/>
+              <w:bottom w:val="nil"/>
+              <w:right w:val="nil"/>
+            </w:tcBorders>
+            <w:shd w:val="clear" w:color="auto" w:fill="FFFFFF"/>
+            <w:noWrap/>
+            <w:vAlign w:val="center"/>
+          </w:tcPr>
+          <w:p>
+            <w:pPr>
+              <w:keepNext w:val="0"/>
+              <w:keepLines w:val="0"/>
+              <w:widowControl/>
+              <w:suppressLineNumbers w:val="0"/>
+              <w:jc w:val="center"/>
+              <w:textAlignment w:val="center"/>
+              <w:rPr>
+                <w:rFonts w:hint="eastAsia" w:ascii="宋体" w:hAnsi="宋体" w:eastAsia="宋体" w:cs="宋体"/>
+                <w:b w:val="0"/>
+                <w:i w:val="0"/>
+                <w:iCs w:val="0"/>
+                <w:color w:val="000000"/>
+                <w:sz w:val="18"/>
+                <w:szCs w:val="18"/>
+                <w:u w:val="none"/>
+              </w:rPr>
+            </w:pPr>
+            <w:r>
+              <w:rPr>
+                <w:rFonts w:hint="eastAsia" w:ascii="宋体" w:hAnsi="宋体" w:eastAsia="宋体" w:cs="宋体"/>
+                <w:b w:val="0"/>
+                <w:i w:val="0"/>
+                <w:iCs w:val="0"/>
+                <w:color w:val="000000"/>
+                <w:kern w:val="0"/>
+                <w:sz w:val="18"/>
+                <w:szCs w:val="18"/>
+                <w:u w:val="none"/>
+                <w:bdr w:val="none" w:color="auto" w:sz="0" w:space="0"/>
+                <w:lang w:val="en-US" w:eastAsia="zh-CN" w:bidi="ar"/>
+              </w:rPr>
+              <w:t>2.003</w:t>
+            </w:r>
+          </w:p>
+        </w:tc>
+        <w:tc>
+          <w:tcPr>
+            <w:tcW w:w="527" w:type="pct"/>
+            <w:tcBorders>
+              <w:top w:val="nil"/>
+              <w:left w:val="nil"/>
+              <w:bottom w:val="nil"/>
+              <w:right w:val="nil"/>
+            </w:tcBorders>
+            <w:shd w:val="clear" w:color="auto" w:fill="FFFFFF"/>
+            <w:noWrap/>
+            <w:vAlign w:val="center"/>
+          </w:tcPr>
+          <w:p>
+            <w:pPr>
+              <w:keepNext w:val="0"/>
+              <w:keepLines w:val="0"/>
+              <w:widowControl/>
+              <w:suppressLineNumbers w:val="0"/>
+              <w:jc w:val="center"/>
+              <w:textAlignment w:val="center"/>
+              <w:rPr>
+                <w:rFonts w:hint="eastAsia" w:ascii="宋体" w:hAnsi="宋体" w:eastAsia="宋体" w:cs="宋体"/>
+                <w:b w:val="0"/>
+                <w:i w:val="0"/>
+                <w:iCs w:val="0"/>
+                <w:color w:val="000000"/>
+                <w:sz w:val="18"/>
+                <w:szCs w:val="18"/>
+                <w:u w:val="none"/>
+              </w:rPr>
+            </w:pPr>
+            <w:r>
+              <w:rPr>
+                <w:rFonts w:hint="eastAsia" w:ascii="宋体" w:hAnsi="宋体" w:eastAsia="宋体" w:cs="宋体"/>
+                <w:b w:val="0"/>
+                <w:i w:val="0"/>
+                <w:iCs w:val="0"/>
+                <w:color w:val="000000"/>
+                <w:kern w:val="0"/>
+                <w:sz w:val="18"/>
+                <w:szCs w:val="18"/>
+                <w:u w:val="none"/>
+                <w:bdr w:val="none" w:color="auto" w:sz="0" w:space="0"/>
+                <w:lang w:val="en-US" w:eastAsia="zh-CN" w:bidi="ar"/>
+              </w:rPr>
+              <w:t>0.050</w:t>
+            </w:r>
+          </w:p>
+        </w:tc>
+        <w:tc>
+          <w:tcPr>
+            <w:tcW w:w="716" w:type="pct"/>
+            <w:tcBorders>
+              <w:top w:val="nil"/>
+              <w:left w:val="nil"/>
+              <w:bottom w:val="nil"/>
+              <w:right w:val="nil"/>
+            </w:tcBorders>
+            <w:shd w:val="clear" w:color="auto" w:fill="FFFFFF"/>
+            <w:noWrap/>
+            <w:vAlign w:val="center"/>
+          </w:tcPr>
+          <w:p>
+            <w:pPr>
+              <w:keepNext w:val="0"/>
+              <w:keepLines w:val="0"/>
+              <w:widowControl/>
+              <w:suppressLineNumbers w:val="0"/>
+              <w:jc w:val="center"/>
+              <w:textAlignment w:val="center"/>
+              <w:rPr>
+                <w:rFonts w:hint="eastAsia" w:ascii="宋体" w:hAnsi="宋体" w:eastAsia="宋体" w:cs="宋体"/>
+                <w:b w:val="0"/>
+                <w:i w:val="0"/>
+                <w:iCs w:val="0"/>
+                <w:color w:val="000000"/>
+                <w:sz w:val="18"/>
+                <w:szCs w:val="18"/>
+                <w:u w:val="none"/>
+              </w:rPr>
+            </w:pPr>
+            <w:r>
+              <w:rPr>
+                <w:rFonts w:hint="eastAsia" w:ascii="宋体" w:hAnsi="宋体" w:eastAsia="宋体" w:cs="宋体"/>
+                <w:b w:val="0"/>
+                <w:i w:val="0"/>
+                <w:iCs w:val="0"/>
+                <w:color w:val="000000"/>
+                <w:kern w:val="0"/>
+                <w:sz w:val="18"/>
+                <w:szCs w:val="18"/>
+                <w:u w:val="none"/>
+                <w:bdr w:val="none" w:color="auto" w:sz="0" w:space="0"/>
+                <w:lang w:val="en-US" w:eastAsia="zh-CN" w:bidi="ar"/>
+              </w:rPr>
+              <w:t>[0</w:t>
+            </w:r>
+            <w:r>
+              <w:rPr>
+                <w:rFonts w:hint="default" w:ascii="宋体" w:hAnsi="宋体" w:eastAsia="宋体" w:cs="宋体"/>
+                <w:b w:val="0"/>
+                <w:i w:val="0"/>
+                <w:iCs w:val="0"/>
+                <w:color w:val="000000"/>
+                <w:kern w:val="0"/>
+                <w:sz w:val="18"/>
+                <w:szCs w:val="18"/>
+                <w:u w:val="none"/>
+                <w:bdr w:val="none" w:color="auto" w:sz="0" w:space="0"/>
+                <w:lang w:val="en-US" w:eastAsia="zh-CN" w:bidi="ar"/>
+              </w:rPr>
+              <w:t>.000</w:t>
+            </w:r>
+            <w:r>
+              <w:rPr>
+                <w:rFonts w:hint="eastAsia" w:ascii="宋体" w:hAnsi="宋体" w:eastAsia="宋体" w:cs="宋体"/>
+                <w:b w:val="0"/>
+                <w:i w:val="0"/>
+                <w:iCs w:val="0"/>
+                <w:color w:val="000000"/>
+                <w:kern w:val="0"/>
+                <w:sz w:val="18"/>
+                <w:szCs w:val="18"/>
+                <w:u w:val="none"/>
+                <w:bdr w:val="none" w:color="auto" w:sz="0" w:space="0"/>
+                <w:lang w:val="en-US" w:eastAsia="zh-CN" w:bidi="ar"/>
+              </w:rPr>
+              <w:t>,0.108]</w:t>
+            </w:r>
+          </w:p>
+        </w:tc>
+        <w:tc>
+          <w:tcPr>
+            <w:tcW w:w="567" w:type="pct"/>
+            <w:tcBorders>
+              <w:top w:val="nil"/>
+              <w:left w:val="nil"/>
+              <w:bottom w:val="nil"/>
+              <w:right w:val="nil"/>
+            </w:tcBorders>
+            <w:shd w:val="clear" w:color="auto" w:fill="FFFFFF"/>
+            <w:noWrap/>
+            <w:vAlign w:val="center"/>
+          </w:tcPr>
+          <w:p>
+            <w:pPr>
+              <w:keepNext w:val="0"/>
+              <w:keepLines w:val="0"/>
+              <w:widowControl/>
+              <w:suppressLineNumbers w:val="0"/>
+              <w:jc w:val="center"/>
+              <w:textAlignment w:val="center"/>
+              <w:rPr>
+                <w:rFonts w:hint="eastAsia" w:ascii="宋体" w:hAnsi="宋体" w:eastAsia="宋体" w:cs="宋体"/>
+                <w:b w:val="0"/>
+                <w:i w:val="0"/>
+                <w:iCs w:val="0"/>
+                <w:color w:val="000000"/>
+                <w:sz w:val="18"/>
+                <w:szCs w:val="18"/>
+                <w:u w:val="none"/>
+              </w:rPr>
+            </w:pPr>
+            <w:r>
+              <w:rPr>
+                <w:rFonts w:hint="eastAsia" w:ascii="宋体" w:hAnsi="宋体" w:eastAsia="宋体" w:cs="宋体"/>
+                <w:b w:val="0"/>
+                <w:i w:val="0"/>
+                <w:iCs w:val="0"/>
+                <w:color w:val="000000"/>
+                <w:kern w:val="0"/>
+                <w:sz w:val="18"/>
+                <w:szCs w:val="18"/>
+                <w:u w:val="none"/>
+                <w:bdr w:val="none" w:color="auto" w:sz="0" w:space="0"/>
+                <w:lang w:val="en-US" w:eastAsia="zh-CN" w:bidi="ar"/>
+              </w:rPr>
+              <w:t>81.667</w:t>
+            </w:r>
+          </w:p>
+        </w:tc>
+        <w:tc>
+          <w:tcPr>
+            <w:tcW w:w="549" w:type="pct"/>
+            <w:tcBorders>
+              <w:top w:val="nil"/>
+              <w:left w:val="nil"/>
+              <w:bottom w:val="nil"/>
+              <w:right w:val="nil"/>
+            </w:tcBorders>
+            <w:shd w:val="clear" w:color="auto" w:fill="FFFFFF"/>
+            <w:noWrap/>
+            <w:vAlign w:val="center"/>
+          </w:tcPr>
+          <w:p>
+            <w:pPr>
+              <w:keepNext w:val="0"/>
+              <w:keepLines w:val="0"/>
+              <w:widowControl/>
+              <w:suppressLineNumbers w:val="0"/>
+              <w:jc w:val="center"/>
+              <w:textAlignment w:val="center"/>
+              <w:rPr>
+                <w:rFonts w:hint="eastAsia" w:ascii="宋体" w:hAnsi="宋体" w:eastAsia="宋体" w:cs="宋体"/>
+                <w:b w:val="0"/>
+                <w:i w:val="0"/>
+                <w:iCs w:val="0"/>
+                <w:color w:val="000000"/>
+                <w:sz w:val="18"/>
+                <w:szCs w:val="18"/>
+                <w:u w:val="none"/>
+              </w:rPr>
+            </w:pPr>
+            <w:r>
+              <w:rPr>
+                <w:rFonts w:hint="eastAsia" w:ascii="宋体" w:hAnsi="宋体" w:eastAsia="宋体" w:cs="宋体"/>
+                <w:b w:val="0"/>
+                <w:i w:val="0"/>
+                <w:iCs w:val="0"/>
+                <w:color w:val="000000"/>
+                <w:kern w:val="0"/>
+                <w:sz w:val="18"/>
+                <w:szCs w:val="18"/>
+                <w:u w:val="none"/>
+                <w:bdr w:val="none" w:color="auto" w:sz="0" w:space="0"/>
+                <w:lang w:val="en-US" w:eastAsia="zh-CN" w:bidi="ar"/>
+              </w:rPr>
+              <w:t>18.333</w:t>
+            </w:r>
+          </w:p>
+        </w:tc>
+      </w:tr>
+      <w:tr>
+        <w:trPr>
+          <w:trHeight w:val="352" w:hRule="atLeast"/>
+        </w:trPr>
+        <w:tc>
+          <w:tcPr>
+            <w:tcW w:w="527" w:type="pct"/>
+            <w:tcBorders>
+              <w:top w:val="nil"/>
+              <w:left w:val="nil"/>
+              <w:bottom w:val="nil"/>
+              <w:right w:val="nil"/>
+            </w:tcBorders>
+            <w:shd w:val="clear" w:color="auto" w:fill="FFFFFF"/>
+            <w:noWrap/>
+            <w:vAlign w:val="center"/>
+          </w:tcPr>
+          <w:p>
+            <w:pPr>
+              <w:keepNext w:val="0"/>
+              <w:keepLines w:val="0"/>
+              <w:widowControl/>
+              <w:suppressLineNumbers w:val="0"/>
+              <w:jc w:val="center"/>
+              <w:textAlignment w:val="center"/>
+              <w:rPr>
+                <w:rFonts w:hint="eastAsia" w:ascii="宋体" w:hAnsi="宋体" w:eastAsia="宋体" w:cs="宋体"/>
+                <w:b w:val="0"/>
+                <w:i w:val="0"/>
+                <w:iCs w:val="0"/>
+                <w:color w:val="000000"/>
+                <w:sz w:val="18"/>
+                <w:szCs w:val="18"/>
+                <w:u w:val="none"/>
+              </w:rPr>
+            </w:pPr>
+            <w:r>
+              <w:rPr>
+                <w:rFonts w:hint="eastAsia" w:ascii="宋体" w:hAnsi="宋体" w:eastAsia="宋体" w:cs="宋体"/>
+                <w:b w:val="0"/>
+                <w:i w:val="0"/>
+                <w:iCs w:val="0"/>
+                <w:color w:val="000000"/>
+                <w:kern w:val="0"/>
+                <w:sz w:val="18"/>
+                <w:szCs w:val="18"/>
+                <w:u w:val="none"/>
+                <w:bdr w:val="none" w:color="auto" w:sz="0" w:space="0"/>
+                <w:lang w:val="en-US" w:eastAsia="zh-CN" w:bidi="ar"/>
+              </w:rPr>
+              <w:t>2.093</w:t>
+            </w:r>
+          </w:p>
+        </w:tc>
+        <w:tc>
+          <w:tcPr>
+            <w:tcW w:w="527" w:type="pct"/>
+            <w:tcBorders>
+              <w:top w:val="nil"/>
+              <w:left w:val="nil"/>
+              <w:bottom w:val="nil"/>
+              <w:right w:val="nil"/>
+            </w:tcBorders>
+            <w:shd w:val="clear" w:color="auto" w:fill="FFFFFF"/>
+            <w:noWrap/>
+            <w:vAlign w:val="center"/>
+          </w:tcPr>
+          <w:p>
+            <w:pPr>
+              <w:keepNext w:val="0"/>
+              <w:keepLines w:val="0"/>
+              <w:widowControl/>
+              <w:suppressLineNumbers w:val="0"/>
+              <w:jc w:val="center"/>
+              <w:textAlignment w:val="center"/>
+              <w:rPr>
+                <w:rFonts w:hint="eastAsia" w:ascii="宋体" w:hAnsi="宋体" w:eastAsia="宋体" w:cs="宋体"/>
+                <w:b w:val="0"/>
+                <w:i w:val="0"/>
+                <w:iCs w:val="0"/>
+                <w:color w:val="000000"/>
+                <w:sz w:val="18"/>
+                <w:szCs w:val="18"/>
+                <w:u w:val="none"/>
+              </w:rPr>
+            </w:pPr>
+            <w:r>
+              <w:rPr>
+                <w:rFonts w:hint="eastAsia" w:ascii="宋体" w:hAnsi="宋体" w:eastAsia="宋体" w:cs="宋体"/>
+                <w:b w:val="0"/>
+                <w:i w:val="0"/>
+                <w:iCs w:val="0"/>
+                <w:color w:val="000000"/>
+                <w:kern w:val="0"/>
+                <w:sz w:val="18"/>
+                <w:szCs w:val="18"/>
+                <w:u w:val="none"/>
+                <w:bdr w:val="none" w:color="auto" w:sz="0" w:space="0"/>
+                <w:lang w:val="en-US" w:eastAsia="zh-CN" w:bidi="ar"/>
+              </w:rPr>
+              <w:t>8.403</w:t>
+            </w:r>
+          </w:p>
+        </w:tc>
+        <w:tc>
+          <w:tcPr>
+            <w:tcW w:w="527" w:type="pct"/>
+            <w:tcBorders>
+              <w:top w:val="nil"/>
+              <w:left w:val="nil"/>
+              <w:bottom w:val="nil"/>
+              <w:right w:val="nil"/>
+            </w:tcBorders>
+            <w:shd w:val="clear" w:color="auto" w:fill="FFFFFF"/>
+            <w:noWrap/>
+            <w:vAlign w:val="center"/>
+          </w:tcPr>
+          <w:p>
+            <w:pPr>
+              <w:keepNext w:val="0"/>
+              <w:keepLines w:val="0"/>
+              <w:widowControl/>
+              <w:suppressLineNumbers w:val="0"/>
+              <w:jc w:val="center"/>
+              <w:textAlignment w:val="center"/>
+              <w:rPr>
+                <w:rFonts w:hint="eastAsia" w:ascii="宋体" w:hAnsi="宋体" w:eastAsia="宋体" w:cs="宋体"/>
+                <w:b w:val="0"/>
+                <w:i w:val="0"/>
+                <w:iCs w:val="0"/>
+                <w:color w:val="000000"/>
+                <w:sz w:val="18"/>
+                <w:szCs w:val="18"/>
+                <w:u w:val="none"/>
+              </w:rPr>
+            </w:pPr>
+            <w:r>
+              <w:rPr>
+                <w:rFonts w:hint="eastAsia" w:ascii="宋体" w:hAnsi="宋体" w:eastAsia="宋体" w:cs="宋体"/>
+                <w:b w:val="0"/>
+                <w:i w:val="0"/>
+                <w:iCs w:val="0"/>
+                <w:color w:val="000000"/>
+                <w:kern w:val="0"/>
+                <w:sz w:val="18"/>
+                <w:szCs w:val="18"/>
+                <w:u w:val="none"/>
+                <w:bdr w:val="none" w:color="auto" w:sz="0" w:space="0"/>
+                <w:lang w:val="en-US" w:eastAsia="zh-CN" w:bidi="ar"/>
+              </w:rPr>
+              <w:t>-0.057</w:t>
+            </w:r>
+          </w:p>
+        </w:tc>
+        <w:tc>
+          <w:tcPr>
+            <w:tcW w:w="527" w:type="pct"/>
+            <w:tcBorders>
+              <w:top w:val="nil"/>
+              <w:left w:val="nil"/>
+              <w:bottom w:val="nil"/>
+              <w:right w:val="nil"/>
+            </w:tcBorders>
+            <w:shd w:val="clear" w:color="auto" w:fill="FFFFFF"/>
+            <w:noWrap/>
+            <w:vAlign w:val="center"/>
+          </w:tcPr>
+          <w:p>
+            <w:pPr>
+              <w:keepNext w:val="0"/>
+              <w:keepLines w:val="0"/>
+              <w:widowControl/>
+              <w:suppressLineNumbers w:val="0"/>
+              <w:jc w:val="center"/>
+              <w:textAlignment w:val="center"/>
+              <w:rPr>
+                <w:rFonts w:hint="eastAsia" w:ascii="宋体" w:hAnsi="宋体" w:eastAsia="宋体" w:cs="宋体"/>
+                <w:b w:val="0"/>
+                <w:i w:val="0"/>
+                <w:iCs w:val="0"/>
+                <w:color w:val="000000"/>
+                <w:sz w:val="18"/>
+                <w:szCs w:val="18"/>
+                <w:u w:val="none"/>
+              </w:rPr>
+            </w:pPr>
+            <w:r>
+              <w:rPr>
+                <w:rFonts w:hint="eastAsia" w:ascii="宋体" w:hAnsi="宋体" w:eastAsia="宋体" w:cs="宋体"/>
+                <w:b w:val="0"/>
+                <w:i w:val="0"/>
+                <w:iCs w:val="0"/>
+                <w:color w:val="000000"/>
+                <w:kern w:val="0"/>
+                <w:sz w:val="18"/>
+                <w:szCs w:val="18"/>
+                <w:u w:val="none"/>
+                <w:bdr w:val="none" w:color="auto" w:sz="0" w:space="0"/>
+                <w:lang w:val="en-US" w:eastAsia="zh-CN" w:bidi="ar"/>
+              </w:rPr>
+              <w:t>0.028</w:t>
+            </w:r>
+          </w:p>
+        </w:tc>
+        <w:tc>
+          <w:tcPr>
+            <w:tcW w:w="527" w:type="pct"/>
+            <w:tcBorders>
+              <w:top w:val="nil"/>
+              <w:left w:val="nil"/>
+              <w:bottom w:val="nil"/>
+              <w:right w:val="nil"/>
+            </w:tcBorders>
+            <w:shd w:val="clear" w:color="auto" w:fill="FFFFFF"/>
+            <w:noWrap/>
+            <w:vAlign w:val="center"/>
+          </w:tcPr>
+          <w:p>
+            <w:pPr>
+              <w:keepNext w:val="0"/>
+              <w:keepLines w:val="0"/>
+              <w:widowControl/>
+              <w:suppressLineNumbers w:val="0"/>
+              <w:jc w:val="center"/>
+              <w:textAlignment w:val="center"/>
+              <w:rPr>
+                <w:rFonts w:hint="eastAsia" w:ascii="宋体" w:hAnsi="宋体" w:eastAsia="宋体" w:cs="宋体"/>
+                <w:b w:val="0"/>
+                <w:i w:val="0"/>
+                <w:iCs w:val="0"/>
+                <w:color w:val="000000"/>
+                <w:sz w:val="18"/>
+                <w:szCs w:val="18"/>
+                <w:u w:val="none"/>
+              </w:rPr>
+            </w:pPr>
+            <w:r>
+              <w:rPr>
+                <w:rFonts w:hint="eastAsia" w:ascii="宋体" w:hAnsi="宋体" w:eastAsia="宋体" w:cs="宋体"/>
+                <w:b w:val="0"/>
+                <w:i w:val="0"/>
+                <w:iCs w:val="0"/>
+                <w:color w:val="000000"/>
+                <w:kern w:val="0"/>
+                <w:sz w:val="18"/>
+                <w:szCs w:val="18"/>
+                <w:u w:val="none"/>
+                <w:bdr w:val="none" w:color="auto" w:sz="0" w:space="0"/>
+                <w:lang w:val="en-US" w:eastAsia="zh-CN" w:bidi="ar"/>
+              </w:rPr>
+              <w:t>-2.003</w:t>
+            </w:r>
+          </w:p>
+        </w:tc>
+        <w:tc>
+          <w:tcPr>
+            <w:tcW w:w="527" w:type="pct"/>
+            <w:tcBorders>
+              <w:top w:val="nil"/>
+              <w:left w:val="nil"/>
+              <w:bottom w:val="nil"/>
+              <w:right w:val="nil"/>
+            </w:tcBorders>
+            <w:shd w:val="clear" w:color="auto" w:fill="FFFFFF"/>
+            <w:noWrap/>
+            <w:vAlign w:val="center"/>
+          </w:tcPr>
+          <w:p>
+            <w:pPr>
+              <w:keepNext w:val="0"/>
+              <w:keepLines w:val="0"/>
+              <w:widowControl/>
+              <w:suppressLineNumbers w:val="0"/>
+              <w:jc w:val="center"/>
+              <w:textAlignment w:val="center"/>
+              <w:rPr>
+                <w:rFonts w:hint="eastAsia" w:ascii="宋体" w:hAnsi="宋体" w:eastAsia="宋体" w:cs="宋体"/>
+                <w:b w:val="0"/>
+                <w:i w:val="0"/>
+                <w:iCs w:val="0"/>
+                <w:color w:val="000000"/>
+                <w:sz w:val="18"/>
+                <w:szCs w:val="18"/>
+                <w:u w:val="none"/>
+              </w:rPr>
+            </w:pPr>
+            <w:r>
+              <w:rPr>
+                <w:rFonts w:hint="eastAsia" w:ascii="宋体" w:hAnsi="宋体" w:eastAsia="宋体" w:cs="宋体"/>
+                <w:b w:val="0"/>
+                <w:i w:val="0"/>
+                <w:iCs w:val="0"/>
+                <w:color w:val="000000"/>
+                <w:kern w:val="0"/>
+                <w:sz w:val="18"/>
+                <w:szCs w:val="18"/>
+                <w:u w:val="none"/>
+                <w:bdr w:val="none" w:color="auto" w:sz="0" w:space="0"/>
+                <w:lang w:val="en-US" w:eastAsia="zh-CN" w:bidi="ar"/>
+              </w:rPr>
+              <w:t>0.050</w:t>
+            </w:r>
+          </w:p>
+        </w:tc>
+        <w:tc>
+          <w:tcPr>
+            <w:tcW w:w="716" w:type="pct"/>
+            <w:tcBorders>
+              <w:top w:val="nil"/>
+              <w:left w:val="nil"/>
+              <w:bottom w:val="nil"/>
+              <w:right w:val="nil"/>
+            </w:tcBorders>
+            <w:shd w:val="clear" w:color="auto" w:fill="FFFFFF"/>
+            <w:noWrap/>
+            <w:vAlign w:val="center"/>
+          </w:tcPr>
+          <w:p>
+            <w:pPr>
+              <w:keepNext w:val="0"/>
+              <w:keepLines w:val="0"/>
+              <w:widowControl/>
+              <w:suppressLineNumbers w:val="0"/>
+              <w:jc w:val="center"/>
+              <w:textAlignment w:val="center"/>
+              <w:rPr>
+                <w:rFonts w:hint="eastAsia" w:ascii="宋体" w:hAnsi="宋体" w:eastAsia="宋体" w:cs="宋体"/>
+                <w:b w:val="0"/>
+                <w:i w:val="0"/>
+                <w:iCs w:val="0"/>
+                <w:color w:val="000000"/>
+                <w:sz w:val="18"/>
+                <w:szCs w:val="18"/>
+                <w:u w:val="none"/>
+              </w:rPr>
+            </w:pPr>
+            <w:r>
+              <w:rPr>
+                <w:rFonts w:hint="eastAsia" w:ascii="宋体" w:hAnsi="宋体" w:eastAsia="宋体" w:cs="宋体"/>
+                <w:b w:val="0"/>
+                <w:i w:val="0"/>
+                <w:iCs w:val="0"/>
+                <w:color w:val="000000"/>
+                <w:kern w:val="0"/>
+                <w:sz w:val="18"/>
+                <w:szCs w:val="18"/>
+                <w:u w:val="none"/>
+                <w:bdr w:val="none" w:color="auto" w:sz="0" w:space="0"/>
+                <w:lang w:val="en-US" w:eastAsia="zh-CN" w:bidi="ar"/>
+              </w:rPr>
+              <w:t>[-0.114,0</w:t>
+            </w:r>
+            <w:r>
+              <w:rPr>
+                <w:rFonts w:hint="default" w:ascii="宋体" w:hAnsi="宋体" w:eastAsia="宋体" w:cs="宋体"/>
+                <w:b w:val="0"/>
+                <w:i w:val="0"/>
+                <w:iCs w:val="0"/>
+                <w:color w:val="000000"/>
+                <w:kern w:val="0"/>
+                <w:sz w:val="18"/>
+                <w:szCs w:val="18"/>
+                <w:u w:val="none"/>
+                <w:bdr w:val="none" w:color="auto" w:sz="0" w:space="0"/>
+                <w:lang w:val="en-US" w:eastAsia="zh-CN" w:bidi="ar"/>
+              </w:rPr>
+              <w:t>.000</w:t>
+            </w:r>
+            <w:r>
+              <w:rPr>
+                <w:rFonts w:hint="eastAsia" w:ascii="宋体" w:hAnsi="宋体" w:eastAsia="宋体" w:cs="宋体"/>
+                <w:b w:val="0"/>
+                <w:i w:val="0"/>
+                <w:iCs w:val="0"/>
+                <w:color w:val="000000"/>
+                <w:kern w:val="0"/>
+                <w:sz w:val="18"/>
+                <w:szCs w:val="18"/>
+                <w:u w:val="none"/>
+                <w:bdr w:val="none" w:color="auto" w:sz="0" w:space="0"/>
+                <w:lang w:val="en-US" w:eastAsia="zh-CN" w:bidi="ar"/>
+              </w:rPr>
+              <w:t>]</w:t>
+            </w:r>
+          </w:p>
+        </w:tc>
+        <w:tc>
+          <w:tcPr>
+            <w:tcW w:w="567" w:type="pct"/>
+            <w:tcBorders>
+              <w:top w:val="nil"/>
+              <w:left w:val="nil"/>
+              <w:bottom w:val="nil"/>
+              <w:right w:val="nil"/>
+            </w:tcBorders>
+            <w:shd w:val="clear" w:color="auto" w:fill="FFFFFF"/>
+            <w:noWrap/>
+            <w:vAlign w:val="center"/>
+          </w:tcPr>
+          <w:p>
+            <w:pPr>
+              <w:keepNext w:val="0"/>
+              <w:keepLines w:val="0"/>
+              <w:widowControl/>
+              <w:suppressLineNumbers w:val="0"/>
+              <w:jc w:val="center"/>
+              <w:textAlignment w:val="center"/>
+              <w:rPr>
+                <w:rFonts w:hint="eastAsia" w:ascii="宋体" w:hAnsi="宋体" w:eastAsia="宋体" w:cs="宋体"/>
+                <w:b w:val="0"/>
+                <w:i w:val="0"/>
+                <w:iCs w:val="0"/>
+                <w:color w:val="000000"/>
+                <w:sz w:val="18"/>
+                <w:szCs w:val="18"/>
+                <w:u w:val="none"/>
+              </w:rPr>
+            </w:pPr>
+            <w:r>
+              <w:rPr>
+                <w:rFonts w:hint="eastAsia" w:ascii="宋体" w:hAnsi="宋体" w:eastAsia="宋体" w:cs="宋体"/>
+                <w:b w:val="0"/>
+                <w:i w:val="0"/>
+                <w:iCs w:val="0"/>
+                <w:color w:val="000000"/>
+                <w:kern w:val="0"/>
+                <w:sz w:val="18"/>
+                <w:szCs w:val="18"/>
+                <w:u w:val="none"/>
+                <w:bdr w:val="none" w:color="auto" w:sz="0" w:space="0"/>
+                <w:lang w:val="en-US" w:eastAsia="zh-CN" w:bidi="ar"/>
+              </w:rPr>
+              <w:t>83.333</w:t>
+            </w:r>
+          </w:p>
+        </w:tc>
+        <w:tc>
+          <w:tcPr>
+            <w:tcW w:w="549" w:type="pct"/>
+            <w:tcBorders>
+              <w:top w:val="nil"/>
+              <w:left w:val="nil"/>
+              <w:bottom w:val="nil"/>
+              <w:right w:val="nil"/>
+            </w:tcBorders>
+            <w:shd w:val="clear" w:color="auto" w:fill="FFFFFF"/>
+            <w:noWrap/>
+            <w:vAlign w:val="center"/>
+          </w:tcPr>
+          <w:p>
+            <w:pPr>
+              <w:keepNext w:val="0"/>
+              <w:keepLines w:val="0"/>
+              <w:widowControl/>
+              <w:suppressLineNumbers w:val="0"/>
+              <w:jc w:val="center"/>
+              <w:textAlignment w:val="center"/>
+              <w:rPr>
+                <w:rFonts w:hint="eastAsia" w:ascii="宋体" w:hAnsi="宋体" w:eastAsia="宋体" w:cs="宋体"/>
+                <w:b w:val="0"/>
+                <w:i w:val="0"/>
+                <w:iCs w:val="0"/>
+                <w:color w:val="000000"/>
+                <w:sz w:val="18"/>
+                <w:szCs w:val="18"/>
+                <w:u w:val="none"/>
+              </w:rPr>
+            </w:pPr>
+            <w:r>
+              <w:rPr>
+                <w:rFonts w:hint="eastAsia" w:ascii="宋体" w:hAnsi="宋体" w:eastAsia="宋体" w:cs="宋体"/>
+                <w:b w:val="0"/>
+                <w:i w:val="0"/>
+                <w:iCs w:val="0"/>
+                <w:color w:val="000000"/>
+                <w:kern w:val="0"/>
+                <w:sz w:val="18"/>
+                <w:szCs w:val="18"/>
+                <w:u w:val="none"/>
+                <w:bdr w:val="none" w:color="auto" w:sz="0" w:space="0"/>
+                <w:lang w:val="en-US" w:eastAsia="zh-CN" w:bidi="ar"/>
+              </w:rPr>
+              <w:t>16.667</w:t>
+            </w:r>
+          </w:p>
+        </w:tc>
+      </w:tr>
+      <w:tr>
+        <w:trPr>
+          <w:trHeight w:val="352" w:hRule="atLeast"/>
+        </w:trPr>
+        <w:tc>
+          <w:tcPr>
+            <w:tcW w:w="527" w:type="pct"/>
+            <w:tcBorders>
+              <w:top w:val="nil"/>
+              <w:left w:val="nil"/>
+              <w:bottom w:val="single" w:color="000000" w:sz="12" w:space="0"/>
+              <w:right w:val="nil"/>
+            </w:tcBorders>
+            <w:shd w:val="clear" w:color="auto" w:fill="FFFFFF"/>
+            <w:noWrap/>
+            <w:vAlign w:val="center"/>
+          </w:tcPr>
+          <w:p>
+            <w:pPr>
+              <w:keepNext w:val="0"/>
+              <w:keepLines w:val="0"/>
+              <w:widowControl/>
+              <w:suppressLineNumbers w:val="0"/>
+              <w:jc w:val="center"/>
+              <w:textAlignment w:val="center"/>
+              <w:rPr>
+                <w:rFonts w:hint="eastAsia" w:ascii="宋体" w:hAnsi="宋体" w:eastAsia="宋体" w:cs="宋体"/>
+                <w:b w:val="0"/>
+                <w:i w:val="0"/>
+                <w:iCs w:val="0"/>
+                <w:color w:val="000000"/>
+                <w:sz w:val="18"/>
+                <w:szCs w:val="18"/>
+                <w:u w:val="none"/>
+              </w:rPr>
+            </w:pPr>
+            <w:r>
+              <w:rPr>
+                <w:rFonts w:hint="eastAsia" w:ascii="宋体" w:hAnsi="宋体" w:eastAsia="宋体" w:cs="宋体"/>
+                <w:b w:val="0"/>
+                <w:i w:val="0"/>
+                <w:iCs w:val="0"/>
+                <w:color w:val="000000"/>
+                <w:kern w:val="0"/>
+                <w:sz w:val="18"/>
+                <w:szCs w:val="18"/>
+                <w:u w:val="none"/>
+                <w:bdr w:val="none" w:color="auto" w:sz="0" w:space="0"/>
+                <w:lang w:val="en-US" w:eastAsia="zh-CN" w:bidi="ar"/>
+              </w:rPr>
+              <w:t>2.893</w:t>
+            </w:r>
+          </w:p>
+        </w:tc>
+        <w:tc>
+          <w:tcPr>
+            <w:tcW w:w="527" w:type="pct"/>
+            <w:tcBorders>
+              <w:top w:val="nil"/>
+              <w:left w:val="nil"/>
+              <w:bottom w:val="single" w:color="000000" w:sz="12" w:space="0"/>
+              <w:right w:val="nil"/>
+            </w:tcBorders>
+            <w:shd w:val="clear" w:color="auto" w:fill="FFFFFF"/>
+            <w:noWrap/>
+            <w:vAlign w:val="center"/>
+          </w:tcPr>
+          <w:p>
+            <w:pPr>
+              <w:keepNext w:val="0"/>
+              <w:keepLines w:val="0"/>
+              <w:widowControl/>
+              <w:suppressLineNumbers w:val="0"/>
+              <w:jc w:val="center"/>
+              <w:textAlignment w:val="center"/>
+              <w:rPr>
+                <w:rFonts w:hint="eastAsia" w:ascii="宋体" w:hAnsi="宋体" w:eastAsia="宋体" w:cs="宋体"/>
+                <w:b w:val="0"/>
+                <w:i w:val="0"/>
+                <w:iCs w:val="0"/>
+                <w:color w:val="000000"/>
+                <w:sz w:val="18"/>
+                <w:szCs w:val="18"/>
+                <w:u w:val="none"/>
+              </w:rPr>
+            </w:pPr>
+            <w:r>
+              <w:rPr>
+                <w:rFonts w:hint="eastAsia" w:ascii="宋体" w:hAnsi="宋体" w:eastAsia="宋体" w:cs="宋体"/>
+                <w:b w:val="0"/>
+                <w:i w:val="0"/>
+                <w:iCs w:val="0"/>
+                <w:color w:val="000000"/>
+                <w:kern w:val="0"/>
+                <w:sz w:val="18"/>
+                <w:szCs w:val="18"/>
+                <w:u w:val="none"/>
+                <w:bdr w:val="none" w:color="auto" w:sz="0" w:space="0"/>
+                <w:lang w:val="en-US" w:eastAsia="zh-CN" w:bidi="ar"/>
+              </w:rPr>
+              <w:t>9.203</w:t>
+            </w:r>
+          </w:p>
+        </w:tc>
+        <w:tc>
+          <w:tcPr>
+            <w:tcW w:w="527" w:type="pct"/>
+            <w:tcBorders>
+              <w:top w:val="nil"/>
+              <w:left w:val="nil"/>
+              <w:bottom w:val="single" w:color="000000" w:sz="12" w:space="0"/>
+              <w:right w:val="nil"/>
+            </w:tcBorders>
+            <w:shd w:val="clear" w:color="auto" w:fill="FFFFFF"/>
+            <w:noWrap/>
+            <w:vAlign w:val="center"/>
+          </w:tcPr>
+          <w:p>
+            <w:pPr>
+              <w:keepNext w:val="0"/>
+              <w:keepLines w:val="0"/>
+              <w:widowControl/>
+              <w:suppressLineNumbers w:val="0"/>
+              <w:jc w:val="center"/>
+              <w:textAlignment w:val="center"/>
+              <w:rPr>
+                <w:rFonts w:hint="eastAsia" w:ascii="宋体" w:hAnsi="宋体" w:eastAsia="宋体" w:cs="宋体"/>
+                <w:b w:val="0"/>
+                <w:i w:val="0"/>
+                <w:iCs w:val="0"/>
+                <w:color w:val="000000"/>
+                <w:sz w:val="18"/>
+                <w:szCs w:val="18"/>
+                <w:u w:val="none"/>
+              </w:rPr>
+            </w:pPr>
+            <w:r>
+              <w:rPr>
+                <w:rFonts w:hint="eastAsia" w:ascii="宋体" w:hAnsi="宋体" w:eastAsia="宋体" w:cs="宋体"/>
+                <w:b w:val="0"/>
+                <w:i w:val="0"/>
+                <w:iCs w:val="0"/>
+                <w:color w:val="000000"/>
+                <w:kern w:val="0"/>
+                <w:sz w:val="18"/>
+                <w:szCs w:val="18"/>
+                <w:u w:val="none"/>
+                <w:bdr w:val="none" w:color="auto" w:sz="0" w:space="0"/>
+                <w:lang w:val="en-US" w:eastAsia="zh-CN" w:bidi="ar"/>
+              </w:rPr>
+              <w:t>-0.550</w:t>
+            </w:r>
+          </w:p>
+        </w:tc>
+        <w:tc>
+          <w:tcPr>
+            <w:tcW w:w="527" w:type="pct"/>
+            <w:tcBorders>
+              <w:top w:val="nil"/>
+              <w:left w:val="nil"/>
+              <w:bottom w:val="single" w:color="000000" w:sz="12" w:space="0"/>
+              <w:right w:val="nil"/>
+            </w:tcBorders>
+            <w:shd w:val="clear" w:color="auto" w:fill="FFFFFF"/>
+            <w:noWrap/>
+            <w:vAlign w:val="center"/>
+          </w:tcPr>
+          <w:p>
+            <w:pPr>
+              <w:keepNext w:val="0"/>
+              <w:keepLines w:val="0"/>
+              <w:widowControl/>
+              <w:suppressLineNumbers w:val="0"/>
+              <w:jc w:val="center"/>
+              <w:textAlignment w:val="center"/>
+              <w:rPr>
+                <w:rFonts w:hint="eastAsia" w:ascii="宋体" w:hAnsi="宋体" w:eastAsia="宋体" w:cs="宋体"/>
+                <w:b w:val="0"/>
+                <w:i w:val="0"/>
+                <w:iCs w:val="0"/>
+                <w:color w:val="000000"/>
+                <w:sz w:val="18"/>
+                <w:szCs w:val="18"/>
+                <w:u w:val="none"/>
+              </w:rPr>
+            </w:pPr>
+            <w:r>
+              <w:rPr>
+                <w:rFonts w:hint="eastAsia" w:ascii="宋体" w:hAnsi="宋体" w:eastAsia="宋体" w:cs="宋体"/>
+                <w:b w:val="0"/>
+                <w:i w:val="0"/>
+                <w:iCs w:val="0"/>
+                <w:color w:val="000000"/>
+                <w:kern w:val="0"/>
+                <w:sz w:val="18"/>
+                <w:szCs w:val="18"/>
+                <w:u w:val="none"/>
+                <w:bdr w:val="none" w:color="auto" w:sz="0" w:space="0"/>
+                <w:lang w:val="en-US" w:eastAsia="zh-CN" w:bidi="ar"/>
+              </w:rPr>
+              <w:t>0.035</w:t>
+            </w:r>
+          </w:p>
+        </w:tc>
+        <w:tc>
+          <w:tcPr>
+            <w:tcW w:w="527" w:type="pct"/>
+            <w:tcBorders>
+              <w:top w:val="nil"/>
+              <w:left w:val="nil"/>
+              <w:bottom w:val="single" w:color="000000" w:sz="12" w:space="0"/>
+              <w:right w:val="nil"/>
+            </w:tcBorders>
+            <w:shd w:val="clear" w:color="auto" w:fill="FFFFFF"/>
+            <w:noWrap/>
+            <w:vAlign w:val="center"/>
+          </w:tcPr>
+          <w:p>
+            <w:pPr>
+              <w:keepNext w:val="0"/>
+              <w:keepLines w:val="0"/>
+              <w:widowControl/>
+              <w:suppressLineNumbers w:val="0"/>
+              <w:jc w:val="center"/>
+              <w:textAlignment w:val="center"/>
+              <w:rPr>
+                <w:rFonts w:hint="eastAsia" w:ascii="宋体" w:hAnsi="宋体" w:eastAsia="宋体" w:cs="宋体"/>
+                <w:b w:val="0"/>
+                <w:i w:val="0"/>
+                <w:iCs w:val="0"/>
+                <w:color w:val="000000"/>
+                <w:sz w:val="18"/>
+                <w:szCs w:val="18"/>
+                <w:u w:val="none"/>
+              </w:rPr>
+            </w:pPr>
+            <w:r>
+              <w:rPr>
+                <w:rFonts w:hint="eastAsia" w:ascii="宋体" w:hAnsi="宋体" w:eastAsia="宋体" w:cs="宋体"/>
+                <w:b w:val="0"/>
+                <w:i w:val="0"/>
+                <w:iCs w:val="0"/>
+                <w:color w:val="000000"/>
+                <w:kern w:val="0"/>
+                <w:sz w:val="18"/>
+                <w:szCs w:val="18"/>
+                <w:u w:val="none"/>
+                <w:bdr w:val="none" w:color="auto" w:sz="0" w:space="0"/>
+                <w:lang w:val="en-US" w:eastAsia="zh-CN" w:bidi="ar"/>
+              </w:rPr>
+              <w:t>-15.597</w:t>
+            </w:r>
+          </w:p>
+        </w:tc>
+        <w:tc>
+          <w:tcPr>
+            <w:tcW w:w="527" w:type="pct"/>
+            <w:tcBorders>
+              <w:top w:val="nil"/>
+              <w:left w:val="nil"/>
+              <w:bottom w:val="single" w:color="000000" w:sz="12" w:space="0"/>
+              <w:right w:val="nil"/>
+            </w:tcBorders>
+            <w:shd w:val="clear" w:color="auto" w:fill="FFFFFF"/>
+            <w:noWrap/>
+            <w:vAlign w:val="center"/>
+          </w:tcPr>
+          <w:p>
+            <w:pPr>
+              <w:keepNext w:val="0"/>
+              <w:keepLines w:val="0"/>
+              <w:widowControl/>
+              <w:suppressLineNumbers w:val="0"/>
+              <w:jc w:val="center"/>
+              <w:textAlignment w:val="center"/>
+              <w:rPr>
+                <w:rFonts w:hint="eastAsia" w:ascii="宋体" w:hAnsi="宋体" w:eastAsia="宋体" w:cs="宋体"/>
+                <w:b w:val="0"/>
+                <w:i w:val="0"/>
+                <w:iCs w:val="0"/>
+                <w:color w:val="000000"/>
+                <w:kern w:val="2"/>
+                <w:sz w:val="18"/>
+                <w:szCs w:val="18"/>
+                <w:u w:val="none"/>
+                <w:lang w:val="en-US" w:eastAsia="zh-CN" w:bidi="ar-SA"/>
+              </w:rPr>
+            </w:pPr>
+            <w:r>
+              <w:rPr>
+                <w:rFonts w:hint="default" w:ascii="宋体" w:hAnsi="宋体" w:eastAsia="宋体" w:cs="宋体"/>
+                <w:b w:val="0"/>
+                <w:i w:val="0"/>
+                <w:iCs w:val="0"/>
+                <w:color w:val="000000"/>
+                <w:sz w:val="18"/>
+                <w:szCs w:val="18"/>
+                <w:u w:val="none"/>
+                <w:lang w:val="en-US"/>
+              </w:rPr>
+              <w:t>&lt;0.001</w:t>
+            </w:r>
+          </w:p>
+        </w:tc>
+        <w:tc>
+          <w:tcPr>
+            <w:tcW w:w="716" w:type="pct"/>
+            <w:tcBorders>
+              <w:top w:val="nil"/>
+              <w:left w:val="nil"/>
+              <w:bottom w:val="single" w:color="000000" w:sz="12" w:space="0"/>
+              <w:right w:val="nil"/>
+            </w:tcBorders>
+            <w:shd w:val="clear" w:color="auto" w:fill="FFFFFF"/>
+            <w:noWrap/>
+            <w:vAlign w:val="center"/>
+          </w:tcPr>
+          <w:p>
+            <w:pPr>
+              <w:keepNext w:val="0"/>
+              <w:keepLines w:val="0"/>
+              <w:widowControl/>
+              <w:suppressLineNumbers w:val="0"/>
+              <w:jc w:val="center"/>
+              <w:textAlignment w:val="center"/>
+              <w:rPr>
+                <w:rFonts w:hint="eastAsia" w:ascii="宋体" w:hAnsi="宋体" w:eastAsia="宋体" w:cs="宋体"/>
+                <w:b w:val="0"/>
+                <w:i w:val="0"/>
+                <w:iCs w:val="0"/>
+                <w:color w:val="000000"/>
+                <w:sz w:val="18"/>
+                <w:szCs w:val="18"/>
+                <w:u w:val="none"/>
+              </w:rPr>
+            </w:pPr>
+            <w:r>
+              <w:rPr>
+                <w:rFonts w:hint="eastAsia" w:ascii="宋体" w:hAnsi="宋体" w:eastAsia="宋体" w:cs="宋体"/>
+                <w:b w:val="0"/>
+                <w:i w:val="0"/>
+                <w:iCs w:val="0"/>
+                <w:color w:val="000000"/>
+                <w:kern w:val="0"/>
+                <w:sz w:val="18"/>
+                <w:szCs w:val="18"/>
+                <w:u w:val="none"/>
+                <w:bdr w:val="none" w:color="auto" w:sz="0" w:space="0"/>
+                <w:lang w:val="en-US" w:eastAsia="zh-CN" w:bidi="ar"/>
+              </w:rPr>
+              <w:t>[-0.621,-0.4</w:t>
+            </w:r>
+            <w:r>
+              <w:rPr>
+                <w:rFonts w:hint="default" w:ascii="宋体" w:hAnsi="宋体" w:eastAsia="宋体" w:cs="宋体"/>
+                <w:b w:val="0"/>
+                <w:i w:val="0"/>
+                <w:iCs w:val="0"/>
+                <w:color w:val="000000"/>
+                <w:kern w:val="0"/>
+                <w:sz w:val="18"/>
+                <w:szCs w:val="18"/>
+                <w:u w:val="none"/>
+                <w:bdr w:val="none" w:color="auto" w:sz="0" w:space="0"/>
+                <w:lang w:val="en-US" w:eastAsia="zh-CN" w:bidi="ar"/>
+              </w:rPr>
+              <w:t>00</w:t>
+            </w:r>
+            <w:r>
+              <w:rPr>
+                <w:rFonts w:hint="eastAsia" w:ascii="宋体" w:hAnsi="宋体" w:eastAsia="宋体" w:cs="宋体"/>
+                <w:b w:val="0"/>
+                <w:i w:val="0"/>
+                <w:iCs w:val="0"/>
+                <w:color w:val="000000"/>
+                <w:kern w:val="0"/>
+                <w:sz w:val="18"/>
+                <w:szCs w:val="18"/>
+                <w:u w:val="none"/>
+                <w:bdr w:val="none" w:color="auto" w:sz="0" w:space="0"/>
+                <w:lang w:val="en-US" w:eastAsia="zh-CN" w:bidi="ar"/>
+              </w:rPr>
+              <w:t>]</w:t>
+            </w:r>
+          </w:p>
+        </w:tc>
+        <w:tc>
+          <w:tcPr>
+            <w:tcW w:w="567" w:type="pct"/>
+            <w:tcBorders>
+              <w:top w:val="nil"/>
+              <w:left w:val="nil"/>
+              <w:bottom w:val="single" w:color="000000" w:sz="12" w:space="0"/>
+              <w:right w:val="nil"/>
+            </w:tcBorders>
+            <w:shd w:val="clear" w:color="auto" w:fill="FFFFFF"/>
+            <w:noWrap/>
+            <w:vAlign w:val="center"/>
+          </w:tcPr>
+          <w:p>
+            <w:pPr>
+              <w:keepNext w:val="0"/>
+              <w:keepLines w:val="0"/>
+              <w:widowControl/>
+              <w:suppressLineNumbers w:val="0"/>
+              <w:jc w:val="center"/>
+              <w:textAlignment w:val="center"/>
+              <w:rPr>
+                <w:rFonts w:hint="eastAsia" w:ascii="宋体" w:hAnsi="宋体" w:eastAsia="宋体" w:cs="宋体"/>
+                <w:b w:val="0"/>
+                <w:i w:val="0"/>
+                <w:iCs w:val="0"/>
+                <w:color w:val="000000"/>
+                <w:sz w:val="18"/>
+                <w:szCs w:val="18"/>
+                <w:u w:val="none"/>
+              </w:rPr>
+            </w:pPr>
+            <w:r>
+              <w:rPr>
+                <w:rFonts w:hint="eastAsia" w:ascii="宋体" w:hAnsi="宋体" w:eastAsia="宋体" w:cs="宋体"/>
+                <w:b w:val="0"/>
+                <w:i w:val="0"/>
+                <w:iCs w:val="0"/>
+                <w:color w:val="000000"/>
+                <w:kern w:val="0"/>
+                <w:sz w:val="18"/>
+                <w:szCs w:val="18"/>
+                <w:u w:val="none"/>
+                <w:bdr w:val="none" w:color="auto" w:sz="0" w:space="0"/>
+                <w:lang w:val="en-US" w:eastAsia="zh-CN" w:bidi="ar"/>
+              </w:rPr>
+              <w:t>100.000</w:t>
+            </w:r>
+          </w:p>
+        </w:tc>
+        <w:tc>
+          <w:tcPr>
+            <w:tcW w:w="549" w:type="pct"/>
+            <w:tcBorders>
+              <w:top w:val="nil"/>
+              <w:left w:val="nil"/>
+              <w:bottom w:val="single" w:color="000000" w:sz="12" w:space="0"/>
+              <w:right w:val="nil"/>
+            </w:tcBorders>
+            <w:shd w:val="clear" w:color="auto" w:fill="FFFFFF"/>
+            <w:noWrap/>
+            <w:vAlign w:val="center"/>
+          </w:tcPr>
+          <w:p>
+            <w:pPr>
+              <w:keepNext w:val="0"/>
+              <w:keepLines w:val="0"/>
+              <w:widowControl/>
+              <w:suppressLineNumbers w:val="0"/>
+              <w:jc w:val="center"/>
+              <w:textAlignment w:val="center"/>
+              <w:rPr>
+                <w:rFonts w:hint="eastAsia" w:ascii="宋体" w:hAnsi="宋体" w:eastAsia="宋体" w:cs="宋体"/>
+                <w:b w:val="0"/>
+                <w:i w:val="0"/>
+                <w:iCs w:val="0"/>
+                <w:color w:val="000000"/>
+                <w:sz w:val="18"/>
+                <w:szCs w:val="18"/>
+                <w:u w:val="none"/>
+              </w:rPr>
+            </w:pPr>
+            <w:r>
+              <w:rPr>
+                <w:rFonts w:hint="eastAsia" w:ascii="宋体" w:hAnsi="宋体" w:eastAsia="宋体" w:cs="宋体"/>
+                <w:b w:val="0"/>
+                <w:i w:val="0"/>
+                <w:iCs w:val="0"/>
+                <w:color w:val="000000"/>
+                <w:kern w:val="0"/>
+                <w:sz w:val="18"/>
+                <w:szCs w:val="18"/>
+                <w:u w:val="none"/>
+                <w:bdr w:val="none" w:color="auto" w:sz="0" w:space="0"/>
+                <w:lang w:val="en-US" w:eastAsia="zh-CN" w:bidi="ar"/>
+              </w:rPr>
+              <w:t>0.000</w:t>
+            </w:r>
+          </w:p>
+        </w:tc>
+      </w:tr>
+    </w:tbl>
+    <w:p>
+      <w:pPr>
+        <w:keepNext w:val="0"/>
+        <w:keepLines w:val="0"/>
+        <w:pageBreakBefore w:val="0"/>
+        <w:widowControl w:val="0"/>
+        <w:kinsoku/>
+        <w:wordWrap/>
+        <w:overflowPunct/>
+        <w:topLinePunct w:val="0"/>
+        <w:autoSpaceDE/>
+        <w:autoSpaceDN/>
+        <w:bidi w:val="0"/>
+        <w:adjustRightInd/>
+        <w:snapToGrid/>
+        <w:spacing w:line="360" w:lineRule="auto"/>
+        <w:ind w:firstLine="0" w:firstLineChars="0"/>
+        <w:jc w:val="both"/>
+        <w:textAlignment w:val="auto"/>
+        <w:rPr>
+          <w:rFonts w:hint="default" w:ascii="宋体" w:hAnsi="宋体" w:eastAsia="宋体" w:cs="宋体"/>
+          <w:b w:val="0"/>
+          <w:bCs w:val="0"/>
+          <w:i w:val="0"/>
+          <w:iCs w:val="0"/>
+          <w:sz w:val="18"/>
+          <w:szCs w:val="18"/>
+          <w:lang w:val="en-US" w:eastAsia="zh-CN"/>
+        </w:rPr>
+      </w:pPr>
+      <w:r>
+        <w:rPr>
+          <w:rFonts w:hint="default" w:ascii="宋体" w:hAnsi="宋体" w:eastAsia="宋体" w:cs="宋体"/>
           <w:b/>
           <w:bCs/>
           <w:i w:val="0"/>
@@ -6701,20 +9151,7 @@
           <w:szCs w:val="18"/>
           <w:lang w:val="en-US" w:eastAsia="zh-CN"/>
         </w:rPr>
-        <w:t>Simple Slope Plot of Grou</w:t>
-      </w:r>
-      <w:bookmarkStart w:id="0" w:name="_GoBack"/>
-      <w:bookmarkEnd w:id="0"/>
-      <w:r>
-        <w:rPr>
-          <w:rFonts w:hint="eastAsia" w:ascii="宋体" w:hAnsi="宋体" w:eastAsia="宋体" w:cs="宋体"/>
-          <w:i/>
-          <w:iCs/>
-          <w:sz w:val="18"/>
-          <w:szCs w:val="18"/>
-          <w:lang w:val="en-US" w:eastAsia="zh-CN"/>
-        </w:rPr>
-        <w:t>p Assignment on Post, Moderated by Pre</w:t>
+        <w:t>Simple Slope Plot of Group Assignment on Post, Moderated by Pre</w:t>
       </w:r>
     </w:p>
     <w:p>
@@ -6812,7 +9249,279 @@
           <w:szCs w:val="21"/>
           <w:lang w:val="en-US" w:eastAsia="zh-CN"/>
         </w:rPr>
-        <w:t>Johnson-Neyman法分析结果表明：基础薄弱/中等学生段（原始前测&lt;8.01分，对应Pre_MC&lt;1.91）：占总样本的81.7%，组间效应显著为正（p &lt; .05），实验组后测得分显著高于对照组，提升幅度为0.05~3.15分，前测基础越差提升效果越明显；过渡无差异区间（原始前测8.01~8.19分，对应Pre_MC在[1.91, 2.09]区间内）：仅占总样本的1.7%，组间效应无统计学显著性（p ≥ .05），两种教学法效果无差异；基础极优学生段（原始前测&gt;8.19分，对应Pre_MC&gt;2.09）：占总样本的16.6%，组间效应显著为负（p &lt; .05），对照组后测得分显著高于实验组，差值为0.06~0.55分，对于前测基础极好的学生，对照组效果更优。</w:t>
+        <w:t>Johnson-Neyman法分析结果表明：基础薄弱/中等学生段（原始前测&lt;8.</w:t>
+      </w:r>
+      <w:r>
+        <w:rPr>
+          <w:rFonts w:hint="default" w:ascii="方正仿宋_GB2312" w:hAnsi="方正仿宋_GB2312" w:eastAsia="方正仿宋_GB2312" w:cs="方正仿宋_GB2312"/>
+          <w:sz w:val="21"/>
+          <w:szCs w:val="21"/>
+          <w:lang w:val="en-US" w:eastAsia="zh-CN"/>
+        </w:rPr>
+        <w:t>223</w:t>
+      </w:r>
+      <w:r>
+        <w:rPr>
+          <w:rFonts w:hint="eastAsia" w:ascii="方正仿宋_GB2312" w:hAnsi="方正仿宋_GB2312" w:eastAsia="方正仿宋_GB2312" w:cs="方正仿宋_GB2312"/>
+          <w:sz w:val="21"/>
+          <w:szCs w:val="21"/>
+          <w:lang w:val="en-US" w:eastAsia="zh-CN"/>
+        </w:rPr>
+        <w:t>分，对应Pre_MC&lt;1.91</w:t>
+      </w:r>
+      <w:r>
+        <w:rPr>
+          <w:rFonts w:hint="default" w:ascii="方正仿宋_GB2312" w:hAnsi="方正仿宋_GB2312" w:eastAsia="方正仿宋_GB2312" w:cs="方正仿宋_GB2312"/>
+          <w:sz w:val="21"/>
+          <w:szCs w:val="21"/>
+          <w:lang w:val="en-US" w:eastAsia="zh-CN"/>
+        </w:rPr>
+        <w:t>3</w:t>
+      </w:r>
+      <w:r>
+        <w:rPr>
+          <w:rFonts w:hint="eastAsia" w:ascii="方正仿宋_GB2312" w:hAnsi="方正仿宋_GB2312" w:eastAsia="方正仿宋_GB2312" w:cs="方正仿宋_GB2312"/>
+          <w:sz w:val="21"/>
+          <w:szCs w:val="21"/>
+          <w:lang w:val="en-US" w:eastAsia="zh-CN"/>
+        </w:rPr>
+        <w:t>）：占总样本的81.</w:t>
+      </w:r>
+      <w:r>
+        <w:rPr>
+          <w:rFonts w:hint="default" w:ascii="方正仿宋_GB2312" w:hAnsi="方正仿宋_GB2312" w:eastAsia="方正仿宋_GB2312" w:cs="方正仿宋_GB2312"/>
+          <w:sz w:val="21"/>
+          <w:szCs w:val="21"/>
+          <w:lang w:val="en-US" w:eastAsia="zh-CN"/>
+        </w:rPr>
+        <w:t>667</w:t>
+      </w:r>
+      <w:r>
+        <w:rPr>
+          <w:rFonts w:hint="eastAsia" w:ascii="方正仿宋_GB2312" w:hAnsi="方正仿宋_GB2312" w:eastAsia="方正仿宋_GB2312" w:cs="方正仿宋_GB2312"/>
+          <w:sz w:val="21"/>
+          <w:szCs w:val="21"/>
+          <w:lang w:val="en-US" w:eastAsia="zh-CN"/>
+        </w:rPr>
+        <w:t>%，组间效应显著为正（p &lt; .05），实验组后测得分显著高于对照组，提升幅度为0.05</w:t>
+      </w:r>
+      <w:r>
+        <w:rPr>
+          <w:rFonts w:hint="default" w:ascii="方正仿宋_GB2312" w:hAnsi="方正仿宋_GB2312" w:eastAsia="方正仿宋_GB2312" w:cs="方正仿宋_GB2312"/>
+          <w:sz w:val="21"/>
+          <w:szCs w:val="21"/>
+          <w:lang w:val="en-US" w:eastAsia="zh-CN"/>
+        </w:rPr>
+        <w:t>4</w:t>
+      </w:r>
+      <w:r>
+        <w:rPr>
+          <w:rFonts w:hint="eastAsia" w:ascii="方正仿宋_GB2312" w:hAnsi="方正仿宋_GB2312" w:eastAsia="方正仿宋_GB2312" w:cs="方正仿宋_GB2312"/>
+          <w:sz w:val="21"/>
+          <w:szCs w:val="21"/>
+          <w:lang w:val="en-US" w:eastAsia="zh-CN"/>
+        </w:rPr>
+        <w:t>~3.1</w:t>
+      </w:r>
+      <w:r>
+        <w:rPr>
+          <w:rFonts w:hint="default" w:ascii="方正仿宋_GB2312" w:hAnsi="方正仿宋_GB2312" w:eastAsia="方正仿宋_GB2312" w:cs="方正仿宋_GB2312"/>
+          <w:sz w:val="21"/>
+          <w:szCs w:val="21"/>
+          <w:lang w:val="en-US" w:eastAsia="zh-CN"/>
+        </w:rPr>
+        <w:t>49</w:t>
+      </w:r>
+      <w:r>
+        <w:rPr>
+          <w:rFonts w:hint="eastAsia" w:ascii="方正仿宋_GB2312" w:hAnsi="方正仿宋_GB2312" w:eastAsia="方正仿宋_GB2312" w:cs="方正仿宋_GB2312"/>
+          <w:sz w:val="21"/>
+          <w:szCs w:val="21"/>
+          <w:lang w:val="en-US" w:eastAsia="zh-CN"/>
+        </w:rPr>
+        <w:t>分，前测基础越差提升效果越明显；过渡无差异区间（原始前测8.</w:t>
+      </w:r>
+      <w:r>
+        <w:rPr>
+          <w:rFonts w:hint="default" w:ascii="方正仿宋_GB2312" w:hAnsi="方正仿宋_GB2312" w:eastAsia="方正仿宋_GB2312" w:cs="方正仿宋_GB2312"/>
+          <w:sz w:val="21"/>
+          <w:szCs w:val="21"/>
+          <w:lang w:val="en-US" w:eastAsia="zh-CN"/>
+        </w:rPr>
+        <w:t>223</w:t>
+      </w:r>
+      <w:r>
+        <w:rPr>
+          <w:rFonts w:hint="eastAsia" w:ascii="方正仿宋_GB2312" w:hAnsi="方正仿宋_GB2312" w:eastAsia="方正仿宋_GB2312" w:cs="方正仿宋_GB2312"/>
+          <w:sz w:val="21"/>
+          <w:szCs w:val="21"/>
+          <w:lang w:val="en-US" w:eastAsia="zh-CN"/>
+        </w:rPr>
+        <w:t>~8</w:t>
+      </w:r>
+      <w:r>
+        <w:rPr>
+          <w:rFonts w:hint="default" w:ascii="方正仿宋_GB2312" w:hAnsi="方正仿宋_GB2312" w:eastAsia="方正仿宋_GB2312" w:cs="方正仿宋_GB2312"/>
+          <w:sz w:val="21"/>
+          <w:szCs w:val="21"/>
+          <w:lang w:val="en-US" w:eastAsia="zh-CN"/>
+        </w:rPr>
+        <w:t>.403</w:t>
+      </w:r>
+      <w:r>
+        <w:rPr>
+          <w:rFonts w:hint="eastAsia" w:ascii="方正仿宋_GB2312" w:hAnsi="方正仿宋_GB2312" w:eastAsia="方正仿宋_GB2312" w:cs="方正仿宋_GB2312"/>
+          <w:sz w:val="21"/>
+          <w:szCs w:val="21"/>
+          <w:lang w:val="en-US" w:eastAsia="zh-CN"/>
+        </w:rPr>
+        <w:t>分，对应Pre_MC在[1.91</w:t>
+      </w:r>
+      <w:r>
+        <w:rPr>
+          <w:rFonts w:hint="default" w:ascii="方正仿宋_GB2312" w:hAnsi="方正仿宋_GB2312" w:eastAsia="方正仿宋_GB2312" w:cs="方正仿宋_GB2312"/>
+          <w:sz w:val="21"/>
+          <w:szCs w:val="21"/>
+          <w:lang w:val="en-US" w:eastAsia="zh-CN"/>
+        </w:rPr>
+        <w:t>3</w:t>
+      </w:r>
+      <w:r>
+        <w:rPr>
+          <w:rFonts w:hint="eastAsia" w:ascii="方正仿宋_GB2312" w:hAnsi="方正仿宋_GB2312" w:eastAsia="方正仿宋_GB2312" w:cs="方正仿宋_GB2312"/>
+          <w:sz w:val="21"/>
+          <w:szCs w:val="21"/>
+          <w:lang w:val="en-US" w:eastAsia="zh-CN"/>
+        </w:rPr>
+        <w:t>, 2.09</w:t>
+      </w:r>
+      <w:r>
+        <w:rPr>
+          <w:rFonts w:hint="default" w:ascii="方正仿宋_GB2312" w:hAnsi="方正仿宋_GB2312" w:eastAsia="方正仿宋_GB2312" w:cs="方正仿宋_GB2312"/>
+          <w:sz w:val="21"/>
+          <w:szCs w:val="21"/>
+          <w:lang w:val="en-US" w:eastAsia="zh-CN"/>
+        </w:rPr>
+        <w:t>3</w:t>
+      </w:r>
+      <w:r>
+        <w:rPr>
+          <w:rFonts w:hint="eastAsia" w:ascii="方正仿宋_GB2312" w:hAnsi="方正仿宋_GB2312" w:eastAsia="方正仿宋_GB2312" w:cs="方正仿宋_GB2312"/>
+          <w:sz w:val="21"/>
+          <w:szCs w:val="21"/>
+          <w:lang w:val="en-US" w:eastAsia="zh-CN"/>
+        </w:rPr>
+        <w:t>]区间内）：仅占总样本的1.</w:t>
+      </w:r>
+      <w:r>
+        <w:rPr>
+          <w:rFonts w:hint="default" w:ascii="方正仿宋_GB2312" w:hAnsi="方正仿宋_GB2312" w:eastAsia="方正仿宋_GB2312" w:cs="方正仿宋_GB2312"/>
+          <w:sz w:val="21"/>
+          <w:szCs w:val="21"/>
+          <w:lang w:val="en-US" w:eastAsia="zh-CN"/>
+        </w:rPr>
+        <w:t>666</w:t>
+      </w:r>
+      <w:r>
+        <w:rPr>
+          <w:rFonts w:hint="eastAsia" w:ascii="方正仿宋_GB2312" w:hAnsi="方正仿宋_GB2312" w:eastAsia="方正仿宋_GB2312" w:cs="方正仿宋_GB2312"/>
+          <w:sz w:val="21"/>
+          <w:szCs w:val="21"/>
+          <w:lang w:val="en-US" w:eastAsia="zh-CN"/>
+        </w:rPr>
+        <w:t>%，组间效应无统计学显著性（p ≥ .05），两种教学法效果无差异；基础极优学生段（原始前测&gt;8.</w:t>
+      </w:r>
+      <w:r>
+        <w:rPr>
+          <w:rFonts w:hint="default" w:ascii="方正仿宋_GB2312" w:hAnsi="方正仿宋_GB2312" w:eastAsia="方正仿宋_GB2312" w:cs="方正仿宋_GB2312"/>
+          <w:sz w:val="21"/>
+          <w:szCs w:val="21"/>
+          <w:lang w:val="en-US" w:eastAsia="zh-CN"/>
+        </w:rPr>
+        <w:t>403</w:t>
+      </w:r>
+      <w:r>
+        <w:rPr>
+          <w:rFonts w:hint="eastAsia" w:ascii="方正仿宋_GB2312" w:hAnsi="方正仿宋_GB2312" w:eastAsia="方正仿宋_GB2312" w:cs="方正仿宋_GB2312"/>
+          <w:sz w:val="21"/>
+          <w:szCs w:val="21"/>
+          <w:lang w:val="en-US" w:eastAsia="zh-CN"/>
+        </w:rPr>
+        <w:t>分，对应Pre_MC&gt;2.09</w:t>
+      </w:r>
+      <w:r>
+        <w:rPr>
+          <w:rFonts w:hint="default" w:ascii="方正仿宋_GB2312" w:hAnsi="方正仿宋_GB2312" w:eastAsia="方正仿宋_GB2312" w:cs="方正仿宋_GB2312"/>
+          <w:sz w:val="21"/>
+          <w:szCs w:val="21"/>
+          <w:lang w:val="en-US" w:eastAsia="zh-CN"/>
+        </w:rPr>
+        <w:t>3</w:t>
+      </w:r>
+      <w:r>
+        <w:rPr>
+          <w:rFonts w:hint="eastAsia" w:ascii="方正仿宋_GB2312" w:hAnsi="方正仿宋_GB2312" w:eastAsia="方正仿宋_GB2312" w:cs="方正仿宋_GB2312"/>
+          <w:sz w:val="21"/>
+          <w:szCs w:val="21"/>
+          <w:lang w:val="en-US" w:eastAsia="zh-CN"/>
+        </w:rPr>
+        <w:t>）：占总样本的16.6</w:t>
+      </w:r>
+      <w:r>
+        <w:rPr>
+          <w:rFonts w:hint="default" w:ascii="方正仿宋_GB2312" w:hAnsi="方正仿宋_GB2312" w:eastAsia="方正仿宋_GB2312" w:cs="方正仿宋_GB2312"/>
+          <w:sz w:val="21"/>
+          <w:szCs w:val="21"/>
+          <w:lang w:val="en-US" w:eastAsia="zh-CN"/>
+        </w:rPr>
+        <w:t>67</w:t>
+      </w:r>
+      <w:r>
+        <w:rPr>
+          <w:rFonts w:hint="eastAsia" w:ascii="方正仿宋_GB2312" w:hAnsi="方正仿宋_GB2312" w:eastAsia="方正仿宋_GB2312" w:cs="方正仿宋_GB2312"/>
+          <w:sz w:val="21"/>
+          <w:szCs w:val="21"/>
+          <w:lang w:val="en-US" w:eastAsia="zh-CN"/>
+        </w:rPr>
+        <w:t>%，组间效应显著为负（p &lt; .05），对照组后测得分显著高于实验组，差值为0.0</w:t>
+      </w:r>
+      <w:r>
+        <w:rPr>
+          <w:rFonts w:hint="default" w:ascii="方正仿宋_GB2312" w:hAnsi="方正仿宋_GB2312" w:eastAsia="方正仿宋_GB2312" w:cs="方正仿宋_GB2312"/>
+          <w:sz w:val="21"/>
+          <w:szCs w:val="21"/>
+          <w:lang w:val="en-US" w:eastAsia="zh-CN"/>
+        </w:rPr>
+        <w:t>57</w:t>
+      </w:r>
+      <w:r>
+        <w:rPr>
+          <w:rFonts w:hint="eastAsia" w:ascii="方正仿宋_GB2312" w:hAnsi="方正仿宋_GB2312" w:eastAsia="方正仿宋_GB2312" w:cs="方正仿宋_GB2312"/>
+          <w:sz w:val="21"/>
+          <w:szCs w:val="21"/>
+          <w:lang w:val="en-US" w:eastAsia="zh-CN"/>
+        </w:rPr>
+        <w:t>~0.55</w:t>
+      </w:r>
+      <w:r>
+        <w:rPr>
+          <w:rFonts w:hint="default" w:ascii="方正仿宋_GB2312" w:hAnsi="方正仿宋_GB2312" w:eastAsia="方正仿宋_GB2312" w:cs="方正仿宋_GB2312"/>
+          <w:sz w:val="21"/>
+          <w:szCs w:val="21"/>
+          <w:lang w:val="en-US" w:eastAsia="zh-CN"/>
+        </w:rPr>
+        <w:t>0</w:t>
+      </w:r>
+      <w:bookmarkStart w:id="0" w:name="_GoBack"/>
+      <w:bookmarkEnd w:id="0"/>
+      <w:r>
+        <w:rPr>
+          <w:rFonts w:hint="eastAsia" w:ascii="方正仿宋_GB2312" w:hAnsi="方正仿宋_GB2312" w:eastAsia="方正仿宋_GB2312" w:cs="方正仿宋_GB2312"/>
+          <w:sz w:val="21"/>
+          <w:szCs w:val="21"/>
+          <w:lang w:val="en-US" w:eastAsia="zh-CN"/>
+        </w:rPr>
+        <w:t>分，对于前测基础极好的学生，对照组效果更优。</w:t>
       </w:r>
     </w:p>
     <w:p>

</xml_diff>

<commit_message>
Sync from private source SHA: 31c4cb6d709a23ab2a08da3f6ace003cc401fdb2
</commit_message>
<xml_diff>
--- a/Docs/03ANOVA/ANCOVA_Case_Interaction.docx
+++ b/Docs/03ANOVA/ANCOVA_Case_Interaction.docx
@@ -19,7 +19,7 @@
           <w:szCs w:val="30"/>
           <w:lang w:val="en-US" w:eastAsia="zh-CN"/>
         </w:rPr>
-        <w:t>斜方差案例分析（斜率不齐）</w:t>
+        <w:t>协方差案例分析（斜率不齐）</w:t>
       </w:r>
     </w:p>
     <w:p>
@@ -1892,7 +1892,7 @@
           <w:szCs w:val="21"/>
           <w:lang w:val="en-US" w:eastAsia="zh-CN"/>
         </w:rPr>
-        <w:t>表1斜方差回归斜率齐性检验结果显示，</w:t>
+        <w:t>表1协方差回归斜率齐性检验结果显示，</w:t>
       </w:r>
       <w:r>
         <w:rPr>
@@ -2007,7 +2007,18 @@
           <w:szCs w:val="21"/>
           <w:lang w:val="en-US" w:eastAsia="zh-CN"/>
         </w:rPr>
-        <w:t>斜方差回归斜率不齐表明组间差异的大小会随协变量的取值变化而变化。为了完整保留协变量信息、明确干预效应随协变量的变化规律，构建多元回归模型（因变量：后测；自变量：分组、前测、分组*前测）并进行简单斜率分析，计算协变量取均值、均值±1标准差等典型值时的组间效应。</w:t>
+        <w:t>协</w:t>
+      </w:r>
+      <w:bookmarkStart w:id="0" w:name="_GoBack"/>
+      <w:bookmarkEnd w:id="0"/>
+      <w:r>
+        <w:rPr>
+          <w:rFonts w:hint="eastAsia" w:ascii="方正仿宋_GB2312" w:hAnsi="方正仿宋_GB2312" w:eastAsia="方正仿宋_GB2312" w:cs="方正仿宋_GB2312"/>
+          <w:sz w:val="21"/>
+          <w:szCs w:val="21"/>
+          <w:lang w:val="en-US" w:eastAsia="zh-CN"/>
+        </w:rPr>
+        <w:t>方差回归斜率不齐表明组间差异的大小会随协变量的取值变化而变化。为了完整保留协变量信息、明确干预效应随协变量的变化规律，构建多元回归模型（因变量：后测；自变量：分组、前测、分组*前测）并进行简单斜率分析，计算协变量取均值、均值±1标准差等典型值时的组间效应。</w:t>
       </w:r>
     </w:p>
     <w:p>
@@ -6671,6 +6682,7 @@
     </w:p>
     <w:tbl>
       <w:tblPr>
+        <w:tblStyle w:val="2"/>
         <w:tblW w:w="4997" w:type="pct"/>
         <w:tblInd w:w="0" w:type="dxa"/>
         <w:tblBorders>
@@ -6681,7 +6693,7 @@
           <w:insideH w:val="none" w:color="auto" w:sz="0" w:space="0"/>
           <w:insideV w:val="none" w:color="auto" w:sz="0" w:space="0"/>
         </w:tblBorders>
-        <w:shd w:val="clear"/>
+        <w:shd w:val="clear" w:color="auto" w:fill="auto"/>
         <w:tblLayout w:type="autofit"/>
         <w:tblCellMar>
           <w:top w:w="0" w:type="dxa"/>
@@ -6749,7 +6761,6 @@
                 <w:sz w:val="18"/>
                 <w:szCs w:val="18"/>
                 <w:u w:val="none"/>
-                <w:bdr w:val="none" w:color="auto" w:sz="0" w:space="0"/>
                 <w:lang w:val="en-US" w:eastAsia="zh-CN" w:bidi="ar"/>
               </w:rPr>
               <w:t>Pre_MC</w:t>
@@ -6799,7 +6810,6 @@
                 <w:sz w:val="18"/>
                 <w:szCs w:val="18"/>
                 <w:u w:val="none"/>
-                <w:bdr w:val="none" w:color="auto" w:sz="0" w:space="0"/>
                 <w:lang w:val="en-US" w:eastAsia="zh-CN" w:bidi="ar"/>
               </w:rPr>
               <w:t>Raw</w:t>
@@ -6849,7 +6859,6 @@
                 <w:sz w:val="18"/>
                 <w:szCs w:val="18"/>
                 <w:u w:val="none"/>
-                <w:bdr w:val="none" w:color="auto" w:sz="0" w:space="0"/>
                 <w:lang w:val="en-US" w:eastAsia="zh-CN" w:bidi="ar"/>
               </w:rPr>
               <w:t>Effect</w:t>
@@ -6899,7 +6908,6 @@
                 <w:sz w:val="18"/>
                 <w:szCs w:val="18"/>
                 <w:u w:val="none"/>
-                <w:bdr w:val="none" w:color="auto" w:sz="0" w:space="0"/>
                 <w:lang w:val="en-US" w:eastAsia="zh-CN" w:bidi="ar"/>
               </w:rPr>
               <w:t>se</w:t>
@@ -6949,7 +6957,6 @@
                 <w:sz w:val="18"/>
                 <w:szCs w:val="18"/>
                 <w:u w:val="none"/>
-                <w:bdr w:val="none" w:color="auto" w:sz="0" w:space="0"/>
                 <w:lang w:val="en-US" w:eastAsia="zh-CN" w:bidi="ar"/>
               </w:rPr>
               <w:t>t</w:t>
@@ -6999,7 +7006,6 @@
                 <w:sz w:val="18"/>
                 <w:szCs w:val="18"/>
                 <w:u w:val="none"/>
-                <w:bdr w:val="none" w:color="auto" w:sz="0" w:space="0"/>
                 <w:lang w:val="en-US" w:eastAsia="zh-CN" w:bidi="ar"/>
               </w:rPr>
               <w:t>p</w:t>
@@ -7049,7 +7055,6 @@
                 <w:sz w:val="18"/>
                 <w:szCs w:val="18"/>
                 <w:u w:val="none"/>
-                <w:bdr w:val="none" w:color="auto" w:sz="0" w:space="0"/>
                 <w:lang w:val="en-US" w:eastAsia="zh-CN" w:bidi="ar"/>
               </w:rPr>
               <w:t>95%CI</w:t>
@@ -7099,7 +7104,6 @@
                 <w:sz w:val="18"/>
                 <w:szCs w:val="18"/>
                 <w:u w:val="none"/>
-                <w:bdr w:val="none" w:color="auto" w:sz="0" w:space="0"/>
                 <w:lang w:val="en-US" w:eastAsia="zh-CN" w:bidi="ar"/>
               </w:rPr>
               <w:t>% Below</w:t>
@@ -7149,7 +7153,6 @@
                 <w:sz w:val="18"/>
                 <w:szCs w:val="18"/>
                 <w:u w:val="none"/>
-                <w:bdr w:val="none" w:color="auto" w:sz="0" w:space="0"/>
                 <w:lang w:val="en-US" w:eastAsia="zh-CN" w:bidi="ar"/>
               </w:rPr>
               <w:t>% Above</w:t>
@@ -7204,7 +7207,6 @@
                 <w:sz w:val="18"/>
                 <w:szCs w:val="18"/>
                 <w:u w:val="none"/>
-                <w:bdr w:val="none" w:color="auto" w:sz="0" w:space="0"/>
                 <w:lang w:val="en-US" w:eastAsia="zh-CN" w:bidi="ar"/>
               </w:rPr>
               <w:t>-3.107</w:t>
@@ -7254,7 +7256,6 @@
                 <w:sz w:val="18"/>
                 <w:szCs w:val="18"/>
                 <w:u w:val="none"/>
-                <w:bdr w:val="none" w:color="auto" w:sz="0" w:space="0"/>
                 <w:lang w:val="en-US" w:eastAsia="zh-CN" w:bidi="ar"/>
               </w:rPr>
               <w:t>3.203</w:t>
@@ -7304,7 +7305,6 @@
                 <w:sz w:val="18"/>
                 <w:szCs w:val="18"/>
                 <w:u w:val="none"/>
-                <w:bdr w:val="none" w:color="auto" w:sz="0" w:space="0"/>
                 <w:lang w:val="en-US" w:eastAsia="zh-CN" w:bidi="ar"/>
               </w:rPr>
               <w:t>3.149</w:t>
@@ -7354,7 +7354,6 @@
                 <w:sz w:val="18"/>
                 <w:szCs w:val="18"/>
                 <w:u w:val="none"/>
-                <w:bdr w:val="none" w:color="auto" w:sz="0" w:space="0"/>
                 <w:lang w:val="en-US" w:eastAsia="zh-CN" w:bidi="ar"/>
               </w:rPr>
               <w:t>0.037</w:t>
@@ -7404,7 +7403,6 @@
                 <w:sz w:val="18"/>
                 <w:szCs w:val="18"/>
                 <w:u w:val="none"/>
-                <w:bdr w:val="none" w:color="auto" w:sz="0" w:space="0"/>
                 <w:lang w:val="en-US" w:eastAsia="zh-CN" w:bidi="ar"/>
               </w:rPr>
               <w:t>84.741</w:t>
@@ -7503,7 +7501,6 @@
                 <w:sz w:val="18"/>
                 <w:szCs w:val="18"/>
                 <w:u w:val="none"/>
-                <w:bdr w:val="none" w:color="auto" w:sz="0" w:space="0"/>
                 <w:lang w:val="en-US" w:eastAsia="zh-CN" w:bidi="ar"/>
               </w:rPr>
               <w:t>[3.074,3.223]</w:t>
@@ -7553,7 +7550,6 @@
                 <w:sz w:val="18"/>
                 <w:szCs w:val="18"/>
                 <w:u w:val="none"/>
-                <w:bdr w:val="none" w:color="auto" w:sz="0" w:space="0"/>
                 <w:lang w:val="en-US" w:eastAsia="zh-CN" w:bidi="ar"/>
               </w:rPr>
               <w:t>1.667</w:t>
@@ -7603,7 +7599,6 @@
                 <w:sz w:val="18"/>
                 <w:szCs w:val="18"/>
                 <w:u w:val="none"/>
-                <w:bdr w:val="none" w:color="auto" w:sz="0" w:space="0"/>
                 <w:lang w:val="en-US" w:eastAsia="zh-CN" w:bidi="ar"/>
               </w:rPr>
               <w:t>98.333</w:t>
@@ -7658,7 +7653,6 @@
                 <w:sz w:val="18"/>
                 <w:szCs w:val="18"/>
                 <w:u w:val="none"/>
-                <w:bdr w:val="none" w:color="auto" w:sz="0" w:space="0"/>
                 <w:lang w:val="en-US" w:eastAsia="zh-CN" w:bidi="ar"/>
               </w:rPr>
               <w:t>1.913</w:t>
@@ -7708,7 +7702,6 @@
                 <w:sz w:val="18"/>
                 <w:szCs w:val="18"/>
                 <w:u w:val="none"/>
-                <w:bdr w:val="none" w:color="auto" w:sz="0" w:space="0"/>
                 <w:lang w:val="en-US" w:eastAsia="zh-CN" w:bidi="ar"/>
               </w:rPr>
               <w:t>8.223</w:t>
@@ -7758,7 +7751,6 @@
                 <w:sz w:val="18"/>
                 <w:szCs w:val="18"/>
                 <w:u w:val="none"/>
-                <w:bdr w:val="none" w:color="auto" w:sz="0" w:space="0"/>
                 <w:lang w:val="en-US" w:eastAsia="zh-CN" w:bidi="ar"/>
               </w:rPr>
               <w:t>0.054</w:t>
@@ -7808,7 +7800,6 @@
                 <w:sz w:val="18"/>
                 <w:szCs w:val="18"/>
                 <w:u w:val="none"/>
-                <w:bdr w:val="none" w:color="auto" w:sz="0" w:space="0"/>
                 <w:lang w:val="en-US" w:eastAsia="zh-CN" w:bidi="ar"/>
               </w:rPr>
               <w:t>0.027</w:t>
@@ -7858,7 +7849,6 @@
                 <w:sz w:val="18"/>
                 <w:szCs w:val="18"/>
                 <w:u w:val="none"/>
-                <w:bdr w:val="none" w:color="auto" w:sz="0" w:space="0"/>
                 <w:lang w:val="en-US" w:eastAsia="zh-CN" w:bidi="ar"/>
               </w:rPr>
               <w:t>2.003</w:t>
@@ -7908,7 +7898,6 @@
                 <w:sz w:val="18"/>
                 <w:szCs w:val="18"/>
                 <w:u w:val="none"/>
-                <w:bdr w:val="none" w:color="auto" w:sz="0" w:space="0"/>
                 <w:lang w:val="en-US" w:eastAsia="zh-CN" w:bidi="ar"/>
               </w:rPr>
               <w:t>0.050</w:t>
@@ -7958,7 +7947,6 @@
                 <w:sz w:val="18"/>
                 <w:szCs w:val="18"/>
                 <w:u w:val="none"/>
-                <w:bdr w:val="none" w:color="auto" w:sz="0" w:space="0"/>
                 <w:lang w:val="en-US" w:eastAsia="zh-CN" w:bidi="ar"/>
               </w:rPr>
               <w:t>[0</w:t>
@@ -7974,7 +7962,6 @@
                 <w:sz w:val="18"/>
                 <w:szCs w:val="18"/>
                 <w:u w:val="none"/>
-                <w:bdr w:val="none" w:color="auto" w:sz="0" w:space="0"/>
                 <w:lang w:val="en-US" w:eastAsia="zh-CN" w:bidi="ar"/>
               </w:rPr>
               <w:t>.000</w:t>
@@ -7990,7 +7977,6 @@
                 <w:sz w:val="18"/>
                 <w:szCs w:val="18"/>
                 <w:u w:val="none"/>
-                <w:bdr w:val="none" w:color="auto" w:sz="0" w:space="0"/>
                 <w:lang w:val="en-US" w:eastAsia="zh-CN" w:bidi="ar"/>
               </w:rPr>
               <w:t>,0.108]</w:t>
@@ -8040,7 +8026,6 @@
                 <w:sz w:val="18"/>
                 <w:szCs w:val="18"/>
                 <w:u w:val="none"/>
-                <w:bdr w:val="none" w:color="auto" w:sz="0" w:space="0"/>
                 <w:lang w:val="en-US" w:eastAsia="zh-CN" w:bidi="ar"/>
               </w:rPr>
               <w:t>81.667</w:t>
@@ -8090,7 +8075,6 @@
                 <w:sz w:val="18"/>
                 <w:szCs w:val="18"/>
                 <w:u w:val="none"/>
-                <w:bdr w:val="none" w:color="auto" w:sz="0" w:space="0"/>
                 <w:lang w:val="en-US" w:eastAsia="zh-CN" w:bidi="ar"/>
               </w:rPr>
               <w:t>18.333</w:t>
@@ -8145,7 +8129,6 @@
                 <w:sz w:val="18"/>
                 <w:szCs w:val="18"/>
                 <w:u w:val="none"/>
-                <w:bdr w:val="none" w:color="auto" w:sz="0" w:space="0"/>
                 <w:lang w:val="en-US" w:eastAsia="zh-CN" w:bidi="ar"/>
               </w:rPr>
               <w:t>2.093</w:t>
@@ -8195,7 +8178,6 @@
                 <w:sz w:val="18"/>
                 <w:szCs w:val="18"/>
                 <w:u w:val="none"/>
-                <w:bdr w:val="none" w:color="auto" w:sz="0" w:space="0"/>
                 <w:lang w:val="en-US" w:eastAsia="zh-CN" w:bidi="ar"/>
               </w:rPr>
               <w:t>8.403</w:t>
@@ -8245,7 +8227,6 @@
                 <w:sz w:val="18"/>
                 <w:szCs w:val="18"/>
                 <w:u w:val="none"/>
-                <w:bdr w:val="none" w:color="auto" w:sz="0" w:space="0"/>
                 <w:lang w:val="en-US" w:eastAsia="zh-CN" w:bidi="ar"/>
               </w:rPr>
               <w:t>-0.057</w:t>
@@ -8295,7 +8276,6 @@
                 <w:sz w:val="18"/>
                 <w:szCs w:val="18"/>
                 <w:u w:val="none"/>
-                <w:bdr w:val="none" w:color="auto" w:sz="0" w:space="0"/>
                 <w:lang w:val="en-US" w:eastAsia="zh-CN" w:bidi="ar"/>
               </w:rPr>
               <w:t>0.028</w:t>
@@ -8345,7 +8325,6 @@
                 <w:sz w:val="18"/>
                 <w:szCs w:val="18"/>
                 <w:u w:val="none"/>
-                <w:bdr w:val="none" w:color="auto" w:sz="0" w:space="0"/>
                 <w:lang w:val="en-US" w:eastAsia="zh-CN" w:bidi="ar"/>
               </w:rPr>
               <w:t>-2.003</w:t>
@@ -8395,7 +8374,6 @@
                 <w:sz w:val="18"/>
                 <w:szCs w:val="18"/>
                 <w:u w:val="none"/>
-                <w:bdr w:val="none" w:color="auto" w:sz="0" w:space="0"/>
                 <w:lang w:val="en-US" w:eastAsia="zh-CN" w:bidi="ar"/>
               </w:rPr>
               <w:t>0.050</w:t>
@@ -8445,7 +8423,6 @@
                 <w:sz w:val="18"/>
                 <w:szCs w:val="18"/>
                 <w:u w:val="none"/>
-                <w:bdr w:val="none" w:color="auto" w:sz="0" w:space="0"/>
                 <w:lang w:val="en-US" w:eastAsia="zh-CN" w:bidi="ar"/>
               </w:rPr>
               <w:t>[-0.114,0</w:t>
@@ -8461,7 +8438,6 @@
                 <w:sz w:val="18"/>
                 <w:szCs w:val="18"/>
                 <w:u w:val="none"/>
-                <w:bdr w:val="none" w:color="auto" w:sz="0" w:space="0"/>
                 <w:lang w:val="en-US" w:eastAsia="zh-CN" w:bidi="ar"/>
               </w:rPr>
               <w:t>.000</w:t>
@@ -8477,7 +8453,6 @@
                 <w:sz w:val="18"/>
                 <w:szCs w:val="18"/>
                 <w:u w:val="none"/>
-                <w:bdr w:val="none" w:color="auto" w:sz="0" w:space="0"/>
                 <w:lang w:val="en-US" w:eastAsia="zh-CN" w:bidi="ar"/>
               </w:rPr>
               <w:t>]</w:t>
@@ -8527,7 +8502,6 @@
                 <w:sz w:val="18"/>
                 <w:szCs w:val="18"/>
                 <w:u w:val="none"/>
-                <w:bdr w:val="none" w:color="auto" w:sz="0" w:space="0"/>
                 <w:lang w:val="en-US" w:eastAsia="zh-CN" w:bidi="ar"/>
               </w:rPr>
               <w:t>83.333</w:t>
@@ -8577,7 +8551,6 @@
                 <w:sz w:val="18"/>
                 <w:szCs w:val="18"/>
                 <w:u w:val="none"/>
-                <w:bdr w:val="none" w:color="auto" w:sz="0" w:space="0"/>
                 <w:lang w:val="en-US" w:eastAsia="zh-CN" w:bidi="ar"/>
               </w:rPr>
               <w:t>16.667</w:t>
@@ -8632,7 +8605,6 @@
                 <w:sz w:val="18"/>
                 <w:szCs w:val="18"/>
                 <w:u w:val="none"/>
-                <w:bdr w:val="none" w:color="auto" w:sz="0" w:space="0"/>
                 <w:lang w:val="en-US" w:eastAsia="zh-CN" w:bidi="ar"/>
               </w:rPr>
               <w:t>2.893</w:t>
@@ -8682,7 +8654,6 @@
                 <w:sz w:val="18"/>
                 <w:szCs w:val="18"/>
                 <w:u w:val="none"/>
-                <w:bdr w:val="none" w:color="auto" w:sz="0" w:space="0"/>
                 <w:lang w:val="en-US" w:eastAsia="zh-CN" w:bidi="ar"/>
               </w:rPr>
               <w:t>9.203</w:t>
@@ -8732,7 +8703,6 @@
                 <w:sz w:val="18"/>
                 <w:szCs w:val="18"/>
                 <w:u w:val="none"/>
-                <w:bdr w:val="none" w:color="auto" w:sz="0" w:space="0"/>
                 <w:lang w:val="en-US" w:eastAsia="zh-CN" w:bidi="ar"/>
               </w:rPr>
               <w:t>-0.550</w:t>
@@ -8782,7 +8752,6 @@
                 <w:sz w:val="18"/>
                 <w:szCs w:val="18"/>
                 <w:u w:val="none"/>
-                <w:bdr w:val="none" w:color="auto" w:sz="0" w:space="0"/>
                 <w:lang w:val="en-US" w:eastAsia="zh-CN" w:bidi="ar"/>
               </w:rPr>
               <w:t>0.035</w:t>
@@ -8832,7 +8801,6 @@
                 <w:sz w:val="18"/>
                 <w:szCs w:val="18"/>
                 <w:u w:val="none"/>
-                <w:bdr w:val="none" w:color="auto" w:sz="0" w:space="0"/>
                 <w:lang w:val="en-US" w:eastAsia="zh-CN" w:bidi="ar"/>
               </w:rPr>
               <w:t>-15.597</w:t>
@@ -8932,7 +8900,6 @@
                 <w:sz w:val="18"/>
                 <w:szCs w:val="18"/>
                 <w:u w:val="none"/>
-                <w:bdr w:val="none" w:color="auto" w:sz="0" w:space="0"/>
                 <w:lang w:val="en-US" w:eastAsia="zh-CN" w:bidi="ar"/>
               </w:rPr>
               <w:t>[-0.621,-0.4</w:t>
@@ -8948,7 +8915,6 @@
                 <w:sz w:val="18"/>
                 <w:szCs w:val="18"/>
                 <w:u w:val="none"/>
-                <w:bdr w:val="none" w:color="auto" w:sz="0" w:space="0"/>
                 <w:lang w:val="en-US" w:eastAsia="zh-CN" w:bidi="ar"/>
               </w:rPr>
               <w:t>00</w:t>
@@ -8964,7 +8930,6 @@
                 <w:sz w:val="18"/>
                 <w:szCs w:val="18"/>
                 <w:u w:val="none"/>
-                <w:bdr w:val="none" w:color="auto" w:sz="0" w:space="0"/>
                 <w:lang w:val="en-US" w:eastAsia="zh-CN" w:bidi="ar"/>
               </w:rPr>
               <w:t>]</w:t>
@@ -9014,7 +8979,6 @@
                 <w:sz w:val="18"/>
                 <w:szCs w:val="18"/>
                 <w:u w:val="none"/>
-                <w:bdr w:val="none" w:color="auto" w:sz="0" w:space="0"/>
                 <w:lang w:val="en-US" w:eastAsia="zh-CN" w:bidi="ar"/>
               </w:rPr>
               <w:t>100.000</w:t>
@@ -9064,7 +9028,6 @@
                 <w:sz w:val="18"/>
                 <w:szCs w:val="18"/>
                 <w:u w:val="none"/>
-                <w:bdr w:val="none" w:color="auto" w:sz="0" w:space="0"/>
                 <w:lang w:val="en-US" w:eastAsia="zh-CN" w:bidi="ar"/>
               </w:rPr>
               <w:t>0.000</w:t>
@@ -9512,8 +9475,6 @@
         </w:rPr>
         <w:t>0</w:t>
       </w:r>
-      <w:bookmarkStart w:id="0" w:name="_GoBack"/>
-      <w:bookmarkEnd w:id="0"/>
       <w:r>
         <w:rPr>
           <w:rFonts w:hint="eastAsia" w:ascii="方正仿宋_GB2312" w:hAnsi="方正仿宋_GB2312" w:eastAsia="方正仿宋_GB2312" w:cs="方正仿宋_GB2312"/>

</xml_diff>

<commit_message>
Sync from private source SHA: e043736e677d1e776377d0a0230a180202f2166a
</commit_message>
<xml_diff>
--- a/Docs/03ANOVA/ANCOVA_Case_Interaction.docx
+++ b/Docs/03ANOVA/ANCOVA_Case_Interaction.docx
@@ -2007,18 +2007,7 @@
           <w:szCs w:val="21"/>
           <w:lang w:val="en-US" w:eastAsia="zh-CN"/>
         </w:rPr>
-        <w:t>协</w:t>
-      </w:r>
-      <w:bookmarkStart w:id="0" w:name="_GoBack"/>
-      <w:bookmarkEnd w:id="0"/>
-      <w:r>
-        <w:rPr>
-          <w:rFonts w:hint="eastAsia" w:ascii="方正仿宋_GB2312" w:hAnsi="方正仿宋_GB2312" w:eastAsia="方正仿宋_GB2312" w:cs="方正仿宋_GB2312"/>
-          <w:sz w:val="21"/>
-          <w:szCs w:val="21"/>
-          <w:lang w:val="en-US" w:eastAsia="zh-CN"/>
-        </w:rPr>
-        <w:t>方差回归斜率不齐表明组间差异的大小会随协变量的取值变化而变化。为了完整保留协变量信息、明确干预效应随协变量的变化规律，构建多元回归模型（因变量：后测；自变量：分组、前测、分组*前测）并进行简单斜率分析，计算协变量取均值、均值±1标准差等典型值时的组间效应。</w:t>
+        <w:t>协方差回归斜率不齐表明组间差异的大小会随协变量的取值变化而变化。为了完整保留协变量信息、明确干预效应随协变量的变化规律，构建多元回归模型（因变量：后测；自变量：分组、前测、分组*前测）并进行简单斜率分析，计算协变量取均值、均值±1标准差等典型值时的组间效应。</w:t>
       </w:r>
     </w:p>
     <w:p>
@@ -4819,7 +4808,7 @@
           <w:szCs w:val="18"/>
           <w:lang w:val="en-US" w:eastAsia="zh-CN"/>
         </w:rPr>
-        <w:t>:M-SD,M+SD</w:t>
+        <w:t>:M-SD , M , M+SD</w:t>
       </w:r>
     </w:p>
     <w:tbl>
@@ -4845,13 +4834,14 @@
         </w:tblCellMar>
       </w:tblPr>
       <w:tblGrid>
-        <w:gridCol w:w="1217"/>
-        <w:gridCol w:w="1217"/>
-        <w:gridCol w:w="1217"/>
-        <w:gridCol w:w="1217"/>
-        <w:gridCol w:w="1217"/>
-        <w:gridCol w:w="1217"/>
-        <w:gridCol w:w="1217"/>
+        <w:gridCol w:w="1064"/>
+        <w:gridCol w:w="1065"/>
+        <w:gridCol w:w="1065"/>
+        <w:gridCol w:w="1065"/>
+        <w:gridCol w:w="1065"/>
+        <w:gridCol w:w="1065"/>
+        <w:gridCol w:w="1065"/>
+        <w:gridCol w:w="1065"/>
       </w:tblGrid>
       <w:tr>
         <w:trPr>
@@ -4859,7 +4849,7 @@
         </w:trPr>
         <w:tc>
           <w:tcPr>
-            <w:tcW w:w="714" w:type="pct"/>
+            <w:tcW w:w="625" w:type="pct"/>
             <w:tcBorders>
               <w:top w:val="single" w:color="000000" w:sz="12" w:space="0"/>
               <w:left w:val="nil"/>
@@ -4909,7 +4899,7 @@
         </w:tc>
         <w:tc>
           <w:tcPr>
-            <w:tcW w:w="714" w:type="pct"/>
+            <w:tcW w:w="625" w:type="pct"/>
             <w:tcBorders>
               <w:top w:val="single" w:color="000000" w:sz="12" w:space="0"/>
               <w:left w:val="nil"/>
@@ -4929,6 +4919,57 @@
               <w:jc w:val="center"/>
               <w:textAlignment w:val="center"/>
               <w:rPr>
+                <w:rFonts w:hint="default" w:ascii="宋体" w:hAnsi="宋体" w:eastAsia="宋体" w:cs="宋体"/>
+                <w:b w:val="0"/>
+                <w:i w:val="0"/>
+                <w:iCs w:val="0"/>
+                <w:color w:val="000000"/>
+                <w:kern w:val="0"/>
+                <w:sz w:val="18"/>
+                <w:szCs w:val="18"/>
+                <w:u w:val="none"/>
+                <w:lang w:val="en-US" w:eastAsia="zh-CN" w:bidi="ar"/>
+              </w:rPr>
+            </w:pPr>
+            <w:r>
+              <w:rPr>
+                <w:rFonts w:hint="default" w:ascii="宋体" w:hAnsi="宋体" w:eastAsia="宋体" w:cs="宋体"/>
+                <w:b w:val="0"/>
+                <w:i w:val="0"/>
+                <w:iCs w:val="0"/>
+                <w:color w:val="000000"/>
+                <w:kern w:val="0"/>
+                <w:sz w:val="18"/>
+                <w:szCs w:val="18"/>
+                <w:u w:val="none"/>
+                <w:lang w:val="en-US" w:eastAsia="zh-CN" w:bidi="ar"/>
+              </w:rPr>
+              <w:t>Pre_Raw</w:t>
+            </w:r>
+          </w:p>
+        </w:tc>
+        <w:tc>
+          <w:tcPr>
+            <w:tcW w:w="625" w:type="pct"/>
+            <w:tcBorders>
+              <w:top w:val="single" w:color="000000" w:sz="12" w:space="0"/>
+              <w:left w:val="nil"/>
+              <w:bottom w:val="single" w:color="000000" w:sz="4" w:space="0"/>
+              <w:right w:val="nil"/>
+            </w:tcBorders>
+            <w:shd w:val="clear" w:color="auto" w:fill="FFFFFF"/>
+            <w:noWrap/>
+            <w:vAlign w:val="center"/>
+          </w:tcPr>
+          <w:p>
+            <w:pPr>
+              <w:keepNext w:val="0"/>
+              <w:keepLines w:val="0"/>
+              <w:widowControl/>
+              <w:suppressLineNumbers w:val="0"/>
+              <w:jc w:val="center"/>
+              <w:textAlignment w:val="center"/>
+              <w:rPr>
                 <w:rFonts w:hint="eastAsia" w:ascii="宋体" w:hAnsi="宋体" w:eastAsia="宋体" w:cs="宋体"/>
                 <w:b w:val="0"/>
                 <w:i w:val="0"/>
@@ -4958,7 +4999,7 @@
         </w:tc>
         <w:tc>
           <w:tcPr>
-            <w:tcW w:w="714" w:type="pct"/>
+            <w:tcW w:w="625" w:type="pct"/>
             <w:tcBorders>
               <w:top w:val="single" w:color="000000" w:sz="12" w:space="0"/>
               <w:left w:val="nil"/>
@@ -5007,7 +5048,7 @@
         </w:tc>
         <w:tc>
           <w:tcPr>
-            <w:tcW w:w="714" w:type="pct"/>
+            <w:tcW w:w="625" w:type="pct"/>
             <w:tcBorders>
               <w:top w:val="single" w:color="000000" w:sz="12" w:space="0"/>
               <w:left w:val="nil"/>
@@ -5056,7 +5097,7 @@
         </w:tc>
         <w:tc>
           <w:tcPr>
-            <w:tcW w:w="714" w:type="pct"/>
+            <w:tcW w:w="625" w:type="pct"/>
             <w:tcBorders>
               <w:top w:val="single" w:color="000000" w:sz="12" w:space="0"/>
               <w:left w:val="nil"/>
@@ -5105,7 +5146,7 @@
         </w:tc>
         <w:tc>
           <w:tcPr>
-            <w:tcW w:w="714" w:type="pct"/>
+            <w:tcW w:w="625" w:type="pct"/>
             <w:tcBorders>
               <w:top w:val="single" w:color="000000" w:sz="12" w:space="0"/>
               <w:left w:val="nil"/>
@@ -5154,7 +5195,7 @@
         </w:tc>
         <w:tc>
           <w:tcPr>
-            <w:tcW w:w="714" w:type="pct"/>
+            <w:tcW w:w="625" w:type="pct"/>
             <w:tcBorders>
               <w:top w:val="single" w:color="000000" w:sz="12" w:space="0"/>
               <w:left w:val="nil"/>
@@ -5208,7 +5249,7 @@
         </w:trPr>
         <w:tc>
           <w:tcPr>
-            <w:tcW w:w="714" w:type="pct"/>
+            <w:tcW w:w="625" w:type="pct"/>
             <w:tcBorders>
               <w:top w:val="single" w:color="000000" w:sz="4" w:space="0"/>
               <w:left w:val="nil"/>
@@ -5257,7 +5298,7 @@
         </w:tc>
         <w:tc>
           <w:tcPr>
-            <w:tcW w:w="714" w:type="pct"/>
+            <w:tcW w:w="625" w:type="pct"/>
             <w:tcBorders>
               <w:top w:val="single" w:color="000000" w:sz="4" w:space="0"/>
               <w:left w:val="nil"/>
@@ -5277,6 +5318,57 @@
               <w:jc w:val="center"/>
               <w:textAlignment w:val="center"/>
               <w:rPr>
+                <w:rFonts w:hint="default" w:ascii="宋体" w:hAnsi="宋体" w:eastAsia="宋体" w:cs="宋体"/>
+                <w:b w:val="0"/>
+                <w:i w:val="0"/>
+                <w:iCs w:val="0"/>
+                <w:color w:val="000000"/>
+                <w:kern w:val="0"/>
+                <w:sz w:val="18"/>
+                <w:szCs w:val="18"/>
+                <w:u w:val="none"/>
+                <w:lang w:val="en-US" w:eastAsia="zh-CN" w:bidi="ar"/>
+              </w:rPr>
+            </w:pPr>
+            <w:r>
+              <w:rPr>
+                <w:rFonts w:hint="default" w:ascii="宋体" w:hAnsi="宋体" w:eastAsia="宋体" w:cs="宋体"/>
+                <w:b w:val="0"/>
+                <w:i w:val="0"/>
+                <w:iCs w:val="0"/>
+                <w:color w:val="000000"/>
+                <w:kern w:val="0"/>
+                <w:sz w:val="18"/>
+                <w:szCs w:val="18"/>
+                <w:u w:val="none"/>
+                <w:lang w:val="en-US" w:eastAsia="zh-CN" w:bidi="ar"/>
+              </w:rPr>
+              <w:t>4.571</w:t>
+            </w:r>
+          </w:p>
+        </w:tc>
+        <w:tc>
+          <w:tcPr>
+            <w:tcW w:w="625" w:type="pct"/>
+            <w:tcBorders>
+              <w:top w:val="single" w:color="000000" w:sz="4" w:space="0"/>
+              <w:left w:val="nil"/>
+              <w:bottom w:val="nil"/>
+              <w:right w:val="nil"/>
+            </w:tcBorders>
+            <w:shd w:val="clear" w:color="auto" w:fill="FFFFFF"/>
+            <w:noWrap/>
+            <w:vAlign w:val="center"/>
+          </w:tcPr>
+          <w:p>
+            <w:pPr>
+              <w:keepNext w:val="0"/>
+              <w:keepLines w:val="0"/>
+              <w:widowControl/>
+              <w:suppressLineNumbers w:val="0"/>
+              <w:jc w:val="center"/>
+              <w:textAlignment w:val="center"/>
+              <w:rPr>
                 <w:rFonts w:hint="eastAsia" w:ascii="宋体" w:hAnsi="宋体" w:eastAsia="宋体" w:cs="宋体"/>
                 <w:b w:val="0"/>
                 <w:i w:val="0"/>
@@ -5306,7 +5398,7 @@
         </w:tc>
         <w:tc>
           <w:tcPr>
-            <w:tcW w:w="714" w:type="pct"/>
+            <w:tcW w:w="625" w:type="pct"/>
             <w:tcBorders>
               <w:top w:val="single" w:color="000000" w:sz="4" w:space="0"/>
               <w:left w:val="nil"/>
@@ -5355,7 +5447,7 @@
         </w:tc>
         <w:tc>
           <w:tcPr>
-            <w:tcW w:w="714" w:type="pct"/>
+            <w:tcW w:w="625" w:type="pct"/>
             <w:tcBorders>
               <w:top w:val="single" w:color="000000" w:sz="4" w:space="0"/>
               <w:left w:val="nil"/>
@@ -5404,7 +5496,7 @@
         </w:tc>
         <w:tc>
           <w:tcPr>
-            <w:tcW w:w="714" w:type="pct"/>
+            <w:tcW w:w="625" w:type="pct"/>
             <w:tcBorders>
               <w:top w:val="single" w:color="000000" w:sz="4" w:space="0"/>
               <w:left w:val="nil"/>
@@ -5452,7 +5544,7 @@
         </w:tc>
         <w:tc>
           <w:tcPr>
-            <w:tcW w:w="714" w:type="pct"/>
+            <w:tcW w:w="625" w:type="pct"/>
             <w:tcBorders>
               <w:top w:val="single" w:color="000000" w:sz="4" w:space="0"/>
               <w:left w:val="nil"/>
@@ -5501,7 +5593,7 @@
         </w:tc>
         <w:tc>
           <w:tcPr>
-            <w:tcW w:w="714" w:type="pct"/>
+            <w:tcW w:w="625" w:type="pct"/>
             <w:tcBorders>
               <w:top w:val="single" w:color="000000" w:sz="4" w:space="0"/>
               <w:left w:val="nil"/>
@@ -5555,7 +5647,7 @@
         </w:trPr>
         <w:tc>
           <w:tcPr>
-            <w:tcW w:w="714" w:type="pct"/>
+            <w:tcW w:w="625" w:type="pct"/>
             <w:tcBorders>
               <w:top w:val="nil"/>
               <w:left w:val="nil"/>
@@ -5620,7 +5712,7 @@
         </w:tc>
         <w:tc>
           <w:tcPr>
-            <w:tcW w:w="714" w:type="pct"/>
+            <w:tcW w:w="625" w:type="pct"/>
             <w:tcBorders>
               <w:top w:val="nil"/>
               <w:left w:val="nil"/>
@@ -5640,6 +5732,57 @@
               <w:jc w:val="center"/>
               <w:textAlignment w:val="center"/>
               <w:rPr>
+                <w:rFonts w:hint="default" w:ascii="宋体" w:hAnsi="宋体" w:eastAsia="宋体" w:cs="宋体"/>
+                <w:b w:val="0"/>
+                <w:i w:val="0"/>
+                <w:iCs w:val="0"/>
+                <w:color w:val="000000"/>
+                <w:kern w:val="0"/>
+                <w:sz w:val="18"/>
+                <w:szCs w:val="18"/>
+                <w:u w:val="none"/>
+                <w:lang w:val="en-US" w:eastAsia="zh-CN" w:bidi="ar"/>
+              </w:rPr>
+            </w:pPr>
+            <w:r>
+              <w:rPr>
+                <w:rFonts w:hint="default" w:ascii="宋体" w:hAnsi="宋体" w:eastAsia="宋体" w:cs="宋体"/>
+                <w:b w:val="0"/>
+                <w:i w:val="0"/>
+                <w:iCs w:val="0"/>
+                <w:color w:val="000000"/>
+                <w:kern w:val="0"/>
+                <w:sz w:val="18"/>
+                <w:szCs w:val="18"/>
+                <w:u w:val="none"/>
+                <w:lang w:val="en-US" w:eastAsia="zh-CN" w:bidi="ar"/>
+              </w:rPr>
+              <w:t>6.310</w:t>
+            </w:r>
+          </w:p>
+        </w:tc>
+        <w:tc>
+          <w:tcPr>
+            <w:tcW w:w="625" w:type="pct"/>
+            <w:tcBorders>
+              <w:top w:val="nil"/>
+              <w:left w:val="nil"/>
+              <w:bottom w:val="nil"/>
+              <w:right w:val="nil"/>
+            </w:tcBorders>
+            <w:shd w:val="clear" w:color="auto" w:fill="FFFFFF"/>
+            <w:noWrap/>
+            <w:vAlign w:val="center"/>
+          </w:tcPr>
+          <w:p>
+            <w:pPr>
+              <w:keepNext w:val="0"/>
+              <w:keepLines w:val="0"/>
+              <w:widowControl/>
+              <w:suppressLineNumbers w:val="0"/>
+              <w:jc w:val="center"/>
+              <w:textAlignment w:val="center"/>
+              <w:rPr>
                 <w:rFonts w:hint="eastAsia" w:ascii="宋体" w:hAnsi="宋体" w:eastAsia="宋体" w:cs="宋体"/>
                 <w:b w:val="0"/>
                 <w:i w:val="0"/>
@@ -5669,7 +5812,7 @@
         </w:tc>
         <w:tc>
           <w:tcPr>
-            <w:tcW w:w="714" w:type="pct"/>
+            <w:tcW w:w="625" w:type="pct"/>
             <w:tcBorders>
               <w:top w:val="nil"/>
               <w:left w:val="nil"/>
@@ -5718,7 +5861,7 @@
         </w:tc>
         <w:tc>
           <w:tcPr>
-            <w:tcW w:w="714" w:type="pct"/>
+            <w:tcW w:w="625" w:type="pct"/>
             <w:tcBorders>
               <w:top w:val="nil"/>
               <w:left w:val="nil"/>
@@ -5767,7 +5910,7 @@
         </w:tc>
         <w:tc>
           <w:tcPr>
-            <w:tcW w:w="714" w:type="pct"/>
+            <w:tcW w:w="625" w:type="pct"/>
             <w:tcBorders>
               <w:top w:val="nil"/>
               <w:left w:val="nil"/>
@@ -5815,7 +5958,7 @@
         </w:tc>
         <w:tc>
           <w:tcPr>
-            <w:tcW w:w="714" w:type="pct"/>
+            <w:tcW w:w="625" w:type="pct"/>
             <w:tcBorders>
               <w:top w:val="nil"/>
               <w:left w:val="nil"/>
@@ -5864,7 +6007,7 @@
         </w:tc>
         <w:tc>
           <w:tcPr>
-            <w:tcW w:w="714" w:type="pct"/>
+            <w:tcW w:w="625" w:type="pct"/>
             <w:tcBorders>
               <w:top w:val="nil"/>
               <w:left w:val="nil"/>
@@ -5934,7 +6077,7 @@
         </w:trPr>
         <w:tc>
           <w:tcPr>
-            <w:tcW w:w="714" w:type="pct"/>
+            <w:tcW w:w="625" w:type="pct"/>
             <w:tcBorders>
               <w:top w:val="nil"/>
               <w:left w:val="nil"/>
@@ -5983,7 +6126,7 @@
         </w:tc>
         <w:tc>
           <w:tcPr>
-            <w:tcW w:w="714" w:type="pct"/>
+            <w:tcW w:w="625" w:type="pct"/>
             <w:tcBorders>
               <w:top w:val="nil"/>
               <w:left w:val="nil"/>
@@ -6003,6 +6146,57 @@
               <w:jc w:val="center"/>
               <w:textAlignment w:val="center"/>
               <w:rPr>
+                <w:rFonts w:hint="default" w:ascii="宋体" w:hAnsi="宋体" w:eastAsia="宋体" w:cs="宋体"/>
+                <w:b w:val="0"/>
+                <w:i w:val="0"/>
+                <w:iCs w:val="0"/>
+                <w:color w:val="000000"/>
+                <w:kern w:val="0"/>
+                <w:sz w:val="18"/>
+                <w:szCs w:val="18"/>
+                <w:u w:val="none"/>
+                <w:lang w:val="en-US" w:eastAsia="zh-CN" w:bidi="ar"/>
+              </w:rPr>
+            </w:pPr>
+            <w:r>
+              <w:rPr>
+                <w:rFonts w:hint="default" w:ascii="宋体" w:hAnsi="宋体" w:eastAsia="宋体" w:cs="宋体"/>
+                <w:b w:val="0"/>
+                <w:i w:val="0"/>
+                <w:iCs w:val="0"/>
+                <w:color w:val="000000"/>
+                <w:kern w:val="0"/>
+                <w:sz w:val="18"/>
+                <w:szCs w:val="18"/>
+                <w:u w:val="none"/>
+                <w:lang w:val="en-US" w:eastAsia="zh-CN" w:bidi="ar"/>
+              </w:rPr>
+              <w:t>8.049</w:t>
+            </w:r>
+          </w:p>
+        </w:tc>
+        <w:tc>
+          <w:tcPr>
+            <w:tcW w:w="625" w:type="pct"/>
+            <w:tcBorders>
+              <w:top w:val="nil"/>
+              <w:left w:val="nil"/>
+              <w:bottom w:val="single" w:color="000000" w:sz="12" w:space="0"/>
+              <w:right w:val="nil"/>
+            </w:tcBorders>
+            <w:shd w:val="clear" w:color="auto" w:fill="FFFFFF"/>
+            <w:noWrap/>
+            <w:vAlign w:val="center"/>
+          </w:tcPr>
+          <w:p>
+            <w:pPr>
+              <w:keepNext w:val="0"/>
+              <w:keepLines w:val="0"/>
+              <w:widowControl/>
+              <w:suppressLineNumbers w:val="0"/>
+              <w:jc w:val="center"/>
+              <w:textAlignment w:val="center"/>
+              <w:rPr>
                 <w:rFonts w:hint="eastAsia" w:ascii="宋体" w:hAnsi="宋体" w:eastAsia="宋体" w:cs="宋体"/>
                 <w:b w:val="0"/>
                 <w:i w:val="0"/>
@@ -6032,7 +6226,7 @@
         </w:tc>
         <w:tc>
           <w:tcPr>
-            <w:tcW w:w="714" w:type="pct"/>
+            <w:tcW w:w="625" w:type="pct"/>
             <w:tcBorders>
               <w:top w:val="nil"/>
               <w:left w:val="nil"/>
@@ -6081,7 +6275,7 @@
         </w:tc>
         <w:tc>
           <w:tcPr>
-            <w:tcW w:w="714" w:type="pct"/>
+            <w:tcW w:w="625" w:type="pct"/>
             <w:tcBorders>
               <w:top w:val="nil"/>
               <w:left w:val="nil"/>
@@ -6130,7 +6324,7 @@
         </w:tc>
         <w:tc>
           <w:tcPr>
-            <w:tcW w:w="714" w:type="pct"/>
+            <w:tcW w:w="625" w:type="pct"/>
             <w:tcBorders>
               <w:top w:val="nil"/>
               <w:left w:val="nil"/>
@@ -6178,7 +6372,7 @@
         </w:tc>
         <w:tc>
           <w:tcPr>
-            <w:tcW w:w="714" w:type="pct"/>
+            <w:tcW w:w="625" w:type="pct"/>
             <w:tcBorders>
               <w:top w:val="nil"/>
               <w:left w:val="nil"/>
@@ -6243,7 +6437,7 @@
         </w:tc>
         <w:tc>
           <w:tcPr>
-            <w:tcW w:w="714" w:type="pct"/>
+            <w:tcW w:w="625" w:type="pct"/>
             <w:tcBorders>
               <w:top w:val="nil"/>
               <w:left w:val="nil"/>
@@ -6431,7 +6625,63 @@
           <w:szCs w:val="21"/>
           <w:lang w:val="en-US" w:eastAsia="zh-CN"/>
         </w:rPr>
-        <w:t>简单斜率分析结果（表3、图1）显示，前测得分对分组与后测的关系存在显著调节效应，三个典型前测水平下的组间差异均具有统计学显著性（p &lt; .001）：低前测水平（中心化后取值-1.739，对应原始分4.6分，低于样本均值1个标准差）：实验组后测得分显著高于对照组2.306分，95%CI[2.254, 2.357]；中等前测水平（中心化后取值0，对应原始分6.3分，为样本均值水平）：实验组后测得分显著高于对照组1.233分，95%CI[1.197, 1.270]；高前测水平（中心化后取值1.739，对应原始分8.0分，高于样本均值1个标准差）：实验组后测得分仍显著高于对照组0.161分，95%CI[0.110, 0.213]。</w:t>
+        <w:t>简单斜率分析结果（表3、图1）显示，前测得分对分组与后测的关系存在显著调节效应，三个典型前测水平下的组间差异均具有统计学显著性（p &lt; .001）：低前测水平（中心化后取值-1.739，对应原始分4.</w:t>
+      </w:r>
+      <w:r>
+        <w:rPr>
+          <w:rFonts w:hint="default" w:ascii="方正仿宋_GB2312" w:hAnsi="方正仿宋_GB2312" w:eastAsia="方正仿宋_GB2312" w:cs="方正仿宋_GB2312"/>
+          <w:sz w:val="21"/>
+          <w:szCs w:val="21"/>
+          <w:lang w:val="en-US" w:eastAsia="zh-CN"/>
+        </w:rPr>
+        <w:t>571</w:t>
+      </w:r>
+      <w:r>
+        <w:rPr>
+          <w:rFonts w:hint="eastAsia" w:ascii="方正仿宋_GB2312" w:hAnsi="方正仿宋_GB2312" w:eastAsia="方正仿宋_GB2312" w:cs="方正仿宋_GB2312"/>
+          <w:sz w:val="21"/>
+          <w:szCs w:val="21"/>
+          <w:lang w:val="en-US" w:eastAsia="zh-CN"/>
+        </w:rPr>
+        <w:t>分，低于样本均值1个标准差）：实验组后测得分显著高于对照组2.306分，95%CI[2.254, 2.357]；中等前测水平（中心化后取值0，对应原始分6.3</w:t>
+      </w:r>
+      <w:r>
+        <w:rPr>
+          <w:rFonts w:hint="default" w:ascii="方正仿宋_GB2312" w:hAnsi="方正仿宋_GB2312" w:eastAsia="方正仿宋_GB2312" w:cs="方正仿宋_GB2312"/>
+          <w:sz w:val="21"/>
+          <w:szCs w:val="21"/>
+          <w:lang w:val="en-US" w:eastAsia="zh-CN"/>
+        </w:rPr>
+        <w:t>10</w:t>
+      </w:r>
+      <w:r>
+        <w:rPr>
+          <w:rFonts w:hint="eastAsia" w:ascii="方正仿宋_GB2312" w:hAnsi="方正仿宋_GB2312" w:eastAsia="方正仿宋_GB2312" w:cs="方正仿宋_GB2312"/>
+          <w:sz w:val="21"/>
+          <w:szCs w:val="21"/>
+          <w:lang w:val="en-US" w:eastAsia="zh-CN"/>
+        </w:rPr>
+        <w:t>分，为样本均值水平）：实验组后测得分显著高于对照组1.233分，95%CI[1.197, 1.270]；高前测水平（中心化后取值1.739，对应原始分8.0</w:t>
+      </w:r>
+      <w:r>
+        <w:rPr>
+          <w:rFonts w:hint="default" w:ascii="方正仿宋_GB2312" w:hAnsi="方正仿宋_GB2312" w:eastAsia="方正仿宋_GB2312" w:cs="方正仿宋_GB2312"/>
+          <w:sz w:val="21"/>
+          <w:szCs w:val="21"/>
+          <w:lang w:val="en-US" w:eastAsia="zh-CN"/>
+        </w:rPr>
+        <w:t>49</w:t>
+      </w:r>
+      <w:bookmarkStart w:id="0" w:name="_GoBack"/>
+      <w:bookmarkEnd w:id="0"/>
+      <w:r>
+        <w:rPr>
+          <w:rFonts w:hint="eastAsia" w:ascii="方正仿宋_GB2312" w:hAnsi="方正仿宋_GB2312" w:eastAsia="方正仿宋_GB2312" w:cs="方正仿宋_GB2312"/>
+          <w:sz w:val="21"/>
+          <w:szCs w:val="21"/>
+          <w:lang w:val="en-US" w:eastAsia="zh-CN"/>
+        </w:rPr>
+        <w:t>分，高于样本均值1个标准差）：实验组后测得分仍显著高于对照组0.161分，95%CI[0.110, 0.213]。</w:t>
       </w:r>
     </w:p>
     <w:p>

</xml_diff>

<commit_message>
Sync from private source SHA: 0c05d7fdeffa973b7fd6cbd92b9a96c31b7d6b1a
</commit_message>
<xml_diff>
--- a/Docs/03ANOVA/ANCOVA_Case_Interaction.docx
+++ b/Docs/03ANOVA/ANCOVA_Case_Interaction.docx
@@ -6672,8 +6672,6 @@
         </w:rPr>
         <w:t>49</w:t>
       </w:r>
-      <w:bookmarkStart w:id="0" w:name="_GoBack"/>
-      <w:bookmarkEnd w:id="0"/>
       <w:r>
         <w:rPr>
           <w:rFonts w:hint="eastAsia" w:ascii="方正仿宋_GB2312" w:hAnsi="方正仿宋_GB2312" w:eastAsia="方正仿宋_GB2312" w:cs="方正仿宋_GB2312"/>
@@ -6933,7 +6931,7 @@
     <w:tbl>
       <w:tblPr>
         <w:tblStyle w:val="2"/>
-        <w:tblW w:w="4997" w:type="pct"/>
+        <w:tblW w:w="4996" w:type="pct"/>
         <w:tblInd w:w="0" w:type="dxa"/>
         <w:tblBorders>
           <w:top w:val="none" w:color="auto" w:sz="0" w:space="0"/>
@@ -6953,15 +6951,16 @@
         </w:tblCellMar>
       </w:tblPr>
       <w:tblGrid>
-        <w:gridCol w:w="880"/>
-        <w:gridCol w:w="880"/>
-        <w:gridCol w:w="880"/>
-        <w:gridCol w:w="880"/>
-        <w:gridCol w:w="881"/>
-        <w:gridCol w:w="881"/>
+        <w:gridCol w:w="795"/>
+        <w:gridCol w:w="740"/>
+        <w:gridCol w:w="740"/>
+        <w:gridCol w:w="740"/>
+        <w:gridCol w:w="810"/>
+        <w:gridCol w:w="740"/>
         <w:gridCol w:w="1368"/>
-        <w:gridCol w:w="949"/>
-        <w:gridCol w:w="918"/>
+        <w:gridCol w:w="824"/>
+        <w:gridCol w:w="843"/>
+        <w:gridCol w:w="915"/>
       </w:tblGrid>
       <w:tr>
         <w:trPr>
@@ -6969,7 +6968,7 @@
         </w:trPr>
         <w:tc>
           <w:tcPr>
-            <w:tcW w:w="527" w:type="pct"/>
+            <w:tcW w:w="466" w:type="pct"/>
             <w:tcBorders>
               <w:top w:val="single" w:color="000000" w:sz="12" w:space="0"/>
               <w:left w:val="nil"/>
@@ -7019,7 +7018,7 @@
         </w:tc>
         <w:tc>
           <w:tcPr>
-            <w:tcW w:w="527" w:type="pct"/>
+            <w:tcW w:w="466" w:type="pct"/>
             <w:tcBorders>
               <w:top w:val="single" w:color="000000" w:sz="12" w:space="0"/>
               <w:left w:val="nil"/>
@@ -7068,7 +7067,7 @@
         </w:tc>
         <w:tc>
           <w:tcPr>
-            <w:tcW w:w="527" w:type="pct"/>
+            <w:tcW w:w="466" w:type="pct"/>
             <w:tcBorders>
               <w:top w:val="single" w:color="000000" w:sz="12" w:space="0"/>
               <w:left w:val="nil"/>
@@ -7117,7 +7116,7 @@
         </w:tc>
         <w:tc>
           <w:tcPr>
-            <w:tcW w:w="527" w:type="pct"/>
+            <w:tcW w:w="466" w:type="pct"/>
             <w:tcBorders>
               <w:top w:val="single" w:color="000000" w:sz="12" w:space="0"/>
               <w:left w:val="nil"/>
@@ -7166,7 +7165,7 @@
         </w:tc>
         <w:tc>
           <w:tcPr>
-            <w:tcW w:w="527" w:type="pct"/>
+            <w:tcW w:w="466" w:type="pct"/>
             <w:tcBorders>
               <w:top w:val="single" w:color="000000" w:sz="12" w:space="0"/>
               <w:left w:val="nil"/>
@@ -7215,7 +7214,7 @@
         </w:tc>
         <w:tc>
           <w:tcPr>
-            <w:tcW w:w="527" w:type="pct"/>
+            <w:tcW w:w="466" w:type="pct"/>
             <w:tcBorders>
               <w:top w:val="single" w:color="000000" w:sz="12" w:space="0"/>
               <w:left w:val="nil"/>
@@ -7264,7 +7263,7 @@
         </w:tc>
         <w:tc>
           <w:tcPr>
-            <w:tcW w:w="716" w:type="pct"/>
+            <w:tcW w:w="725" w:type="pct"/>
             <w:tcBorders>
               <w:top w:val="single" w:color="000000" w:sz="12" w:space="0"/>
               <w:left w:val="nil"/>
@@ -7313,7 +7312,7 @@
         </w:tc>
         <w:tc>
           <w:tcPr>
-            <w:tcW w:w="567" w:type="pct"/>
+            <w:tcW w:w="503" w:type="pct"/>
             <w:tcBorders>
               <w:top w:val="single" w:color="000000" w:sz="12" w:space="0"/>
               <w:left w:val="nil"/>
@@ -7362,7 +7361,7 @@
         </w:tc>
         <w:tc>
           <w:tcPr>
-            <w:tcW w:w="549" w:type="pct"/>
+            <w:tcW w:w="486" w:type="pct"/>
             <w:tcBorders>
               <w:top w:val="single" w:color="000000" w:sz="12" w:space="0"/>
               <w:left w:val="nil"/>
@@ -7406,6 +7405,73 @@
                 <w:lang w:val="en-US" w:eastAsia="zh-CN" w:bidi="ar"/>
               </w:rPr>
               <w:t>% Above</w:t>
+            </w:r>
+          </w:p>
+        </w:tc>
+        <w:tc>
+          <w:tcPr>
+            <w:tcW w:w="486" w:type="pct"/>
+            <w:tcBorders>
+              <w:top w:val="single" w:color="000000" w:sz="12" w:space="0"/>
+              <w:left w:val="nil"/>
+              <w:bottom w:val="single" w:color="000000" w:sz="4" w:space="0"/>
+              <w:right w:val="nil"/>
+            </w:tcBorders>
+            <w:shd w:val="clear" w:color="auto" w:fill="FFFFFF"/>
+            <w:noWrap/>
+            <w:vAlign w:val="center"/>
+          </w:tcPr>
+          <w:p>
+            <w:pPr>
+              <w:keepNext w:val="0"/>
+              <w:keepLines w:val="0"/>
+              <w:widowControl/>
+              <w:suppressLineNumbers w:val="0"/>
+              <w:jc w:val="center"/>
+              <w:textAlignment w:val="center"/>
+              <w:rPr>
+                <w:rFonts w:hint="eastAsia" w:ascii="宋体" w:hAnsi="宋体" w:eastAsia="宋体" w:cs="宋体"/>
+                <w:b w:val="0"/>
+                <w:i w:val="0"/>
+                <w:iCs w:val="0"/>
+                <w:color w:val="000000"/>
+                <w:kern w:val="0"/>
+                <w:sz w:val="18"/>
+                <w:szCs w:val="18"/>
+                <w:u w:val="none"/>
+                <w:lang w:val="en-US" w:eastAsia="zh-CN" w:bidi="ar"/>
+              </w:rPr>
+            </w:pPr>
+            <w:r>
+              <w:rPr>
+                <w:rFonts w:hint="default" w:ascii="宋体" w:hAnsi="宋体" w:eastAsia="宋体" w:cs="宋体"/>
+                <w:b w:val="0"/>
+                <w:i w:val="0"/>
+                <w:iCs w:val="0"/>
+                <w:color w:val="000000"/>
+                <w:kern w:val="0"/>
+                <w:sz w:val="18"/>
+                <w:szCs w:val="18"/>
+                <w:u w:val="none"/>
+                <w:lang w:val="en-US" w:eastAsia="zh-CN" w:bidi="ar"/>
+              </w:rPr>
+              <w:t>Note</w:t>
+            </w:r>
+            <w:r>
+              <w:rPr>
+                <w:rFonts w:hint="eastAsia" w:ascii="PingFang SC" w:hAnsi="PingFang SC" w:eastAsia="PingFang SC" w:cs="PingFang SC"/>
+                <w:b w:val="0"/>
+                <w:i w:val="0"/>
+                <w:iCs w:val="0"/>
+                <w:color w:val="000000"/>
+                <w:kern w:val="0"/>
+                <w:sz w:val="18"/>
+                <w:szCs w:val="18"/>
+                <w:u w:val="none"/>
+                <w:vertAlign w:val="superscript"/>
+                <w:lang w:val="en-US" w:eastAsia="zh-CN" w:bidi="ar"/>
+              </w:rPr>
+              <w:t>①</w:t>
             </w:r>
           </w:p>
         </w:tc>
@@ -7416,7 +7482,7 @@
         </w:trPr>
         <w:tc>
           <w:tcPr>
-            <w:tcW w:w="527" w:type="pct"/>
+            <w:tcW w:w="466" w:type="pct"/>
             <w:tcBorders>
               <w:top w:val="single" w:color="000000" w:sz="4" w:space="0"/>
               <w:left w:val="nil"/>
@@ -7465,7 +7531,7 @@
         </w:tc>
         <w:tc>
           <w:tcPr>
-            <w:tcW w:w="527" w:type="pct"/>
+            <w:tcW w:w="466" w:type="pct"/>
             <w:tcBorders>
               <w:top w:val="single" w:color="000000" w:sz="4" w:space="0"/>
               <w:left w:val="nil"/>
@@ -7514,7 +7580,7 @@
         </w:tc>
         <w:tc>
           <w:tcPr>
-            <w:tcW w:w="527" w:type="pct"/>
+            <w:tcW w:w="466" w:type="pct"/>
             <w:tcBorders>
               <w:top w:val="single" w:color="000000" w:sz="4" w:space="0"/>
               <w:left w:val="nil"/>
@@ -7563,7 +7629,7 @@
         </w:tc>
         <w:tc>
           <w:tcPr>
-            <w:tcW w:w="527" w:type="pct"/>
+            <w:tcW w:w="466" w:type="pct"/>
             <w:tcBorders>
               <w:top w:val="single" w:color="000000" w:sz="4" w:space="0"/>
               <w:left w:val="nil"/>
@@ -7612,7 +7678,7 @@
         </w:tc>
         <w:tc>
           <w:tcPr>
-            <w:tcW w:w="527" w:type="pct"/>
+            <w:tcW w:w="466" w:type="pct"/>
             <w:tcBorders>
               <w:top w:val="single" w:color="000000" w:sz="4" w:space="0"/>
               <w:left w:val="nil"/>
@@ -7661,7 +7727,7 @@
         </w:tc>
         <w:tc>
           <w:tcPr>
-            <w:tcW w:w="527" w:type="pct"/>
+            <w:tcW w:w="466" w:type="pct"/>
             <w:tcBorders>
               <w:top w:val="single" w:color="000000" w:sz="4" w:space="0"/>
               <w:left w:val="nil"/>
@@ -7710,7 +7776,7 @@
         </w:tc>
         <w:tc>
           <w:tcPr>
-            <w:tcW w:w="716" w:type="pct"/>
+            <w:tcW w:w="725" w:type="pct"/>
             <w:tcBorders>
               <w:top w:val="single" w:color="000000" w:sz="4" w:space="0"/>
               <w:left w:val="nil"/>
@@ -7759,7 +7825,7 @@
         </w:tc>
         <w:tc>
           <w:tcPr>
-            <w:tcW w:w="567" w:type="pct"/>
+            <w:tcW w:w="503" w:type="pct"/>
             <w:tcBorders>
               <w:top w:val="single" w:color="000000" w:sz="4" w:space="0"/>
               <w:left w:val="nil"/>
@@ -7808,7 +7874,7 @@
         </w:tc>
         <w:tc>
           <w:tcPr>
-            <w:tcW w:w="549" w:type="pct"/>
+            <w:tcW w:w="486" w:type="pct"/>
             <w:tcBorders>
               <w:top w:val="single" w:color="000000" w:sz="4" w:space="0"/>
               <w:left w:val="nil"/>
@@ -7852,6 +7918,57 @@
                 <w:lang w:val="en-US" w:eastAsia="zh-CN" w:bidi="ar"/>
               </w:rPr>
               <w:t>98.333</w:t>
+            </w:r>
+          </w:p>
+        </w:tc>
+        <w:tc>
+          <w:tcPr>
+            <w:tcW w:w="486" w:type="pct"/>
+            <w:tcBorders>
+              <w:top w:val="single" w:color="000000" w:sz="4" w:space="0"/>
+              <w:left w:val="nil"/>
+              <w:bottom w:val="nil"/>
+              <w:right w:val="nil"/>
+            </w:tcBorders>
+            <w:shd w:val="clear" w:color="auto" w:fill="FFFFFF"/>
+            <w:noWrap/>
+            <w:vAlign w:val="center"/>
+          </w:tcPr>
+          <w:p>
+            <w:pPr>
+              <w:keepNext w:val="0"/>
+              <w:keepLines w:val="0"/>
+              <w:widowControl/>
+              <w:suppressLineNumbers w:val="0"/>
+              <w:jc w:val="center"/>
+              <w:textAlignment w:val="center"/>
+              <w:rPr>
+                <w:rFonts w:hint="default" w:ascii="宋体" w:hAnsi="宋体" w:eastAsia="宋体" w:cs="宋体"/>
+                <w:b w:val="0"/>
+                <w:i w:val="0"/>
+                <w:iCs w:val="0"/>
+                <w:color w:val="000000"/>
+                <w:kern w:val="0"/>
+                <w:sz w:val="18"/>
+                <w:szCs w:val="18"/>
+                <w:u w:val="none"/>
+                <w:lang w:val="en-US" w:eastAsia="zh-CN" w:bidi="ar"/>
+              </w:rPr>
+            </w:pPr>
+            <w:r>
+              <w:rPr>
+                <w:rFonts w:hint="default" w:ascii="宋体" w:hAnsi="宋体" w:eastAsia="宋体" w:cs="宋体"/>
+                <w:b w:val="0"/>
+                <w:i w:val="0"/>
+                <w:iCs w:val="0"/>
+                <w:color w:val="000000"/>
+                <w:kern w:val="0"/>
+                <w:sz w:val="18"/>
+                <w:szCs w:val="18"/>
+                <w:u w:val="none"/>
+                <w:lang w:val="en-US" w:eastAsia="zh-CN" w:bidi="ar"/>
+              </w:rPr>
+              <w:t>Minimum</w:t>
             </w:r>
           </w:p>
         </w:tc>
@@ -7862,7 +7979,7 @@
         </w:trPr>
         <w:tc>
           <w:tcPr>
-            <w:tcW w:w="527" w:type="pct"/>
+            <w:tcW w:w="466" w:type="pct"/>
             <w:tcBorders>
               <w:top w:val="nil"/>
               <w:left w:val="nil"/>
@@ -7911,7 +8028,7 @@
         </w:tc>
         <w:tc>
           <w:tcPr>
-            <w:tcW w:w="527" w:type="pct"/>
+            <w:tcW w:w="466" w:type="pct"/>
             <w:tcBorders>
               <w:top w:val="nil"/>
               <w:left w:val="nil"/>
@@ -7960,7 +8077,7 @@
         </w:tc>
         <w:tc>
           <w:tcPr>
-            <w:tcW w:w="527" w:type="pct"/>
+            <w:tcW w:w="466" w:type="pct"/>
             <w:tcBorders>
               <w:top w:val="nil"/>
               <w:left w:val="nil"/>
@@ -8009,7 +8126,7 @@
         </w:tc>
         <w:tc>
           <w:tcPr>
-            <w:tcW w:w="527" w:type="pct"/>
+            <w:tcW w:w="466" w:type="pct"/>
             <w:tcBorders>
               <w:top w:val="nil"/>
               <w:left w:val="nil"/>
@@ -8058,7 +8175,7 @@
         </w:tc>
         <w:tc>
           <w:tcPr>
-            <w:tcW w:w="527" w:type="pct"/>
+            <w:tcW w:w="466" w:type="pct"/>
             <w:tcBorders>
               <w:top w:val="nil"/>
               <w:left w:val="nil"/>
@@ -8107,7 +8224,7 @@
         </w:tc>
         <w:tc>
           <w:tcPr>
-            <w:tcW w:w="527" w:type="pct"/>
+            <w:tcW w:w="466" w:type="pct"/>
             <w:tcBorders>
               <w:top w:val="nil"/>
               <w:left w:val="nil"/>
@@ -8156,7 +8273,7 @@
         </w:tc>
         <w:tc>
           <w:tcPr>
-            <w:tcW w:w="716" w:type="pct"/>
+            <w:tcW w:w="725" w:type="pct"/>
             <w:tcBorders>
               <w:top w:val="nil"/>
               <w:left w:val="nil"/>
@@ -8235,7 +8352,7 @@
         </w:tc>
         <w:tc>
           <w:tcPr>
-            <w:tcW w:w="567" w:type="pct"/>
+            <w:tcW w:w="503" w:type="pct"/>
             <w:tcBorders>
               <w:top w:val="nil"/>
               <w:left w:val="nil"/>
@@ -8284,7 +8401,7 @@
         </w:tc>
         <w:tc>
           <w:tcPr>
-            <w:tcW w:w="549" w:type="pct"/>
+            <w:tcW w:w="486" w:type="pct"/>
             <w:tcBorders>
               <w:top w:val="nil"/>
               <w:left w:val="nil"/>
@@ -8328,6 +8445,57 @@
                 <w:lang w:val="en-US" w:eastAsia="zh-CN" w:bidi="ar"/>
               </w:rPr>
               <w:t>18.333</w:t>
+            </w:r>
+          </w:p>
+        </w:tc>
+        <w:tc>
+          <w:tcPr>
+            <w:tcW w:w="486" w:type="pct"/>
+            <w:tcBorders>
+              <w:top w:val="nil"/>
+              <w:left w:val="nil"/>
+              <w:bottom w:val="nil"/>
+              <w:right w:val="nil"/>
+            </w:tcBorders>
+            <w:shd w:val="clear" w:color="auto" w:fill="FFFFFF"/>
+            <w:noWrap/>
+            <w:vAlign w:val="center"/>
+          </w:tcPr>
+          <w:p>
+            <w:pPr>
+              <w:keepNext w:val="0"/>
+              <w:keepLines w:val="0"/>
+              <w:widowControl/>
+              <w:suppressLineNumbers w:val="0"/>
+              <w:jc w:val="center"/>
+              <w:textAlignment w:val="center"/>
+              <w:rPr>
+                <w:rFonts w:hint="default" w:ascii="宋体" w:hAnsi="宋体" w:eastAsia="宋体" w:cs="宋体"/>
+                <w:b w:val="0"/>
+                <w:i w:val="0"/>
+                <w:iCs w:val="0"/>
+                <w:color w:val="000000"/>
+                <w:kern w:val="0"/>
+                <w:sz w:val="18"/>
+                <w:szCs w:val="18"/>
+                <w:u w:val="none"/>
+                <w:lang w:val="en-US" w:eastAsia="zh-CN" w:bidi="ar"/>
+              </w:rPr>
+            </w:pPr>
+            <w:r>
+              <w:rPr>
+                <w:rFonts w:hint="default" w:ascii="宋体" w:hAnsi="宋体" w:eastAsia="宋体" w:cs="宋体"/>
+                <w:b w:val="0"/>
+                <w:i w:val="0"/>
+                <w:iCs w:val="0"/>
+                <w:color w:val="000000"/>
+                <w:kern w:val="0"/>
+                <w:sz w:val="18"/>
+                <w:szCs w:val="18"/>
+                <w:u w:val="none"/>
+                <w:lang w:val="en-US" w:eastAsia="zh-CN" w:bidi="ar"/>
+              </w:rPr>
+              <w:t>L</w:t>
             </w:r>
           </w:p>
         </w:tc>
@@ -8338,7 +8506,7 @@
         </w:trPr>
         <w:tc>
           <w:tcPr>
-            <w:tcW w:w="527" w:type="pct"/>
+            <w:tcW w:w="466" w:type="pct"/>
             <w:tcBorders>
               <w:top w:val="nil"/>
               <w:left w:val="nil"/>
@@ -8387,7 +8555,7 @@
         </w:tc>
         <w:tc>
           <w:tcPr>
-            <w:tcW w:w="527" w:type="pct"/>
+            <w:tcW w:w="466" w:type="pct"/>
             <w:tcBorders>
               <w:top w:val="nil"/>
               <w:left w:val="nil"/>
@@ -8436,7 +8604,7 @@
         </w:tc>
         <w:tc>
           <w:tcPr>
-            <w:tcW w:w="527" w:type="pct"/>
+            <w:tcW w:w="466" w:type="pct"/>
             <w:tcBorders>
               <w:top w:val="nil"/>
               <w:left w:val="nil"/>
@@ -8485,7 +8653,7 @@
         </w:tc>
         <w:tc>
           <w:tcPr>
-            <w:tcW w:w="527" w:type="pct"/>
+            <w:tcW w:w="466" w:type="pct"/>
             <w:tcBorders>
               <w:top w:val="nil"/>
               <w:left w:val="nil"/>
@@ -8534,7 +8702,7 @@
         </w:tc>
         <w:tc>
           <w:tcPr>
-            <w:tcW w:w="527" w:type="pct"/>
+            <w:tcW w:w="466" w:type="pct"/>
             <w:tcBorders>
               <w:top w:val="nil"/>
               <w:left w:val="nil"/>
@@ -8583,7 +8751,7 @@
         </w:tc>
         <w:tc>
           <w:tcPr>
-            <w:tcW w:w="527" w:type="pct"/>
+            <w:tcW w:w="466" w:type="pct"/>
             <w:tcBorders>
               <w:top w:val="nil"/>
               <w:left w:val="nil"/>
@@ -8632,7 +8800,7 @@
         </w:tc>
         <w:tc>
           <w:tcPr>
-            <w:tcW w:w="716" w:type="pct"/>
+            <w:tcW w:w="725" w:type="pct"/>
             <w:tcBorders>
               <w:top w:val="nil"/>
               <w:left w:val="nil"/>
@@ -8711,7 +8879,7 @@
         </w:tc>
         <w:tc>
           <w:tcPr>
-            <w:tcW w:w="567" w:type="pct"/>
+            <w:tcW w:w="503" w:type="pct"/>
             <w:tcBorders>
               <w:top w:val="nil"/>
               <w:left w:val="nil"/>
@@ -8760,7 +8928,7 @@
         </w:tc>
         <w:tc>
           <w:tcPr>
-            <w:tcW w:w="549" w:type="pct"/>
+            <w:tcW w:w="486" w:type="pct"/>
             <w:tcBorders>
               <w:top w:val="nil"/>
               <w:left w:val="nil"/>
@@ -8804,6 +8972,57 @@
                 <w:lang w:val="en-US" w:eastAsia="zh-CN" w:bidi="ar"/>
               </w:rPr>
               <w:t>16.667</w:t>
+            </w:r>
+          </w:p>
+        </w:tc>
+        <w:tc>
+          <w:tcPr>
+            <w:tcW w:w="486" w:type="pct"/>
+            <w:tcBorders>
+              <w:top w:val="nil"/>
+              <w:left w:val="nil"/>
+              <w:bottom w:val="nil"/>
+              <w:right w:val="nil"/>
+            </w:tcBorders>
+            <w:shd w:val="clear" w:color="auto" w:fill="FFFFFF"/>
+            <w:noWrap/>
+            <w:vAlign w:val="center"/>
+          </w:tcPr>
+          <w:p>
+            <w:pPr>
+              <w:keepNext w:val="0"/>
+              <w:keepLines w:val="0"/>
+              <w:widowControl/>
+              <w:suppressLineNumbers w:val="0"/>
+              <w:jc w:val="center"/>
+              <w:textAlignment w:val="center"/>
+              <w:rPr>
+                <w:rFonts w:hint="default" w:ascii="宋体" w:hAnsi="宋体" w:eastAsia="宋体" w:cs="宋体"/>
+                <w:b w:val="0"/>
+                <w:i w:val="0"/>
+                <w:iCs w:val="0"/>
+                <w:color w:val="000000"/>
+                <w:kern w:val="0"/>
+                <w:sz w:val="18"/>
+                <w:szCs w:val="18"/>
+                <w:u w:val="none"/>
+                <w:lang w:val="en-US" w:eastAsia="zh-CN" w:bidi="ar"/>
+              </w:rPr>
+            </w:pPr>
+            <w:r>
+              <w:rPr>
+                <w:rFonts w:hint="default" w:ascii="宋体" w:hAnsi="宋体" w:eastAsia="宋体" w:cs="宋体"/>
+                <w:b w:val="0"/>
+                <w:i w:val="0"/>
+                <w:iCs w:val="0"/>
+                <w:color w:val="000000"/>
+                <w:kern w:val="0"/>
+                <w:sz w:val="18"/>
+                <w:szCs w:val="18"/>
+                <w:u w:val="none"/>
+                <w:lang w:val="en-US" w:eastAsia="zh-CN" w:bidi="ar"/>
+              </w:rPr>
+              <w:t>U</w:t>
             </w:r>
           </w:p>
         </w:tc>
@@ -8814,7 +9033,7 @@
         </w:trPr>
         <w:tc>
           <w:tcPr>
-            <w:tcW w:w="527" w:type="pct"/>
+            <w:tcW w:w="466" w:type="pct"/>
             <w:tcBorders>
               <w:top w:val="nil"/>
               <w:left w:val="nil"/>
@@ -8863,7 +9082,7 @@
         </w:tc>
         <w:tc>
           <w:tcPr>
-            <w:tcW w:w="527" w:type="pct"/>
+            <w:tcW w:w="466" w:type="pct"/>
             <w:tcBorders>
               <w:top w:val="nil"/>
               <w:left w:val="nil"/>
@@ -8912,7 +9131,7 @@
         </w:tc>
         <w:tc>
           <w:tcPr>
-            <w:tcW w:w="527" w:type="pct"/>
+            <w:tcW w:w="466" w:type="pct"/>
             <w:tcBorders>
               <w:top w:val="nil"/>
               <w:left w:val="nil"/>
@@ -8961,7 +9180,7 @@
         </w:tc>
         <w:tc>
           <w:tcPr>
-            <w:tcW w:w="527" w:type="pct"/>
+            <w:tcW w:w="466" w:type="pct"/>
             <w:tcBorders>
               <w:top w:val="nil"/>
               <w:left w:val="nil"/>
@@ -9010,7 +9229,7 @@
         </w:tc>
         <w:tc>
           <w:tcPr>
-            <w:tcW w:w="527" w:type="pct"/>
+            <w:tcW w:w="466" w:type="pct"/>
             <w:tcBorders>
               <w:top w:val="nil"/>
               <w:left w:val="nil"/>
@@ -9059,7 +9278,7 @@
         </w:tc>
         <w:tc>
           <w:tcPr>
-            <w:tcW w:w="527" w:type="pct"/>
+            <w:tcW w:w="466" w:type="pct"/>
             <w:tcBorders>
               <w:top w:val="nil"/>
               <w:left w:val="nil"/>
@@ -9109,7 +9328,7 @@
         </w:tc>
         <w:tc>
           <w:tcPr>
-            <w:tcW w:w="716" w:type="pct"/>
+            <w:tcW w:w="725" w:type="pct"/>
             <w:tcBorders>
               <w:top w:val="nil"/>
               <w:left w:val="nil"/>
@@ -9188,7 +9407,7 @@
         </w:tc>
         <w:tc>
           <w:tcPr>
-            <w:tcW w:w="567" w:type="pct"/>
+            <w:tcW w:w="503" w:type="pct"/>
             <w:tcBorders>
               <w:top w:val="nil"/>
               <w:left w:val="nil"/>
@@ -9237,7 +9456,7 @@
         </w:tc>
         <w:tc>
           <w:tcPr>
-            <w:tcW w:w="549" w:type="pct"/>
+            <w:tcW w:w="486" w:type="pct"/>
             <w:tcBorders>
               <w:top w:val="nil"/>
               <w:left w:val="nil"/>
@@ -9281,11 +9500,265 @@
                 <w:lang w:val="en-US" w:eastAsia="zh-CN" w:bidi="ar"/>
               </w:rPr>
               <w:t>0.000</w:t>
+            </w:r>
+          </w:p>
+        </w:tc>
+        <w:tc>
+          <w:tcPr>
+            <w:tcW w:w="486" w:type="pct"/>
+            <w:tcBorders>
+              <w:top w:val="nil"/>
+              <w:left w:val="nil"/>
+              <w:bottom w:val="single" w:color="000000" w:sz="12" w:space="0"/>
+              <w:right w:val="nil"/>
+            </w:tcBorders>
+            <w:shd w:val="clear" w:color="auto" w:fill="FFFFFF"/>
+            <w:noWrap/>
+            <w:vAlign w:val="center"/>
+          </w:tcPr>
+          <w:p>
+            <w:pPr>
+              <w:keepNext w:val="0"/>
+              <w:keepLines w:val="0"/>
+              <w:widowControl/>
+              <w:suppressLineNumbers w:val="0"/>
+              <w:jc w:val="center"/>
+              <w:textAlignment w:val="center"/>
+              <w:rPr>
+                <w:rFonts w:hint="default" w:ascii="宋体" w:hAnsi="宋体" w:eastAsia="宋体" w:cs="宋体"/>
+                <w:b w:val="0"/>
+                <w:i w:val="0"/>
+                <w:iCs w:val="0"/>
+                <w:color w:val="000000"/>
+                <w:kern w:val="0"/>
+                <w:sz w:val="18"/>
+                <w:szCs w:val="18"/>
+                <w:u w:val="none"/>
+                <w:lang w:val="en-US" w:eastAsia="zh-CN" w:bidi="ar"/>
+              </w:rPr>
+            </w:pPr>
+            <w:r>
+              <w:rPr>
+                <w:rFonts w:hint="default" w:ascii="宋体" w:hAnsi="宋体" w:eastAsia="宋体" w:cs="宋体"/>
+                <w:b w:val="0"/>
+                <w:i w:val="0"/>
+                <w:iCs w:val="0"/>
+                <w:color w:val="000000"/>
+                <w:kern w:val="0"/>
+                <w:sz w:val="18"/>
+                <w:szCs w:val="18"/>
+                <w:u w:val="none"/>
+                <w:lang w:val="en-US" w:eastAsia="zh-CN" w:bidi="ar"/>
+              </w:rPr>
+              <w:t>Maximum</w:t>
             </w:r>
           </w:p>
         </w:tc>
       </w:tr>
     </w:tbl>
+    <w:p>
+      <w:pPr>
+        <w:keepNext w:val="0"/>
+        <w:keepLines w:val="0"/>
+        <w:pageBreakBefore w:val="0"/>
+        <w:widowControl w:val="0"/>
+        <w:kinsoku/>
+        <w:wordWrap/>
+        <w:overflowPunct/>
+        <w:topLinePunct w:val="0"/>
+        <w:autoSpaceDE/>
+        <w:autoSpaceDN/>
+        <w:bidi w:val="0"/>
+        <w:adjustRightInd/>
+        <w:snapToGrid/>
+        <w:spacing w:line="360" w:lineRule="auto"/>
+        <w:ind w:firstLine="0" w:firstLineChars="0"/>
+        <w:jc w:val="both"/>
+        <w:textAlignment w:val="auto"/>
+        <w:rPr>
+          <w:rFonts w:hint="default" w:ascii="宋体" w:hAnsi="宋体" w:eastAsia="宋体" w:cs="宋体"/>
+          <w:b w:val="0"/>
+          <w:bCs w:val="0"/>
+          <w:i w:val="0"/>
+          <w:iCs w:val="0"/>
+          <w:sz w:val="18"/>
+          <w:szCs w:val="18"/>
+          <w:vertAlign w:val="baseline"/>
+          <w:lang w:val="en-US" w:eastAsia="zh-CN"/>
+        </w:rPr>
+      </w:pPr>
+      <w:r>
+        <w:rPr>
+          <w:rFonts w:hint="eastAsia" w:ascii="宋体" w:hAnsi="宋体" w:eastAsia="宋体" w:cs="宋体"/>
+          <w:b w:val="0"/>
+          <w:bCs w:val="0"/>
+          <w:i w:val="0"/>
+          <w:iCs w:val="0"/>
+          <w:sz w:val="18"/>
+          <w:szCs w:val="18"/>
+          <w:lang w:val="en-US" w:eastAsia="zh-CN"/>
+        </w:rPr>
+        <w:t xml:space="preserve">Note. </w:t>
+      </w:r>
+      <w:r>
+        <w:rPr>
+          <w:rFonts w:hint="eastAsia" w:ascii="宋体" w:hAnsi="宋体" w:eastAsia="宋体" w:cs="宋体"/>
+          <w:b w:val="0"/>
+          <w:bCs w:val="0"/>
+          <w:i w:val="0"/>
+          <w:iCs w:val="0"/>
+          <w:color w:val="000000"/>
+          <w:kern w:val="0"/>
+          <w:sz w:val="18"/>
+          <w:szCs w:val="18"/>
+          <w:u w:val="none"/>
+          <w:vertAlign w:val="superscript"/>
+          <w:lang w:val="en-US" w:eastAsia="zh-CN" w:bidi="ar"/>
+        </w:rPr>
+        <w:t>①</w:t>
+      </w:r>
+      <w:r>
+        <w:rPr>
+          <w:rFonts w:hint="default" w:ascii="宋体" w:hAnsi="宋体" w:eastAsia="宋体" w:cs="宋体"/>
+          <w:b w:val="0"/>
+          <w:bCs w:val="0"/>
+          <w:i/>
+          <w:iCs/>
+          <w:color w:val="000000"/>
+          <w:kern w:val="0"/>
+          <w:sz w:val="18"/>
+          <w:szCs w:val="18"/>
+          <w:u w:val="none"/>
+          <w:vertAlign w:val="superscript"/>
+          <w:lang w:val="en-US" w:eastAsia="zh-CN" w:bidi="ar"/>
+        </w:rPr>
+        <w:t xml:space="preserve"> </w:t>
+      </w:r>
+      <w:r>
+        <w:rPr>
+          <w:rFonts w:hint="eastAsia" w:ascii="宋体" w:hAnsi="宋体" w:eastAsia="宋体" w:cs="宋体"/>
+          <w:b w:val="0"/>
+          <w:bCs w:val="0"/>
+          <w:i w:val="0"/>
+          <w:iCs w:val="0"/>
+          <w:color w:val="000000"/>
+          <w:kern w:val="0"/>
+          <w:sz w:val="18"/>
+          <w:szCs w:val="18"/>
+          <w:u w:val="none"/>
+          <w:vertAlign w:val="baseline"/>
+          <w:lang w:val="en-US" w:eastAsia="zh-CN" w:bidi="ar"/>
+        </w:rPr>
+        <w:t>M</w:t>
+      </w:r>
+      <w:r>
+        <w:rPr>
+          <w:rFonts w:hint="default" w:ascii="宋体" w:hAnsi="宋体" w:eastAsia="宋体" w:cs="宋体"/>
+          <w:b w:val="0"/>
+          <w:bCs w:val="0"/>
+          <w:i w:val="0"/>
+          <w:iCs w:val="0"/>
+          <w:color w:val="000000"/>
+          <w:kern w:val="0"/>
+          <w:sz w:val="18"/>
+          <w:szCs w:val="18"/>
+          <w:u w:val="none"/>
+          <w:vertAlign w:val="baseline"/>
+          <w:lang w:val="en-US" w:eastAsia="zh-CN" w:bidi="ar"/>
+        </w:rPr>
+        <w:t xml:space="preserve">inimum:Minimum observed Pre, L:Lower </w:t>
+      </w:r>
+      <w:r>
+        <w:rPr>
+          <w:rFonts w:hint="default" w:ascii="宋体" w:hAnsi="宋体" w:eastAsia="宋体" w:cs="宋体"/>
+          <w:i w:val="0"/>
+          <w:iCs w:val="0"/>
+          <w:sz w:val="18"/>
+          <w:szCs w:val="18"/>
+          <w:lang w:val="en-US" w:eastAsia="zh-CN"/>
+        </w:rPr>
+        <w:t>Johnson-Neyman</w:t>
+      </w:r>
+      <w:r>
+        <w:rPr>
+          <w:rFonts w:hint="default" w:ascii="宋体" w:hAnsi="宋体" w:eastAsia="宋体" w:cs="宋体"/>
+          <w:b w:val="0"/>
+          <w:bCs w:val="0"/>
+          <w:i w:val="0"/>
+          <w:iCs w:val="0"/>
+          <w:color w:val="000000"/>
+          <w:kern w:val="0"/>
+          <w:sz w:val="18"/>
+          <w:szCs w:val="18"/>
+          <w:u w:val="none"/>
+          <w:vertAlign w:val="baseline"/>
+          <w:lang w:val="en-US" w:eastAsia="zh-CN" w:bidi="ar"/>
+        </w:rPr>
+        <w:t xml:space="preserve"> threshold, U:Upper </w:t>
+      </w:r>
+      <w:r>
+        <w:rPr>
+          <w:rFonts w:hint="default" w:ascii="宋体" w:hAnsi="宋体" w:eastAsia="宋体" w:cs="宋体"/>
+          <w:i w:val="0"/>
+          <w:iCs w:val="0"/>
+          <w:sz w:val="18"/>
+          <w:szCs w:val="18"/>
+          <w:lang w:val="en-US" w:eastAsia="zh-CN"/>
+        </w:rPr>
+        <w:t>Johnson-Neyman</w:t>
+      </w:r>
+      <w:r>
+        <w:rPr>
+          <w:rFonts w:hint="default" w:ascii="宋体" w:hAnsi="宋体" w:eastAsia="宋体" w:cs="宋体"/>
+          <w:b w:val="0"/>
+          <w:bCs w:val="0"/>
+          <w:i w:val="0"/>
+          <w:iCs w:val="0"/>
+          <w:color w:val="000000"/>
+          <w:kern w:val="0"/>
+          <w:sz w:val="18"/>
+          <w:szCs w:val="18"/>
+          <w:u w:val="none"/>
+          <w:vertAlign w:val="baseline"/>
+          <w:lang w:val="en-US" w:eastAsia="zh-CN" w:bidi="ar"/>
+        </w:rPr>
+        <w:t xml:space="preserve"> threshold, </w:t>
+      </w:r>
+      <w:r>
+        <w:rPr>
+          <w:rFonts w:hint="default" w:ascii="宋体" w:hAnsi="宋体" w:eastAsia="宋体" w:cs="宋体"/>
+          <w:b w:val="0"/>
+          <w:i w:val="0"/>
+          <w:iCs w:val="0"/>
+          <w:color w:val="000000"/>
+          <w:kern w:val="0"/>
+          <w:sz w:val="18"/>
+          <w:szCs w:val="18"/>
+          <w:u w:val="none"/>
+          <w:lang w:val="en-US" w:eastAsia="zh-CN" w:bidi="ar"/>
+        </w:rPr>
+        <w:t xml:space="preserve">Maximum </w:t>
+      </w:r>
+      <w:r>
+        <w:rPr>
+          <w:rFonts w:hint="default" w:ascii="宋体" w:hAnsi="宋体" w:eastAsia="宋体" w:cs="宋体"/>
+          <w:b w:val="0"/>
+          <w:bCs w:val="0"/>
+          <w:i w:val="0"/>
+          <w:iCs w:val="0"/>
+          <w:color w:val="000000"/>
+          <w:kern w:val="0"/>
+          <w:sz w:val="18"/>
+          <w:szCs w:val="18"/>
+          <w:u w:val="none"/>
+          <w:vertAlign w:val="baseline"/>
+          <w:lang w:val="en-US" w:eastAsia="zh-CN" w:bidi="ar"/>
+        </w:rPr>
+        <w:t>observed Pre.</w:t>
+      </w:r>
+      <w:bookmarkStart w:id="0" w:name="_GoBack"/>
+      <w:bookmarkEnd w:id="0"/>
+    </w:p>
     <w:p>
       <w:pPr>
         <w:keepNext w:val="0"/>

</xml_diff>

<commit_message>
Sync from private source SHA: 3823317905a5a6ce72b745174614bbb927cdfdf6
</commit_message>
<xml_diff>
--- a/Docs/03ANOVA/ANCOVA_Case_Interaction.docx
+++ b/Docs/03ANOVA/ANCOVA_Case_Interaction.docx
@@ -1,6 +1,6 @@
 
 <file path=word/document.xml><?xml version="1.0" encoding="utf-8"?>
-<w:document xmlns:wpc="http://schemas.microsoft.com/office/word/2010/wordprocessingCanvas" xmlns:mc="http://schemas.openxmlformats.org/markup-compatibility/2006" xmlns:o="urn:schemas-microsoft-com:office:office" xmlns:r="http://schemas.openxmlformats.org/officeDocument/2006/relationships" xmlns:m="http://schemas.openxmlformats.org/officeDocument/2006/math" xmlns:v="urn:schemas-microsoft-com:vml" xmlns:wp14="http://schemas.microsoft.com/office/word/2010/wordprocessingDrawing" xmlns:wp="http://schemas.openxmlformats.org/drawingml/2006/wordprocessingDrawing" xmlns:w="http://schemas.openxmlformats.org/wordprocessingml/2006/main" xmlns:w14="http://schemas.microsoft.com/office/word/2010/wordml" xmlns:w10="urn:schemas-microsoft-com:office:word" xmlns:w15="http://schemas.microsoft.com/office/word/2012/wordml" xmlns:wpg="http://schemas.microsoft.com/office/word/2010/wordprocessingGroup" xmlns:wpi="http://schemas.microsoft.com/office/word/2010/wordprocessingInk" xmlns:wne="http://schemas.microsoft.com/office/word/2006/wordml" xmlns:wps="http://schemas.microsoft.com/office/word/2010/wordprocessingShape" xmlns:wpsCustomData="http://www.wps.cn/officeDocument/2013/wpsCustomData" mc:Ignorable="w14 w15 wp14">
+<w:document xmlns:wpc="http://schemas.microsoft.com/office/word/2010/wordprocessingCanvas" xmlns:cx="http://schemas.microsoft.com/office/drawing/2014/chartex" xmlns:cx1="http://schemas.microsoft.com/office/drawing/2015/9/8/chartex" xmlns:cx2="http://schemas.microsoft.com/office/drawing/2015/10/21/chartex" xmlns:cx3="http://schemas.microsoft.com/office/drawing/2016/5/9/chartex" xmlns:cx4="http://schemas.microsoft.com/office/drawing/2016/5/10/chartex" xmlns:cx5="http://schemas.microsoft.com/office/drawing/2016/5/11/chartex" xmlns:cx6="http://schemas.microsoft.com/office/drawing/2016/5/12/chartex" xmlns:cx7="http://schemas.microsoft.com/office/drawing/2016/5/13/chartex" xmlns:cx8="http://schemas.microsoft.com/office/drawing/2016/5/14/chartex" xmlns:mc="http://schemas.openxmlformats.org/markup-compatibility/2006" xmlns:o="urn:schemas-microsoft-com:office:office" xmlns:r="http://schemas.openxmlformats.org/officeDocument/2006/relationships" xmlns:m="http://schemas.openxmlformats.org/officeDocument/2006/math" xmlns:v="urn:schemas-microsoft-com:vml" xmlns:wp14="http://schemas.microsoft.com/office/word/2010/wordprocessingDrawing" xmlns:wp="http://schemas.openxmlformats.org/drawingml/2006/wordprocessingDrawing" xmlns:w="http://schemas.openxmlformats.org/wordprocessingml/2006/main" xmlns:w14="http://schemas.microsoft.com/office/word/2010/wordml" xmlns:w10="urn:schemas-microsoft-com:office:word" xmlns:w15="http://schemas.microsoft.com/office/word/2012/wordml" xmlns:wpg="http://schemas.microsoft.com/office/word/2010/wordprocessingGroup" xmlns:wpi="http://schemas.microsoft.com/office/word/2010/wordprocessingInk" xmlns:wne="http://schemas.microsoft.com/office/word/2006/wordml" xmlns:wps="http://schemas.microsoft.com/office/word/2010/wordprocessingShape" xmlns:wpsCustomData="http://www.wps.cn/officeDocument/2013/wpsCustomData" mc:Ignorable="w14 w15 wp14">
   <w:body>
     <w:p>
       <w:pPr>
@@ -19,7 +19,7 @@
           <w:szCs w:val="30"/>
           <w:lang w:val="en-US" w:eastAsia="zh-CN"/>
         </w:rPr>
-        <w:t>协方差案例分析（斜率不齐）</w:t>
+        <w:t>协方差案例分析（回归斜率不齐）</w:t>
       </w:r>
     </w:p>
     <w:p>
@@ -135,6 +135,8 @@
         </w:rPr>
         <w:t xml:space="preserve">1 </w:t>
       </w:r>
+      <w:bookmarkStart w:id="0" w:name="_GoBack"/>
+      <w:bookmarkEnd w:id="0"/>
     </w:p>
     <w:p>
       <w:pPr>
@@ -1638,30 +1640,61 @@
               <w:jc w:val="center"/>
               <w:textAlignment w:val="center"/>
               <w:rPr>
-                <w:rFonts w:hint="eastAsia" w:ascii="宋体" w:hAnsi="宋体" w:eastAsia="宋体" w:cs="宋体"/>
-                <w:b w:val="0"/>
-                <w:i w:val="0"/>
-                <w:iCs w:val="0"/>
-                <w:color w:val="000000"/>
-                <w:sz w:val="18"/>
-                <w:szCs w:val="18"/>
-                <w:u w:val="none"/>
-              </w:rPr>
-            </w:pPr>
-            <w:r>
-              <w:rPr>
-                <w:rFonts w:hint="eastAsia" w:ascii="宋体" w:hAnsi="宋体" w:eastAsia="宋体" w:cs="宋体"/>
-                <w:b w:val="0"/>
-                <w:i w:val="0"/>
-                <w:iCs w:val="0"/>
-                <w:color w:val="000000"/>
-                <w:kern w:val="0"/>
-                <w:sz w:val="18"/>
-                <w:szCs w:val="18"/>
-                <w:u w:val="none"/>
-                <w:lang w:val="en-US" w:eastAsia="zh-CN" w:bidi="ar"/>
-              </w:rPr>
-              <w:t>3364.96</w:t>
+                <w:rFonts w:hint="default" w:ascii="宋体" w:hAnsi="宋体" w:eastAsia="宋体" w:cs="宋体"/>
+                <w:b w:val="0"/>
+                <w:i w:val="0"/>
+                <w:iCs w:val="0"/>
+                <w:color w:val="000000"/>
+                <w:sz w:val="18"/>
+                <w:szCs w:val="18"/>
+                <w:u w:val="none"/>
+                <w:lang w:val="en-US"/>
+              </w:rPr>
+            </w:pPr>
+            <w:r>
+              <w:rPr>
+                <w:rFonts w:hint="default" w:ascii="宋体" w:hAnsi="宋体" w:eastAsia="宋体" w:cs="宋体"/>
+                <w:b w:val="0"/>
+                <w:i w:val="0"/>
+                <w:iCs w:val="0"/>
+                <w:color w:val="000000"/>
+                <w:kern w:val="0"/>
+                <w:sz w:val="18"/>
+                <w:szCs w:val="18"/>
+                <w:u w:val="none"/>
+                <w:lang w:val="en-US" w:eastAsia="zh-CN" w:bidi="ar"/>
+              </w:rPr>
+              <w:t>113</w:t>
+            </w:r>
+            <w:r>
+              <w:rPr>
+                <w:rFonts w:hint="eastAsia" w:ascii="宋体" w:hAnsi="宋体" w:eastAsia="宋体" w:cs="宋体"/>
+                <w:b w:val="0"/>
+                <w:i w:val="0"/>
+                <w:iCs w:val="0"/>
+                <w:color w:val="000000"/>
+                <w:kern w:val="0"/>
+                <w:sz w:val="18"/>
+                <w:szCs w:val="18"/>
+                <w:u w:val="none"/>
+                <w:lang w:val="en-US" w:eastAsia="zh-CN" w:bidi="ar"/>
+              </w:rPr>
+              <w:t>.</w:t>
+            </w:r>
+            <w:r>
+              <w:rPr>
+                <w:rFonts w:hint="default" w:ascii="宋体" w:hAnsi="宋体" w:eastAsia="宋体" w:cs="宋体"/>
+                <w:b w:val="0"/>
+                <w:i w:val="0"/>
+                <w:iCs w:val="0"/>
+                <w:color w:val="000000"/>
+                <w:kern w:val="0"/>
+                <w:sz w:val="18"/>
+                <w:szCs w:val="18"/>
+                <w:u w:val="none"/>
+                <w:lang w:val="en-US" w:eastAsia="zh-CN" w:bidi="ar"/>
+              </w:rPr>
+              <w:t>993</w:t>
             </w:r>
           </w:p>
         </w:tc>
@@ -9756,8 +9789,6 @@
         </w:rPr>
         <w:t>observed Pre.</w:t>
       </w:r>
-      <w:bookmarkStart w:id="0" w:name="_GoBack"/>
-      <w:bookmarkEnd w:id="0"/>
     </w:p>
     <w:p>
       <w:pPr>

</xml_diff>

<commit_message>
Sync from private source SHA: 7819a92b64107e10800d70392ddcf7a582790e41
</commit_message>
<xml_diff>
--- a/Docs/03ANOVA/ANCOVA_Case_Interaction.docx
+++ b/Docs/03ANOVA/ANCOVA_Case_Interaction.docx
@@ -135,8 +135,6 @@
         </w:rPr>
         <w:t xml:space="preserve">1 </w:t>
       </w:r>
-      <w:bookmarkStart w:id="0" w:name="_GoBack"/>
-      <w:bookmarkEnd w:id="0"/>
     </w:p>
     <w:p>
       <w:pPr>
@@ -10238,6 +10236,466 @@
         </w:rPr>
         <w:t>分，对于前测基础极好的学生，对照组效果更优。</w:t>
       </w:r>
+    </w:p>
+    <w:p>
+      <w:pPr>
+        <w:rPr>
+          <w:rFonts w:hint="default" w:ascii="方正仿宋_GB2312" w:hAnsi="方正仿宋_GB2312" w:eastAsia="方正仿宋_GB2312" w:cs="方正仿宋_GB2312"/>
+          <w:sz w:val="21"/>
+          <w:szCs w:val="21"/>
+          <w:lang w:val="en-US" w:eastAsia="zh-CN"/>
+        </w:rPr>
+      </w:pPr>
+      <w:r>
+        <w:rPr>
+          <w:rFonts w:hint="default" w:ascii="方正仿宋_GB2312" w:hAnsi="方正仿宋_GB2312" w:eastAsia="方正仿宋_GB2312" w:cs="方正仿宋_GB2312"/>
+          <w:sz w:val="21"/>
+          <w:szCs w:val="21"/>
+          <w:lang w:val="en-US" w:eastAsia="zh-CN"/>
+        </w:rPr>
+        <w:br w:type="page"/>
+      </w:r>
+    </w:p>
+    <w:p>
+      <w:pPr>
+        <w:keepNext w:val="0"/>
+        <w:keepLines w:val="0"/>
+        <w:pageBreakBefore w:val="0"/>
+        <w:widowControl w:val="0"/>
+        <w:kinsoku/>
+        <w:wordWrap/>
+        <w:overflowPunct/>
+        <w:topLinePunct w:val="0"/>
+        <w:autoSpaceDE/>
+        <w:autoSpaceDN/>
+        <w:bidi w:val="0"/>
+        <w:adjustRightInd/>
+        <w:snapToGrid/>
+        <w:spacing w:line="360" w:lineRule="auto"/>
+        <w:ind w:firstLine="420" w:firstLineChars="200"/>
+        <w:textAlignment w:val="auto"/>
+        <w:rPr>
+          <w:rFonts w:hint="default" w:ascii="方正仿宋_GB2312" w:hAnsi="方正仿宋_GB2312" w:eastAsia="方正仿宋_GB2312" w:cs="方正仿宋_GB2312"/>
+          <w:sz w:val="21"/>
+          <w:szCs w:val="21"/>
+          <w:lang w:val="en-US" w:eastAsia="zh-CN"/>
+        </w:rPr>
+      </w:pPr>
+      <w:r>
+        <w:rPr>
+          <w:rFonts w:hint="eastAsia" w:ascii="方正仿宋_GB2312" w:hAnsi="方正仿宋_GB2312" w:eastAsia="方正仿宋_GB2312" w:cs="方正仿宋_GB2312"/>
+          <w:sz w:val="21"/>
+          <w:szCs w:val="21"/>
+          <w:lang w:val="en-US" w:eastAsia="zh-CN"/>
+        </w:rPr>
+        <w:t>附录：J</w:t>
+      </w:r>
+      <w:r>
+        <w:rPr>
+          <w:rFonts w:hint="default" w:ascii="方正仿宋_GB2312" w:hAnsi="方正仿宋_GB2312" w:eastAsia="方正仿宋_GB2312" w:cs="方正仿宋_GB2312"/>
+          <w:sz w:val="21"/>
+          <w:szCs w:val="21"/>
+          <w:lang w:val="en-US" w:eastAsia="zh-CN"/>
+        </w:rPr>
+        <w:t>ohnon-Neyman R Script</w:t>
+      </w:r>
+    </w:p>
+    <w:p>
+      <w:pPr>
+        <w:keepNext w:val="0"/>
+        <w:keepLines w:val="0"/>
+        <w:pageBreakBefore w:val="0"/>
+        <w:widowControl w:val="0"/>
+        <w:kinsoku/>
+        <w:wordWrap/>
+        <w:overflowPunct/>
+        <w:topLinePunct w:val="0"/>
+        <w:autoSpaceDE/>
+        <w:autoSpaceDN/>
+        <w:bidi w:val="0"/>
+        <w:adjustRightInd/>
+        <w:snapToGrid/>
+        <w:spacing w:line="240" w:lineRule="auto"/>
+        <w:ind w:firstLine="360" w:firstLineChars="200"/>
+        <w:textAlignment w:val="auto"/>
+        <w:rPr>
+          <w:rFonts w:hint="eastAsia" w:ascii="宋体" w:hAnsi="宋体" w:eastAsia="宋体" w:cs="宋体"/>
+          <w:sz w:val="18"/>
+          <w:szCs w:val="18"/>
+          <w:lang w:val="en-US" w:eastAsia="zh-CN"/>
+        </w:rPr>
+      </w:pPr>
+      <w:r>
+        <w:rPr>
+          <w:rFonts w:hint="eastAsia" w:ascii="宋体" w:hAnsi="宋体" w:eastAsia="宋体" w:cs="宋体"/>
+          <w:sz w:val="18"/>
+          <w:szCs w:val="18"/>
+          <w:lang w:val="en-US" w:eastAsia="zh-CN"/>
+        </w:rPr>
+        <w:t>library(readxl)</w:t>
+      </w:r>
+      <w:bookmarkStart w:id="0" w:name="_GoBack"/>
+      <w:bookmarkEnd w:id="0"/>
+    </w:p>
+    <w:p>
+      <w:pPr>
+        <w:keepNext w:val="0"/>
+        <w:keepLines w:val="0"/>
+        <w:pageBreakBefore w:val="0"/>
+        <w:widowControl w:val="0"/>
+        <w:kinsoku/>
+        <w:wordWrap/>
+        <w:overflowPunct/>
+        <w:topLinePunct w:val="0"/>
+        <w:autoSpaceDE/>
+        <w:autoSpaceDN/>
+        <w:bidi w:val="0"/>
+        <w:adjustRightInd/>
+        <w:snapToGrid/>
+        <w:spacing w:line="240" w:lineRule="auto"/>
+        <w:ind w:firstLine="360" w:firstLineChars="200"/>
+        <w:textAlignment w:val="auto"/>
+        <w:rPr>
+          <w:rFonts w:hint="eastAsia" w:ascii="宋体" w:hAnsi="宋体" w:eastAsia="宋体" w:cs="宋体"/>
+          <w:sz w:val="18"/>
+          <w:szCs w:val="18"/>
+          <w:lang w:val="en-US" w:eastAsia="zh-CN"/>
+        </w:rPr>
+      </w:pPr>
+      <w:r>
+        <w:rPr>
+          <w:rFonts w:hint="eastAsia" w:ascii="宋体" w:hAnsi="宋体" w:eastAsia="宋体" w:cs="宋体"/>
+          <w:sz w:val="18"/>
+          <w:szCs w:val="18"/>
+          <w:lang w:val="en-US" w:eastAsia="zh-CN"/>
+        </w:rPr>
+        <w:t>library(interactions)</w:t>
+      </w:r>
+    </w:p>
+    <w:p>
+      <w:pPr>
+        <w:keepNext w:val="0"/>
+        <w:keepLines w:val="0"/>
+        <w:pageBreakBefore w:val="0"/>
+        <w:widowControl w:val="0"/>
+        <w:kinsoku/>
+        <w:wordWrap/>
+        <w:overflowPunct/>
+        <w:topLinePunct w:val="0"/>
+        <w:autoSpaceDE/>
+        <w:autoSpaceDN/>
+        <w:bidi w:val="0"/>
+        <w:adjustRightInd/>
+        <w:snapToGrid/>
+        <w:spacing w:line="240" w:lineRule="auto"/>
+        <w:ind w:firstLine="360" w:firstLineChars="200"/>
+        <w:textAlignment w:val="auto"/>
+        <w:rPr>
+          <w:rFonts w:hint="eastAsia" w:ascii="宋体" w:hAnsi="宋体" w:eastAsia="宋体" w:cs="宋体"/>
+          <w:sz w:val="18"/>
+          <w:szCs w:val="18"/>
+          <w:lang w:val="en-US" w:eastAsia="zh-CN"/>
+        </w:rPr>
+      </w:pPr>
+      <w:r>
+        <w:rPr>
+          <w:rFonts w:hint="eastAsia" w:ascii="宋体" w:hAnsi="宋体" w:eastAsia="宋体" w:cs="宋体"/>
+          <w:sz w:val="18"/>
+          <w:szCs w:val="18"/>
+          <w:lang w:val="en-US" w:eastAsia="zh-CN"/>
+        </w:rPr>
+        <w:t>scie &lt;- read_excel("</w:t>
+      </w:r>
+      <w:r>
+        <w:rPr>
+          <w:rFonts w:hint="eastAsia" w:ascii="宋体" w:hAnsi="宋体" w:eastAsia="宋体" w:cs="宋体"/>
+          <w:color w:val="C00000"/>
+          <w:sz w:val="18"/>
+          <w:szCs w:val="18"/>
+          <w:lang w:val="en-US" w:eastAsia="zh-CN"/>
+        </w:rPr>
+        <w:t>***/ANCOVA_Case_Interaction.xlsx</w:t>
+      </w:r>
+      <w:r>
+        <w:rPr>
+          <w:rFonts w:hint="eastAsia" w:ascii="宋体" w:hAnsi="宋体" w:eastAsia="宋体" w:cs="宋体"/>
+          <w:sz w:val="18"/>
+          <w:szCs w:val="18"/>
+          <w:lang w:val="en-US" w:eastAsia="zh-CN"/>
+        </w:rPr>
+        <w:t xml:space="preserve">")  </w:t>
+      </w:r>
+    </w:p>
+    <w:p>
+      <w:pPr>
+        <w:keepNext w:val="0"/>
+        <w:keepLines w:val="0"/>
+        <w:pageBreakBefore w:val="0"/>
+        <w:widowControl w:val="0"/>
+        <w:kinsoku/>
+        <w:wordWrap/>
+        <w:overflowPunct/>
+        <w:topLinePunct w:val="0"/>
+        <w:autoSpaceDE/>
+        <w:autoSpaceDN/>
+        <w:bidi w:val="0"/>
+        <w:adjustRightInd/>
+        <w:snapToGrid/>
+        <w:spacing w:line="240" w:lineRule="auto"/>
+        <w:ind w:firstLine="360" w:firstLineChars="200"/>
+        <w:textAlignment w:val="auto"/>
+        <w:rPr>
+          <w:rFonts w:hint="eastAsia" w:ascii="宋体" w:hAnsi="宋体" w:eastAsia="宋体" w:cs="宋体"/>
+          <w:sz w:val="18"/>
+          <w:szCs w:val="18"/>
+          <w:lang w:val="en-US" w:eastAsia="zh-CN"/>
+        </w:rPr>
+      </w:pPr>
+      <w:r>
+        <w:rPr>
+          <w:rFonts w:hint="eastAsia" w:ascii="宋体" w:hAnsi="宋体" w:eastAsia="宋体" w:cs="宋体"/>
+          <w:sz w:val="18"/>
+          <w:szCs w:val="18"/>
+          <w:lang w:val="en-US" w:eastAsia="zh-CN"/>
+        </w:rPr>
+        <w:t>fit &lt;- lm(Post ~ Group + Pre_MC + Group*Pre_MC,data = scie)</w:t>
+      </w:r>
+    </w:p>
+    <w:p>
+      <w:pPr>
+        <w:keepNext w:val="0"/>
+        <w:keepLines w:val="0"/>
+        <w:pageBreakBefore w:val="0"/>
+        <w:widowControl w:val="0"/>
+        <w:kinsoku/>
+        <w:wordWrap/>
+        <w:overflowPunct/>
+        <w:topLinePunct w:val="0"/>
+        <w:autoSpaceDE/>
+        <w:autoSpaceDN/>
+        <w:bidi w:val="0"/>
+        <w:adjustRightInd/>
+        <w:snapToGrid/>
+        <w:spacing w:line="240" w:lineRule="auto"/>
+        <w:ind w:firstLine="360" w:firstLineChars="200"/>
+        <w:textAlignment w:val="auto"/>
+        <w:rPr>
+          <w:rFonts w:hint="eastAsia" w:ascii="宋体" w:hAnsi="宋体" w:eastAsia="宋体" w:cs="宋体"/>
+          <w:sz w:val="18"/>
+          <w:szCs w:val="18"/>
+          <w:lang w:val="en-US" w:eastAsia="zh-CN"/>
+        </w:rPr>
+      </w:pPr>
+      <w:r>
+        <w:rPr>
+          <w:rFonts w:hint="eastAsia" w:ascii="宋体" w:hAnsi="宋体" w:eastAsia="宋体" w:cs="宋体"/>
+          <w:sz w:val="18"/>
+          <w:szCs w:val="18"/>
+          <w:lang w:val="en-US" w:eastAsia="zh-CN"/>
+        </w:rPr>
+        <w:t># 绘制Johnson-Neyman图</w:t>
+      </w:r>
+    </w:p>
+    <w:p>
+      <w:pPr>
+        <w:keepNext w:val="0"/>
+        <w:keepLines w:val="0"/>
+        <w:pageBreakBefore w:val="0"/>
+        <w:widowControl w:val="0"/>
+        <w:kinsoku/>
+        <w:wordWrap/>
+        <w:overflowPunct/>
+        <w:topLinePunct w:val="0"/>
+        <w:autoSpaceDE/>
+        <w:autoSpaceDN/>
+        <w:bidi w:val="0"/>
+        <w:adjustRightInd/>
+        <w:snapToGrid/>
+        <w:spacing w:line="240" w:lineRule="auto"/>
+        <w:ind w:firstLine="360" w:firstLineChars="200"/>
+        <w:textAlignment w:val="auto"/>
+        <w:rPr>
+          <w:rFonts w:hint="eastAsia" w:ascii="宋体" w:hAnsi="宋体" w:eastAsia="宋体" w:cs="宋体"/>
+          <w:sz w:val="18"/>
+          <w:szCs w:val="18"/>
+          <w:lang w:val="en-US" w:eastAsia="zh-CN"/>
+        </w:rPr>
+      </w:pPr>
+      <w:r>
+        <w:rPr>
+          <w:rFonts w:hint="eastAsia" w:ascii="宋体" w:hAnsi="宋体" w:eastAsia="宋体" w:cs="宋体"/>
+          <w:sz w:val="18"/>
+          <w:szCs w:val="18"/>
+          <w:lang w:val="en-US" w:eastAsia="zh-CN"/>
+        </w:rPr>
+        <w:t>johnson_neyman(model = fit,</w:t>
+      </w:r>
+    </w:p>
+    <w:p>
+      <w:pPr>
+        <w:keepNext w:val="0"/>
+        <w:keepLines w:val="0"/>
+        <w:pageBreakBefore w:val="0"/>
+        <w:widowControl w:val="0"/>
+        <w:kinsoku/>
+        <w:wordWrap/>
+        <w:overflowPunct/>
+        <w:topLinePunct w:val="0"/>
+        <w:autoSpaceDE/>
+        <w:autoSpaceDN/>
+        <w:bidi w:val="0"/>
+        <w:adjustRightInd/>
+        <w:snapToGrid/>
+        <w:spacing w:line="240" w:lineRule="auto"/>
+        <w:ind w:firstLine="360" w:firstLineChars="200"/>
+        <w:textAlignment w:val="auto"/>
+        <w:rPr>
+          <w:rFonts w:hint="eastAsia" w:ascii="宋体" w:hAnsi="宋体" w:eastAsia="宋体" w:cs="宋体"/>
+          <w:sz w:val="18"/>
+          <w:szCs w:val="18"/>
+          <w:lang w:val="en-US" w:eastAsia="zh-CN"/>
+        </w:rPr>
+      </w:pPr>
+      <w:r>
+        <w:rPr>
+          <w:rFonts w:hint="eastAsia" w:ascii="宋体" w:hAnsi="宋体" w:eastAsia="宋体" w:cs="宋体"/>
+          <w:sz w:val="18"/>
+          <w:szCs w:val="18"/>
+          <w:lang w:val="en-US" w:eastAsia="zh-CN"/>
+        </w:rPr>
+        <w:t xml:space="preserve">               pred = Group, </w:t>
+      </w:r>
+    </w:p>
+    <w:p>
+      <w:pPr>
+        <w:keepNext w:val="0"/>
+        <w:keepLines w:val="0"/>
+        <w:pageBreakBefore w:val="0"/>
+        <w:widowControl w:val="0"/>
+        <w:kinsoku/>
+        <w:wordWrap/>
+        <w:overflowPunct/>
+        <w:topLinePunct w:val="0"/>
+        <w:autoSpaceDE/>
+        <w:autoSpaceDN/>
+        <w:bidi w:val="0"/>
+        <w:adjustRightInd/>
+        <w:snapToGrid/>
+        <w:spacing w:line="240" w:lineRule="auto"/>
+        <w:ind w:firstLine="360" w:firstLineChars="200"/>
+        <w:textAlignment w:val="auto"/>
+        <w:rPr>
+          <w:rFonts w:hint="eastAsia" w:ascii="宋体" w:hAnsi="宋体" w:eastAsia="宋体" w:cs="宋体"/>
+          <w:sz w:val="18"/>
+          <w:szCs w:val="18"/>
+          <w:lang w:val="en-US" w:eastAsia="zh-CN"/>
+        </w:rPr>
+      </w:pPr>
+      <w:r>
+        <w:rPr>
+          <w:rFonts w:hint="eastAsia" w:ascii="宋体" w:hAnsi="宋体" w:eastAsia="宋体" w:cs="宋体"/>
+          <w:sz w:val="18"/>
+          <w:szCs w:val="18"/>
+          <w:lang w:val="en-US" w:eastAsia="zh-CN"/>
+        </w:rPr>
+        <w:t xml:space="preserve">               modx = Pre_MC, </w:t>
+      </w:r>
+    </w:p>
+    <w:p>
+      <w:pPr>
+        <w:keepNext w:val="0"/>
+        <w:keepLines w:val="0"/>
+        <w:pageBreakBefore w:val="0"/>
+        <w:widowControl w:val="0"/>
+        <w:kinsoku/>
+        <w:wordWrap/>
+        <w:overflowPunct/>
+        <w:topLinePunct w:val="0"/>
+        <w:autoSpaceDE/>
+        <w:autoSpaceDN/>
+        <w:bidi w:val="0"/>
+        <w:adjustRightInd/>
+        <w:snapToGrid/>
+        <w:spacing w:line="240" w:lineRule="auto"/>
+        <w:ind w:firstLine="360" w:firstLineChars="200"/>
+        <w:textAlignment w:val="auto"/>
+        <w:rPr>
+          <w:rFonts w:hint="eastAsia" w:ascii="宋体" w:hAnsi="宋体" w:eastAsia="宋体" w:cs="宋体"/>
+          <w:sz w:val="18"/>
+          <w:szCs w:val="18"/>
+          <w:lang w:val="en-US" w:eastAsia="zh-CN"/>
+        </w:rPr>
+      </w:pPr>
+      <w:r>
+        <w:rPr>
+          <w:rFonts w:hint="eastAsia" w:ascii="宋体" w:hAnsi="宋体" w:eastAsia="宋体" w:cs="宋体"/>
+          <w:sz w:val="18"/>
+          <w:szCs w:val="18"/>
+          <w:lang w:val="en-US" w:eastAsia="zh-CN"/>
+        </w:rPr>
+        <w:t xml:space="preserve">               digits = 4,</w:t>
+      </w:r>
+    </w:p>
+    <w:p>
+      <w:pPr>
+        <w:keepNext w:val="0"/>
+        <w:keepLines w:val="0"/>
+        <w:pageBreakBefore w:val="0"/>
+        <w:widowControl w:val="0"/>
+        <w:kinsoku/>
+        <w:wordWrap/>
+        <w:overflowPunct/>
+        <w:topLinePunct w:val="0"/>
+        <w:autoSpaceDE/>
+        <w:autoSpaceDN/>
+        <w:bidi w:val="0"/>
+        <w:adjustRightInd/>
+        <w:snapToGrid/>
+        <w:spacing w:line="240" w:lineRule="auto"/>
+        <w:ind w:firstLine="360" w:firstLineChars="200"/>
+        <w:textAlignment w:val="auto"/>
+        <w:rPr>
+          <w:rFonts w:hint="eastAsia" w:ascii="宋体" w:hAnsi="宋体" w:eastAsia="宋体" w:cs="宋体"/>
+          <w:sz w:val="18"/>
+          <w:szCs w:val="18"/>
+          <w:lang w:val="en-US" w:eastAsia="zh-CN"/>
+        </w:rPr>
+      </w:pPr>
+      <w:r>
+        <w:rPr>
+          <w:rFonts w:hint="eastAsia" w:ascii="宋体" w:hAnsi="宋体" w:eastAsia="宋体" w:cs="宋体"/>
+          <w:sz w:val="18"/>
+          <w:szCs w:val="18"/>
+          <w:lang w:val="en-US" w:eastAsia="zh-CN"/>
+        </w:rPr>
+        <w:t xml:space="preserve">               mod.range = c(-3.2,2.9))</w:t>
+      </w:r>
+    </w:p>
+    <w:p>
+      <w:pPr>
+        <w:keepNext w:val="0"/>
+        <w:keepLines w:val="0"/>
+        <w:pageBreakBefore w:val="0"/>
+        <w:widowControl w:val="0"/>
+        <w:kinsoku/>
+        <w:wordWrap/>
+        <w:overflowPunct/>
+        <w:topLinePunct w:val="0"/>
+        <w:autoSpaceDE/>
+        <w:autoSpaceDN/>
+        <w:bidi w:val="0"/>
+        <w:adjustRightInd/>
+        <w:snapToGrid/>
+        <w:spacing w:line="360" w:lineRule="auto"/>
+        <w:ind w:firstLine="420" w:firstLineChars="200"/>
+        <w:textAlignment w:val="auto"/>
+        <w:rPr>
+          <w:rFonts w:hint="default" w:ascii="方正仿宋_GB2312" w:hAnsi="方正仿宋_GB2312" w:eastAsia="方正仿宋_GB2312" w:cs="方正仿宋_GB2312"/>
+          <w:sz w:val="21"/>
+          <w:szCs w:val="21"/>
+          <w:lang w:val="en-US" w:eastAsia="zh-CN"/>
+        </w:rPr>
+      </w:pPr>
     </w:p>
     <w:p>
       <w:pPr>

</xml_diff>